<commit_message>
Use source lists for applicants, project types and support types
Co-Authored-By: Claude Opus 5.5 <noreply@anthropic.com>
Claude-Session: https://claude.ai/code/session_01VHwNN6RfVzTYVCS9bRLUAz
</commit_message>
<xml_diff>
--- a/entregables/Guia_seleccion_proyectos_FEAC_BCS.docx
+++ b/entregables/Guia_seleccion_proyectos_FEAC_BCS.docx
@@ -193,742 +193,123 @@
     </w:p>
     <w:p>
       <w:pPr>
+        <w:spacing w:after="120"/>
+      </w:pPr>
+      <w:r>
+        <w:rPr>
+          <w:rFonts w:ascii="Arial" w:cs="Arial" w:eastAsia="Arial" w:hAnsi="Arial"/>
+          <w:sz w:val="21"/>
+          <w:szCs w:val="21"/>
+        </w:rPr>
+        <w:t xml:space="preserve">Las tres listas siguientes vienen del documento «Criterios de elegibilidad de proyectos». Son independientes entre sí: cualquier solicitante puede presentar cualquier tipo de proyecto, siempre que el apoyo sea coherente con su objeto y sus facultades (por ejemplo, un préstamo no suele ser adecuado para una organización sin fines de lucro).</w:t>
+      </w:r>
+    </w:p>
+    <w:p>
+      <w:pPr>
         <w:pStyle w:val="Heading2"/>
       </w:pPr>
       <w:r>
         <w:rPr>
           <w:rFonts w:ascii="Arial" w:cs="Arial" w:eastAsia="Arial" w:hAnsi="Arial"/>
         </w:rPr>
-        <w:t xml:space="preserve">Quién puede solicitar y qué tipo de apoyo puede recibir</w:t>
+        <w:t xml:space="preserve">Quién puede solicitar</w:t>
       </w:r>
     </w:p>
-    <w:tbl>
-      <w:tblPr>
-        <w:tblW w:type="dxa" w:w="9360"/>
-        <w:tblBorders>
-          <w:top w:val="single" w:color="auto" w:sz="4"/>
-          <w:left w:val="single" w:color="auto" w:sz="4"/>
-          <w:bottom w:val="single" w:color="auto" w:sz="4"/>
-          <w:right w:val="single" w:color="auto" w:sz="4"/>
-          <w:insideH w:val="single" w:color="auto" w:sz="4"/>
-          <w:insideV w:val="single" w:color="auto" w:sz="4"/>
-        </w:tblBorders>
-      </w:tblPr>
-      <w:tblGrid>
-        <w:gridCol w:w="3120"/>
-        <w:gridCol w:w="3120"/>
-        <w:gridCol w:w="3120"/>
-      </w:tblGrid>
-      <w:tr>
-        <w:trPr>
-          <w:tblHeader/>
-        </w:trPr>
-        <w:tc>
-          <w:tcPr>
-            <w:tcW w:type="dxa" w:w="3120"/>
-            <w:tcBorders>
-              <w:top w:val="single" w:color="BFBFBF" w:sz="4"/>
-              <w:left w:val="single" w:color="BFBFBF" w:sz="4"/>
-              <w:bottom w:val="single" w:color="BFBFBF" w:sz="4"/>
-              <w:right w:val="single" w:color="BFBFBF" w:sz="4"/>
-            </w:tcBorders>
-            <w:shd w:fill="1F4E5A" w:color="auto" w:val="clear"/>
-            <w:tcMar>
-              <w:top w:type="dxa" w:w="60"/>
-              <w:left w:type="dxa" w:w="90"/>
-              <w:bottom w:type="dxa" w:w="60"/>
-              <w:right w:type="dxa" w:w="90"/>
-            </w:tcMar>
-          </w:tcPr>
-          <w:p>
-            <w:r>
-              <w:rPr>
-                <w:rFonts w:ascii="Arial" w:cs="Arial" w:eastAsia="Arial" w:hAnsi="Arial"/>
-                <w:b/>
-                <w:bCs/>
-                <w:color w:val="FFFFFF"/>
-                <w:sz w:val="17"/>
-                <w:szCs w:val="17"/>
-              </w:rPr>
-              <w:t xml:space="preserve">Quién puede solicitar</w:t>
-            </w:r>
-          </w:p>
-        </w:tc>
-        <w:tc>
-          <w:tcPr>
-            <w:tcW w:type="dxa" w:w="3120"/>
-            <w:tcBorders>
-              <w:top w:val="single" w:color="BFBFBF" w:sz="4"/>
-              <w:left w:val="single" w:color="BFBFBF" w:sz="4"/>
-              <w:bottom w:val="single" w:color="BFBFBF" w:sz="4"/>
-              <w:right w:val="single" w:color="BFBFBF" w:sz="4"/>
-            </w:tcBorders>
-            <w:shd w:fill="1F4E5A" w:color="auto" w:val="clear"/>
-            <w:tcMar>
-              <w:top w:type="dxa" w:w="60"/>
-              <w:left w:type="dxa" w:w="90"/>
-              <w:bottom w:type="dxa" w:w="60"/>
-              <w:right w:type="dxa" w:w="90"/>
-            </w:tcMar>
-          </w:tcPr>
-          <w:p>
-            <w:r>
-              <w:rPr>
-                <w:rFonts w:ascii="Arial" w:cs="Arial" w:eastAsia="Arial" w:hAnsi="Arial"/>
-                <w:b/>
-                <w:bCs/>
-                <w:color w:val="FFFFFF"/>
-                <w:sz w:val="17"/>
-                <w:szCs w:val="17"/>
-              </w:rPr>
-              <w:t xml:space="preserve">Tipo de proyecto</w:t>
-            </w:r>
-          </w:p>
-        </w:tc>
-        <w:tc>
-          <w:tcPr>
-            <w:tcW w:type="dxa" w:w="3120"/>
-            <w:tcBorders>
-              <w:top w:val="single" w:color="BFBFBF" w:sz="4"/>
-              <w:left w:val="single" w:color="BFBFBF" w:sz="4"/>
-              <w:bottom w:val="single" w:color="BFBFBF" w:sz="4"/>
-              <w:right w:val="single" w:color="BFBFBF" w:sz="4"/>
-            </w:tcBorders>
-            <w:shd w:fill="1F4E5A" w:color="auto" w:val="clear"/>
-            <w:tcMar>
-              <w:top w:type="dxa" w:w="60"/>
-              <w:left w:type="dxa" w:w="90"/>
-              <w:bottom w:type="dxa" w:w="60"/>
-              <w:right w:type="dxa" w:w="90"/>
-            </w:tcMar>
-          </w:tcPr>
-          <w:p>
-            <w:r>
-              <w:rPr>
-                <w:rFonts w:ascii="Arial" w:cs="Arial" w:eastAsia="Arial" w:hAnsi="Arial"/>
-                <w:b/>
-                <w:bCs/>
-                <w:color w:val="FFFFFF"/>
-                <w:sz w:val="17"/>
-                <w:szCs w:val="17"/>
-              </w:rPr>
-              <w:t xml:space="preserve">Tipo de apoyo</w:t>
-            </w:r>
-          </w:p>
-        </w:tc>
-      </w:tr>
-      <w:tr>
-        <w:trPr>
-          <w:cantSplit/>
-        </w:trPr>
-        <w:tc>
-          <w:tcPr>
-            <w:tcW w:type="dxa" w:w="3120"/>
-            <w:tcBorders>
-              <w:top w:val="single" w:color="BFBFBF" w:sz="4"/>
-              <w:left w:val="single" w:color="BFBFBF" w:sz="4"/>
-              <w:bottom w:val="single" w:color="BFBFBF" w:sz="4"/>
-              <w:right w:val="single" w:color="BFBFBF" w:sz="4"/>
-            </w:tcBorders>
-            <w:tcMar>
-              <w:top w:type="dxa" w:w="60"/>
-              <w:left w:type="dxa" w:w="90"/>
-              <w:bottom w:type="dxa" w:w="60"/>
-              <w:right w:type="dxa" w:w="90"/>
-            </w:tcMar>
-          </w:tcPr>
-          <w:p>
-            <w:r>
-              <w:rPr>
-                <w:rFonts w:ascii="Arial" w:cs="Arial" w:eastAsia="Arial" w:hAnsi="Arial"/>
-                <w:sz w:val="17"/>
-                <w:szCs w:val="17"/>
-              </w:rPr>
-              <w:t xml:space="preserve">Gobierno del Estado (dependencia u órgano desconcentrado)</w:t>
-            </w:r>
-          </w:p>
-        </w:tc>
-        <w:tc>
-          <w:tcPr>
-            <w:tcW w:type="dxa" w:w="3120"/>
-            <w:tcBorders>
-              <w:top w:val="single" w:color="BFBFBF" w:sz="4"/>
-              <w:left w:val="single" w:color="BFBFBF" w:sz="4"/>
-              <w:bottom w:val="single" w:color="BFBFBF" w:sz="4"/>
-              <w:right w:val="single" w:color="BFBFBF" w:sz="4"/>
-            </w:tcBorders>
-            <w:tcMar>
-              <w:top w:type="dxa" w:w="60"/>
-              <w:left w:type="dxa" w:w="90"/>
-              <w:bottom w:type="dxa" w:w="60"/>
-              <w:right w:type="dxa" w:w="90"/>
-            </w:tcMar>
-          </w:tcPr>
-          <w:p>
-            <w:r>
-              <w:rPr>
-                <w:rFonts w:ascii="Arial" w:cs="Arial" w:eastAsia="Arial" w:hAnsi="Arial"/>
-                <w:sz w:val="17"/>
-                <w:szCs w:val="17"/>
-              </w:rPr>
-              <w:t xml:space="preserve">Estudio, plan o evaluación</w:t>
-            </w:r>
-          </w:p>
-        </w:tc>
-        <w:tc>
-          <w:tcPr>
-            <w:tcW w:type="dxa" w:w="3120"/>
-            <w:tcBorders>
-              <w:top w:val="single" w:color="BFBFBF" w:sz="4"/>
-              <w:left w:val="single" w:color="BFBFBF" w:sz="4"/>
-              <w:bottom w:val="single" w:color="BFBFBF" w:sz="4"/>
-              <w:right w:val="single" w:color="BFBFBF" w:sz="4"/>
-            </w:tcBorders>
-            <w:tcMar>
-              <w:top w:type="dxa" w:w="60"/>
-              <w:left w:type="dxa" w:w="90"/>
-              <w:bottom w:type="dxa" w:w="60"/>
-              <w:right w:type="dxa" w:w="90"/>
-            </w:tcMar>
-          </w:tcPr>
-          <w:p>
-            <w:r>
-              <w:rPr>
-                <w:rFonts w:ascii="Arial" w:cs="Arial" w:eastAsia="Arial" w:hAnsi="Arial"/>
-                <w:sz w:val="17"/>
-                <w:szCs w:val="17"/>
-              </w:rPr>
-              <w:t xml:space="preserve">Financiero: aportación a fondo perdido</w:t>
-            </w:r>
-          </w:p>
-        </w:tc>
-      </w:tr>
-      <w:tr>
-        <w:trPr>
-          <w:cantSplit/>
-        </w:trPr>
-        <w:tc>
-          <w:tcPr>
-            <w:tcW w:type="dxa" w:w="3120"/>
-            <w:tcBorders>
-              <w:top w:val="single" w:color="BFBFBF" w:sz="4"/>
-              <w:left w:val="single" w:color="BFBFBF" w:sz="4"/>
-              <w:bottom w:val="single" w:color="BFBFBF" w:sz="4"/>
-              <w:right w:val="single" w:color="BFBFBF" w:sz="4"/>
-            </w:tcBorders>
-            <w:shd w:fill="F7F9FA" w:color="auto" w:val="clear"/>
-            <w:tcMar>
-              <w:top w:type="dxa" w:w="60"/>
-              <w:left w:type="dxa" w:w="90"/>
-              <w:bottom w:type="dxa" w:w="60"/>
-              <w:right w:type="dxa" w:w="90"/>
-            </w:tcMar>
-          </w:tcPr>
-          <w:p>
-            <w:r>
-              <w:rPr>
-                <w:rFonts w:ascii="Arial" w:cs="Arial" w:eastAsia="Arial" w:hAnsi="Arial"/>
-                <w:sz w:val="17"/>
-                <w:szCs w:val="17"/>
-              </w:rPr>
-              <w:t xml:space="preserve">Municipio</w:t>
-            </w:r>
-          </w:p>
-        </w:tc>
-        <w:tc>
-          <w:tcPr>
-            <w:tcW w:type="dxa" w:w="3120"/>
-            <w:tcBorders>
-              <w:top w:val="single" w:color="BFBFBF" w:sz="4"/>
-              <w:left w:val="single" w:color="BFBFBF" w:sz="4"/>
-              <w:bottom w:val="single" w:color="BFBFBF" w:sz="4"/>
-              <w:right w:val="single" w:color="BFBFBF" w:sz="4"/>
-            </w:tcBorders>
-            <w:shd w:fill="F7F9FA" w:color="auto" w:val="clear"/>
-            <w:tcMar>
-              <w:top w:type="dxa" w:w="60"/>
-              <w:left w:type="dxa" w:w="90"/>
-              <w:bottom w:type="dxa" w:w="60"/>
-              <w:right w:type="dxa" w:w="90"/>
-            </w:tcMar>
-          </w:tcPr>
-          <w:p>
-            <w:r>
-              <w:rPr>
-                <w:rFonts w:ascii="Arial" w:cs="Arial" w:eastAsia="Arial" w:hAnsi="Arial"/>
-                <w:sz w:val="17"/>
-                <w:szCs w:val="17"/>
-              </w:rPr>
-              <w:t xml:space="preserve">Programa, estrategia o acción</w:t>
-            </w:r>
-          </w:p>
-        </w:tc>
-        <w:tc>
-          <w:tcPr>
-            <w:tcW w:type="dxa" w:w="3120"/>
-            <w:tcBorders>
-              <w:top w:val="single" w:color="BFBFBF" w:sz="4"/>
-              <w:left w:val="single" w:color="BFBFBF" w:sz="4"/>
-              <w:bottom w:val="single" w:color="BFBFBF" w:sz="4"/>
-              <w:right w:val="single" w:color="BFBFBF" w:sz="4"/>
-            </w:tcBorders>
-            <w:shd w:fill="F7F9FA" w:color="auto" w:val="clear"/>
-            <w:tcMar>
-              <w:top w:type="dxa" w:w="60"/>
-              <w:left w:type="dxa" w:w="90"/>
-              <w:bottom w:type="dxa" w:w="60"/>
-              <w:right w:type="dxa" w:w="90"/>
-            </w:tcMar>
-          </w:tcPr>
-          <w:p>
-            <w:r>
-              <w:rPr>
-                <w:rFonts w:ascii="Arial" w:cs="Arial" w:eastAsia="Arial" w:hAnsi="Arial"/>
-                <w:sz w:val="17"/>
-                <w:szCs w:val="17"/>
-              </w:rPr>
-              <w:t xml:space="preserve">Financiero: cofinanciamiento</w:t>
-            </w:r>
-          </w:p>
-        </w:tc>
-      </w:tr>
-      <w:tr>
-        <w:trPr>
-          <w:cantSplit/>
-        </w:trPr>
-        <w:tc>
-          <w:tcPr>
-            <w:tcW w:type="dxa" w:w="3120"/>
-            <w:tcBorders>
-              <w:top w:val="single" w:color="BFBFBF" w:sz="4"/>
-              <w:left w:val="single" w:color="BFBFBF" w:sz="4"/>
-              <w:bottom w:val="single" w:color="BFBFBF" w:sz="4"/>
-              <w:right w:val="single" w:color="BFBFBF" w:sz="4"/>
-            </w:tcBorders>
-            <w:tcMar>
-              <w:top w:type="dxa" w:w="60"/>
-              <w:left w:type="dxa" w:w="90"/>
-              <w:bottom w:type="dxa" w:w="60"/>
-              <w:right w:type="dxa" w:w="90"/>
-            </w:tcMar>
-          </w:tcPr>
-          <w:p>
-            <w:r>
-              <w:rPr>
-                <w:rFonts w:ascii="Arial" w:cs="Arial" w:eastAsia="Arial" w:hAnsi="Arial"/>
-                <w:sz w:val="17"/>
-                <w:szCs w:val="17"/>
-              </w:rPr>
-              <w:t xml:space="preserve">Paraestatal o fideicomiso público</w:t>
-            </w:r>
-          </w:p>
-        </w:tc>
-        <w:tc>
-          <w:tcPr>
-            <w:tcW w:type="dxa" w:w="3120"/>
-            <w:tcBorders>
-              <w:top w:val="single" w:color="BFBFBF" w:sz="4"/>
-              <w:left w:val="single" w:color="BFBFBF" w:sz="4"/>
-              <w:bottom w:val="single" w:color="BFBFBF" w:sz="4"/>
-              <w:right w:val="single" w:color="BFBFBF" w:sz="4"/>
-            </w:tcBorders>
-            <w:tcMar>
-              <w:top w:type="dxa" w:w="60"/>
-              <w:left w:type="dxa" w:w="90"/>
-              <w:bottom w:type="dxa" w:w="60"/>
-              <w:right w:type="dxa" w:w="90"/>
-            </w:tcMar>
-          </w:tcPr>
-          <w:p>
-            <w:r>
-              <w:rPr>
-                <w:rFonts w:ascii="Arial" w:cs="Arial" w:eastAsia="Arial" w:hAnsi="Arial"/>
-                <w:sz w:val="17"/>
-                <w:szCs w:val="17"/>
-              </w:rPr>
-              <w:t xml:space="preserve">Obra o infraestructura</w:t>
-            </w:r>
-          </w:p>
-        </w:tc>
-        <w:tc>
-          <w:tcPr>
-            <w:tcW w:type="dxa" w:w="3120"/>
-            <w:tcBorders>
-              <w:top w:val="single" w:color="BFBFBF" w:sz="4"/>
-              <w:left w:val="single" w:color="BFBFBF" w:sz="4"/>
-              <w:bottom w:val="single" w:color="BFBFBF" w:sz="4"/>
-              <w:right w:val="single" w:color="BFBFBF" w:sz="4"/>
-            </w:tcBorders>
-            <w:tcMar>
-              <w:top w:type="dxa" w:w="60"/>
-              <w:left w:type="dxa" w:w="90"/>
-              <w:bottom w:type="dxa" w:w="60"/>
-              <w:right w:type="dxa" w:w="90"/>
-            </w:tcMar>
-          </w:tcPr>
-          <w:p>
-            <w:r>
-              <w:rPr>
-                <w:rFonts w:ascii="Arial" w:cs="Arial" w:eastAsia="Arial" w:hAnsi="Arial"/>
-                <w:sz w:val="17"/>
-                <w:szCs w:val="17"/>
-              </w:rPr>
-              <w:t xml:space="preserve">Financiero: préstamo</w:t>
-            </w:r>
-          </w:p>
-        </w:tc>
-      </w:tr>
-      <w:tr>
-        <w:trPr>
-          <w:cantSplit/>
-        </w:trPr>
-        <w:tc>
-          <w:tcPr>
-            <w:tcW w:type="dxa" w:w="3120"/>
-            <w:tcBorders>
-              <w:top w:val="single" w:color="BFBFBF" w:sz="4"/>
-              <w:left w:val="single" w:color="BFBFBF" w:sz="4"/>
-              <w:bottom w:val="single" w:color="BFBFBF" w:sz="4"/>
-              <w:right w:val="single" w:color="BFBFBF" w:sz="4"/>
-            </w:tcBorders>
-            <w:shd w:fill="F7F9FA" w:color="auto" w:val="clear"/>
-            <w:tcMar>
-              <w:top w:type="dxa" w:w="60"/>
-              <w:left w:type="dxa" w:w="90"/>
-              <w:bottom w:type="dxa" w:w="60"/>
-              <w:right w:type="dxa" w:w="90"/>
-            </w:tcMar>
-          </w:tcPr>
-          <w:p>
-            <w:r>
-              <w:rPr>
-                <w:rFonts w:ascii="Arial" w:cs="Arial" w:eastAsia="Arial" w:hAnsi="Arial"/>
-                <w:sz w:val="17"/>
-                <w:szCs w:val="17"/>
-              </w:rPr>
-              <w:t xml:space="preserve">Sociedad civil (OSC)</w:t>
-            </w:r>
-          </w:p>
-        </w:tc>
-        <w:tc>
-          <w:tcPr>
-            <w:tcW w:type="dxa" w:w="3120"/>
-            <w:tcBorders>
-              <w:top w:val="single" w:color="BFBFBF" w:sz="4"/>
-              <w:left w:val="single" w:color="BFBFBF" w:sz="4"/>
-              <w:bottom w:val="single" w:color="BFBFBF" w:sz="4"/>
-              <w:right w:val="single" w:color="BFBFBF" w:sz="4"/>
-            </w:tcBorders>
-            <w:shd w:fill="F7F9FA" w:color="auto" w:val="clear"/>
-            <w:tcMar>
-              <w:top w:type="dxa" w:w="60"/>
-              <w:left w:type="dxa" w:w="90"/>
-              <w:bottom w:type="dxa" w:w="60"/>
-              <w:right w:type="dxa" w:w="90"/>
-            </w:tcMar>
-          </w:tcPr>
-          <w:p>
-            <w:r>
-              <w:rPr>
-                <w:rFonts w:ascii="Arial" w:cs="Arial" w:eastAsia="Arial" w:hAnsi="Arial"/>
-                <w:sz w:val="17"/>
-                <w:szCs w:val="17"/>
-              </w:rPr>
-              <w:t xml:space="preserve">Diseño o proyecto ejecutivo</w:t>
-            </w:r>
-          </w:p>
-        </w:tc>
-        <w:tc>
-          <w:tcPr>
-            <w:tcW w:type="dxa" w:w="3120"/>
-            <w:tcBorders>
-              <w:top w:val="single" w:color="BFBFBF" w:sz="4"/>
-              <w:left w:val="single" w:color="BFBFBF" w:sz="4"/>
-              <w:bottom w:val="single" w:color="BFBFBF" w:sz="4"/>
-              <w:right w:val="single" w:color="BFBFBF" w:sz="4"/>
-            </w:tcBorders>
-            <w:shd w:fill="F7F9FA" w:color="auto" w:val="clear"/>
-            <w:tcMar>
-              <w:top w:type="dxa" w:w="60"/>
-              <w:left w:type="dxa" w:w="90"/>
-              <w:bottom w:type="dxa" w:w="60"/>
-              <w:right w:type="dxa" w:w="90"/>
-            </w:tcMar>
-          </w:tcPr>
-          <w:p>
-            <w:r>
-              <w:rPr>
-                <w:rFonts w:ascii="Arial" w:cs="Arial" w:eastAsia="Arial" w:hAnsi="Arial"/>
-                <w:sz w:val="17"/>
-                <w:szCs w:val="17"/>
-              </w:rPr>
-              <w:t xml:space="preserve">Financiero: garantía</w:t>
-            </w:r>
-          </w:p>
-        </w:tc>
-      </w:tr>
-      <w:tr>
-        <w:trPr>
-          <w:cantSplit/>
-        </w:trPr>
-        <w:tc>
-          <w:tcPr>
-            <w:tcW w:type="dxa" w:w="3120"/>
-            <w:tcBorders>
-              <w:top w:val="single" w:color="BFBFBF" w:sz="4"/>
-              <w:left w:val="single" w:color="BFBFBF" w:sz="4"/>
-              <w:bottom w:val="single" w:color="BFBFBF" w:sz="4"/>
-              <w:right w:val="single" w:color="BFBFBF" w:sz="4"/>
-            </w:tcBorders>
-            <w:tcMar>
-              <w:top w:type="dxa" w:w="60"/>
-              <w:left w:type="dxa" w:w="90"/>
-              <w:bottom w:type="dxa" w:w="60"/>
-              <w:right w:type="dxa" w:w="90"/>
-            </w:tcMar>
-          </w:tcPr>
-          <w:p>
-            <w:r>
-              <w:rPr>
-                <w:rFonts w:ascii="Arial" w:cs="Arial" w:eastAsia="Arial" w:hAnsi="Arial"/>
-                <w:sz w:val="17"/>
-                <w:szCs w:val="17"/>
-              </w:rPr>
-              <w:t xml:space="preserve">Comunitaria o ejidal</w:t>
-            </w:r>
-          </w:p>
-        </w:tc>
-        <w:tc>
-          <w:tcPr>
-            <w:tcW w:type="dxa" w:w="3120"/>
-            <w:tcBorders>
-              <w:top w:val="single" w:color="BFBFBF" w:sz="4"/>
-              <w:left w:val="single" w:color="BFBFBF" w:sz="4"/>
-              <w:bottom w:val="single" w:color="BFBFBF" w:sz="4"/>
-              <w:right w:val="single" w:color="BFBFBF" w:sz="4"/>
-            </w:tcBorders>
-            <w:tcMar>
-              <w:top w:type="dxa" w:w="60"/>
-              <w:left w:type="dxa" w:w="90"/>
-              <w:bottom w:type="dxa" w:w="60"/>
-              <w:right w:type="dxa" w:w="90"/>
-            </w:tcMar>
-          </w:tcPr>
-          <w:p>
-            <w:r>
-              <w:rPr>
-                <w:rFonts w:ascii="Arial" w:cs="Arial" w:eastAsia="Arial" w:hAnsi="Arial"/>
-                <w:sz w:val="17"/>
-                <w:szCs w:val="17"/>
-              </w:rPr>
-              <w:t xml:space="preserve">Capacitación o educación</w:t>
-            </w:r>
-          </w:p>
-        </w:tc>
-        <w:tc>
-          <w:tcPr>
-            <w:tcW w:type="dxa" w:w="3120"/>
-            <w:tcBorders>
-              <w:top w:val="single" w:color="BFBFBF" w:sz="4"/>
-              <w:left w:val="single" w:color="BFBFBF" w:sz="4"/>
-              <w:bottom w:val="single" w:color="BFBFBF" w:sz="4"/>
-              <w:right w:val="single" w:color="BFBFBF" w:sz="4"/>
-            </w:tcBorders>
-            <w:tcMar>
-              <w:top w:type="dxa" w:w="60"/>
-              <w:left w:type="dxa" w:w="90"/>
-              <w:bottom w:type="dxa" w:w="60"/>
-              <w:right w:type="dxa" w:w="90"/>
-            </w:tcMar>
-          </w:tcPr>
-          <w:p>
-            <w:r>
-              <w:rPr>
-                <w:rFonts w:ascii="Arial" w:cs="Arial" w:eastAsia="Arial" w:hAnsi="Arial"/>
-                <w:sz w:val="17"/>
-                <w:szCs w:val="17"/>
-              </w:rPr>
-              <w:t xml:space="preserve">No financiero: asesoría y capacitación</w:t>
-            </w:r>
-          </w:p>
-        </w:tc>
-      </w:tr>
-      <w:tr>
-        <w:trPr>
-          <w:cantSplit/>
-        </w:trPr>
-        <w:tc>
-          <w:tcPr>
-            <w:tcW w:type="dxa" w:w="3120"/>
-            <w:tcBorders>
-              <w:top w:val="single" w:color="BFBFBF" w:sz="4"/>
-              <w:left w:val="single" w:color="BFBFBF" w:sz="4"/>
-              <w:bottom w:val="single" w:color="BFBFBF" w:sz="4"/>
-              <w:right w:val="single" w:color="BFBFBF" w:sz="4"/>
-            </w:tcBorders>
-            <w:shd w:fill="F7F9FA" w:color="auto" w:val="clear"/>
-            <w:tcMar>
-              <w:top w:type="dxa" w:w="60"/>
-              <w:left w:type="dxa" w:w="90"/>
-              <w:bottom w:type="dxa" w:w="60"/>
-              <w:right w:type="dxa" w:w="90"/>
-            </w:tcMar>
-          </w:tcPr>
-          <w:p>
-            <w:r>
-              <w:rPr>
-                <w:rFonts w:ascii="Arial" w:cs="Arial" w:eastAsia="Arial" w:hAnsi="Arial"/>
-                <w:sz w:val="17"/>
-                <w:szCs w:val="17"/>
-              </w:rPr>
-              <w:t xml:space="preserve">Academia o institución técnica</w:t>
-            </w:r>
-          </w:p>
-        </w:tc>
-        <w:tc>
-          <w:tcPr>
-            <w:tcW w:type="dxa" w:w="3120"/>
-            <w:tcBorders>
-              <w:top w:val="single" w:color="BFBFBF" w:sz="4"/>
-              <w:left w:val="single" w:color="BFBFBF" w:sz="4"/>
-              <w:bottom w:val="single" w:color="BFBFBF" w:sz="4"/>
-              <w:right w:val="single" w:color="BFBFBF" w:sz="4"/>
-            </w:tcBorders>
-            <w:shd w:fill="F7F9FA" w:color="auto" w:val="clear"/>
-            <w:tcMar>
-              <w:top w:type="dxa" w:w="60"/>
-              <w:left w:type="dxa" w:w="90"/>
-              <w:bottom w:type="dxa" w:w="60"/>
-              <w:right w:type="dxa" w:w="90"/>
-            </w:tcMar>
-          </w:tcPr>
-          <w:p>
-            <w:r>
-              <w:rPr>
-                <w:rFonts w:ascii="Arial" w:cs="Arial" w:eastAsia="Arial" w:hAnsi="Arial"/>
-                <w:sz w:val="17"/>
-                <w:szCs w:val="17"/>
-              </w:rPr>
-              <w:t xml:space="preserve">Investigación o innovación</w:t>
-            </w:r>
-          </w:p>
-        </w:tc>
-        <w:tc>
-          <w:tcPr>
-            <w:tcW w:type="dxa" w:w="3120"/>
-            <w:tcBorders>
-              <w:top w:val="single" w:color="BFBFBF" w:sz="4"/>
-              <w:left w:val="single" w:color="BFBFBF" w:sz="4"/>
-              <w:bottom w:val="single" w:color="BFBFBF" w:sz="4"/>
-              <w:right w:val="single" w:color="BFBFBF" w:sz="4"/>
-            </w:tcBorders>
-            <w:shd w:fill="F7F9FA" w:color="auto" w:val="clear"/>
-            <w:tcMar>
-              <w:top w:type="dxa" w:w="60"/>
-              <w:left w:type="dxa" w:w="90"/>
-              <w:bottom w:type="dxa" w:w="60"/>
-              <w:right w:type="dxa" w:w="90"/>
-            </w:tcMar>
-          </w:tcPr>
-          <w:p>
-            <w:r>
-              <w:rPr>
-                <w:rFonts w:ascii="Arial" w:cs="Arial" w:eastAsia="Arial" w:hAnsi="Arial"/>
-                <w:sz w:val="17"/>
-                <w:szCs w:val="17"/>
-              </w:rPr>
-              <w:t xml:space="preserve">No financiero: realización de estudios</w:t>
-            </w:r>
-          </w:p>
-        </w:tc>
-      </w:tr>
-      <w:tr>
-        <w:trPr>
-          <w:cantSplit/>
-        </w:trPr>
-        <w:tc>
-          <w:tcPr>
-            <w:tcW w:type="dxa" w:w="3120"/>
-            <w:tcBorders>
-              <w:top w:val="single" w:color="BFBFBF" w:sz="4"/>
-              <w:left w:val="single" w:color="BFBFBF" w:sz="4"/>
-              <w:bottom w:val="single" w:color="BFBFBF" w:sz="4"/>
-              <w:right w:val="single" w:color="BFBFBF" w:sz="4"/>
-            </w:tcBorders>
-            <w:tcMar>
-              <w:top w:type="dxa" w:w="60"/>
-              <w:left w:type="dxa" w:w="90"/>
-              <w:bottom w:type="dxa" w:w="60"/>
-              <w:right w:type="dxa" w:w="90"/>
-            </w:tcMar>
-          </w:tcPr>
-          <w:p>
-            <w:r>
-              <w:rPr>
-                <w:rFonts w:ascii="Arial" w:cs="Arial" w:eastAsia="Arial" w:hAnsi="Arial"/>
-                <w:sz w:val="17"/>
-                <w:szCs w:val="17"/>
-              </w:rPr>
-              <w:t xml:space="preserve">Empresa o desarrollador</w:t>
-            </w:r>
-          </w:p>
-        </w:tc>
-        <w:tc>
-          <w:tcPr>
-            <w:tcW w:type="dxa" w:w="3120"/>
-            <w:tcBorders>
-              <w:top w:val="single" w:color="BFBFBF" w:sz="4"/>
-              <w:left w:val="single" w:color="BFBFBF" w:sz="4"/>
-              <w:bottom w:val="single" w:color="BFBFBF" w:sz="4"/>
-              <w:right w:val="single" w:color="BFBFBF" w:sz="4"/>
-            </w:tcBorders>
-            <w:tcMar>
-              <w:top w:type="dxa" w:w="60"/>
-              <w:left w:type="dxa" w:w="90"/>
-              <w:bottom w:type="dxa" w:w="60"/>
-              <w:right w:type="dxa" w:w="90"/>
-            </w:tcMar>
-          </w:tcPr>
-          <w:p>
-            <w:r>
-              <w:rPr>
-                <w:rFonts w:ascii="Arial" w:cs="Arial" w:eastAsia="Arial" w:hAnsi="Arial"/>
-                <w:sz w:val="17"/>
-                <w:szCs w:val="17"/>
-              </w:rPr>
-              <w:t xml:space="preserve">Otro</w:t>
-            </w:r>
-          </w:p>
-        </w:tc>
-        <w:tc>
-          <w:tcPr>
-            <w:tcW w:type="dxa" w:w="3120"/>
-            <w:tcBorders>
-              <w:top w:val="single" w:color="BFBFBF" w:sz="4"/>
-              <w:left w:val="single" w:color="BFBFBF" w:sz="4"/>
-              <w:bottom w:val="single" w:color="BFBFBF" w:sz="4"/>
-              <w:right w:val="single" w:color="BFBFBF" w:sz="4"/>
-            </w:tcBorders>
-            <w:tcMar>
-              <w:top w:type="dxa" w:w="60"/>
-              <w:left w:type="dxa" w:w="90"/>
-              <w:bottom w:type="dxa" w:w="60"/>
-              <w:right w:type="dxa" w:w="90"/>
-            </w:tcMar>
-          </w:tcPr>
-          <w:p>
-            <w:r>
-              <w:rPr>
-                <w:rFonts w:ascii="Arial" w:cs="Arial" w:eastAsia="Arial" w:hAnsi="Arial"/>
-                <w:sz w:val="17"/>
-                <w:szCs w:val="17"/>
-              </w:rPr>
-              <w:t xml:space="preserve">No financiero: vinculación con fondeadores o especialistas</w:t>
-            </w:r>
-          </w:p>
-        </w:tc>
-      </w:tr>
-    </w:tbl>
+    <w:p>
+      <w:pPr>
+        <w:pStyle w:val="ListParagraph"/>
+        <w:numPr>
+          <w:ilvl w:val="0"/>
+          <w:numId w:val="3"/>
+        </w:numPr>
+        <w:spacing w:after="80"/>
+      </w:pPr>
+      <w:r>
+        <w:rPr>
+          <w:rFonts w:ascii="Arial" w:cs="Arial" w:eastAsia="Arial" w:hAnsi="Arial"/>
+          <w:b/>
+          <w:bCs/>
+          <w:sz w:val="21"/>
+          <w:szCs w:val="21"/>
+        </w:rPr>
+        <w:t xml:space="preserve">Públicos (federal, estatal y municipal): </w:t>
+      </w:r>
+      <w:r>
+        <w:rPr>
+          <w:rFonts w:ascii="Arial" w:cs="Arial" w:eastAsia="Arial" w:hAnsi="Arial"/>
+          <w:sz w:val="21"/>
+          <w:szCs w:val="21"/>
+        </w:rPr>
+        <w:t xml:space="preserve">Dependencias y órganos desconcentrados; municipios; paraestatales, empresas de participación estatal y fideicomisos públicos.</w:t>
+      </w:r>
+    </w:p>
+    <w:p>
+      <w:pPr>
+        <w:pStyle w:val="ListParagraph"/>
+        <w:numPr>
+          <w:ilvl w:val="0"/>
+          <w:numId w:val="3"/>
+        </w:numPr>
+        <w:spacing w:after="80"/>
+      </w:pPr>
+      <w:r>
+        <w:rPr>
+          <w:rFonts w:ascii="Arial" w:cs="Arial" w:eastAsia="Arial" w:hAnsi="Arial"/>
+          <w:b/>
+          <w:bCs/>
+          <w:sz w:val="21"/>
+          <w:szCs w:val="21"/>
+        </w:rPr>
+        <w:t xml:space="preserve">Privados comerciales: </w:t>
+      </w:r>
+      <w:r>
+        <w:rPr>
+          <w:rFonts w:ascii="Arial" w:cs="Arial" w:eastAsia="Arial" w:hAnsi="Arial"/>
+          <w:sz w:val="21"/>
+          <w:szCs w:val="21"/>
+        </w:rPr>
+        <w:t xml:space="preserve">Empresas, desarrolladores inmobiliarios, proveedores gubernamentales, constructores, inversionistas.</w:t>
+      </w:r>
+    </w:p>
+    <w:p>
+      <w:pPr>
+        <w:pStyle w:val="ListParagraph"/>
+        <w:numPr>
+          <w:ilvl w:val="0"/>
+          <w:numId w:val="3"/>
+        </w:numPr>
+        <w:spacing w:after="80"/>
+      </w:pPr>
+      <w:r>
+        <w:rPr>
+          <w:rFonts w:ascii="Arial" w:cs="Arial" w:eastAsia="Arial" w:hAnsi="Arial"/>
+          <w:b/>
+          <w:bCs/>
+          <w:sz w:val="21"/>
+          <w:szCs w:val="21"/>
+        </w:rPr>
+        <w:t xml:space="preserve">Privados no comerciales: </w:t>
+      </w:r>
+      <w:r>
+        <w:rPr>
+          <w:rFonts w:ascii="Arial" w:cs="Arial" w:eastAsia="Arial" w:hAnsi="Arial"/>
+          <w:sz w:val="21"/>
+          <w:szCs w:val="21"/>
+        </w:rPr>
+        <w:t xml:space="preserve">Sociedad civil, ONG, academia, instituciones técnicas especializadas.</w:t>
+      </w:r>
+    </w:p>
+    <w:p>
+      <w:pPr>
+        <w:pStyle w:val="Heading2"/>
+      </w:pPr>
+      <w:r>
+        <w:rPr>
+          <w:rFonts w:ascii="Arial" w:cs="Arial" w:eastAsia="Arial" w:hAnsi="Arial"/>
+        </w:rPr>
+        <w:t xml:space="preserve">Tipo de proyecto</w:t>
+      </w:r>
+    </w:p>
     <w:p>
       <w:pPr>
         <w:spacing w:after="120"/>
@@ -936,13 +317,77 @@
       <w:r>
         <w:rPr>
           <w:rFonts w:ascii="Arial" w:cs="Arial" w:eastAsia="Arial" w:hAnsi="Arial"/>
-          <w:i/>
-          <w:iCs/>
-          <w:color w:val="404040"/>
-          <w:sz w:val="19"/>
-          <w:szCs w:val="19"/>
+          <w:sz w:val="21"/>
+          <w:szCs w:val="21"/>
         </w:rPr>
-        <w:t xml:space="preserve">Los solicitantes pueden ser públicos (de los tres órdenes de gobierno) o privados (comerciales y no comerciales). El tipo de apoyo y la forma de entregarlo deben ser coherentes con el objeto y las facultades de cada uno: por ejemplo, un préstamo no suele ser adecuado para una organización sin fines de lucro.</w:t>
+        <w:t xml:space="preserve">Estudios, planes, evaluaciones, programas, estrategias, acciones, obras, diseño, inversión, procesos, financiamiento, administración, intervención, recomendaciones y otros.</w:t>
+      </w:r>
+    </w:p>
+    <w:p>
+      <w:pPr>
+        <w:pStyle w:val="Heading2"/>
+      </w:pPr>
+      <w:r>
+        <w:rPr>
+          <w:rFonts w:ascii="Arial" w:cs="Arial" w:eastAsia="Arial" w:hAnsi="Arial"/>
+        </w:rPr>
+        <w:t xml:space="preserve">Tipo de apoyo</w:t>
+      </w:r>
+    </w:p>
+    <w:p>
+      <w:pPr>
+        <w:pStyle w:val="ListParagraph"/>
+        <w:numPr>
+          <w:ilvl w:val="0"/>
+          <w:numId w:val="3"/>
+        </w:numPr>
+        <w:spacing w:after="80"/>
+      </w:pPr>
+      <w:r>
+        <w:rPr>
+          <w:rFonts w:ascii="Arial" w:cs="Arial" w:eastAsia="Arial" w:hAnsi="Arial"/>
+          <w:b/>
+          <w:bCs/>
+          <w:sz w:val="21"/>
+          <w:szCs w:val="21"/>
+        </w:rPr>
+        <w:t xml:space="preserve">Financieros: </w:t>
+      </w:r>
+      <w:r>
+        <w:rPr>
+          <w:rFonts w:ascii="Arial" w:cs="Arial" w:eastAsia="Arial" w:hAnsi="Arial"/>
+          <w:sz w:val="21"/>
+          <w:szCs w:val="21"/>
+        </w:rPr>
+        <w:t xml:space="preserve">Préstamo o cofinanciamiento; aportación a fondo perdido; inversión de capital; garantía; subvención o subsidio.</w:t>
+      </w:r>
+    </w:p>
+    <w:p>
+      <w:pPr>
+        <w:pStyle w:val="ListParagraph"/>
+        <w:numPr>
+          <w:ilvl w:val="0"/>
+          <w:numId w:val="3"/>
+        </w:numPr>
+        <w:spacing w:after="80"/>
+      </w:pPr>
+      <w:r>
+        <w:rPr>
+          <w:rFonts w:ascii="Arial" w:cs="Arial" w:eastAsia="Arial" w:hAnsi="Arial"/>
+          <w:b/>
+          <w:bCs/>
+          <w:sz w:val="21"/>
+          <w:szCs w:val="21"/>
+        </w:rPr>
+        <w:t xml:space="preserve">No financieros: </w:t>
+      </w:r>
+      <w:r>
+        <w:rPr>
+          <w:rFonts w:ascii="Arial" w:cs="Arial" w:eastAsia="Arial" w:hAnsi="Arial"/>
+          <w:sz w:val="21"/>
+          <w:szCs w:val="21"/>
+        </w:rPr>
+        <w:t xml:space="preserve">Asesoría y capacitación; realización de estudios; vinculación con otras instituciones, fondeadores o especialistas.</w:t>
       </w:r>
     </w:p>
     <w:p>

</xml_diff>

<commit_message>
Add proposal strengthening route to selection guide and tool
Requirement 4 (complete proposal) becomes correctable, and projects with
high impact and vulnerability scores but correctable gaps are flagged as
candidates for strengthening via non-financial support, staged funding or
conditional approval.

Co-Authored-By: Claude Opus 5.5 <noreply@anthropic.com>
Claude-Session: https://claude.ai/code/session_01VHwNN6RfVzTYVCS9bRLUAz
</commit_message>
<xml_diff>
--- a/entregables/Guia_seleccion_proyectos_FEAC_BCS.docx
+++ b/entregables/Guia_seleccion_proyectos_FEAC_BCS.docx
@@ -97,7 +97,7 @@
           <w:sz w:val="21"/>
           <w:szCs w:val="21"/>
         </w:rPr>
-        <w:t xml:space="preserve">¿El proyecto puede participar? Se revisan 6 requisitos de Sí o No. Si falla uno, queda fuera.</w:t>
+        <w:t xml:space="preserve">¿El proyecto puede participar? Se revisan 6 requisitos de Sí o No. Si falla uno indispensable, queda fuera; si solo le falta completar la propuesta, participa con fortalecimiento.</w:t>
       </w:r>
     </w:p>
     <w:p>
@@ -153,7 +153,7 @@
           <w:sz w:val="21"/>
           <w:szCs w:val="21"/>
         </w:rPr>
-        <w:t xml:space="preserve">Se ordenan los proyectos por puntos y el Comité Técnico decide según el presupuesto.</w:t>
+        <w:t xml:space="preserve">Se ordenan los proyectos por puntos y el Comité Técnico decide según el presupuesto. A los proyectos con potencial que necesitan mejorar, el Fondo puede ayudar a fortalecerlos.</w:t>
       </w:r>
     </w:p>
     <w:p>
@@ -411,7 +411,76 @@
           <w:sz w:val="21"/>
           <w:szCs w:val="21"/>
         </w:rPr>
-        <w:t xml:space="preserve">Cada requisito se marca Sí o No. El proyecto puede participar solo si cumple los seis. Si falta información, se pide una sola vez al proponente (5 días hábiles) antes de descartarlo.</w:t>
+        <w:t xml:space="preserve">Cada requisito se marca Sí o No. Hay dos tipos:</w:t>
+      </w:r>
+    </w:p>
+    <w:p>
+      <w:pPr>
+        <w:pStyle w:val="ListParagraph"/>
+        <w:numPr>
+          <w:ilvl w:val="0"/>
+          <w:numId w:val="3"/>
+        </w:numPr>
+        <w:spacing w:after="80"/>
+      </w:pPr>
+      <w:r>
+        <w:rPr>
+          <w:rFonts w:ascii="Arial" w:cs="Arial" w:eastAsia="Arial" w:hAnsi="Arial"/>
+          <w:b/>
+          <w:bCs/>
+          <w:sz w:val="21"/>
+          <w:szCs w:val="21"/>
+        </w:rPr>
+        <w:t xml:space="preserve">Indispensables (1, 2, 3, 5 y 6): </w:t>
+      </w:r>
+      <w:r>
+        <w:rPr>
+          <w:rFonts w:ascii="Arial" w:cs="Arial" w:eastAsia="Arial" w:hAnsi="Arial"/>
+          <w:sz w:val="21"/>
+          <w:szCs w:val="21"/>
+        </w:rPr>
+        <w:t xml:space="preserve">si falla uno, el proyecto no puede participar. Son condiciones que el Fondo no puede suplir: que atienda un tema del Fondo, que tenga beneficio ambiental y social, que sea legal y que no cause daño.</w:t>
+      </w:r>
+    </w:p>
+    <w:p>
+      <w:pPr>
+        <w:pStyle w:val="ListParagraph"/>
+        <w:numPr>
+          <w:ilvl w:val="0"/>
+          <w:numId w:val="3"/>
+        </w:numPr>
+        <w:spacing w:after="80"/>
+      </w:pPr>
+      <w:r>
+        <w:rPr>
+          <w:rFonts w:ascii="Arial" w:cs="Arial" w:eastAsia="Arial" w:hAnsi="Arial"/>
+          <w:b/>
+          <w:bCs/>
+          <w:sz w:val="21"/>
+          <w:szCs w:val="21"/>
+        </w:rPr>
+        <w:t xml:space="preserve">Corregible (4, propuesta completa): </w:t>
+      </w:r>
+      <w:r>
+        <w:rPr>
+          <w:rFonts w:ascii="Arial" w:cs="Arial" w:eastAsia="Arial" w:hAnsi="Arial"/>
+          <w:sz w:val="21"/>
+          <w:szCs w:val="21"/>
+        </w:rPr>
+        <w:t xml:space="preserve">si le falta parte técnica o financiera, el proyecto no se descarta: participa «con fortalecimiento» y el Fondo puede ayudar a completarla.</w:t>
+      </w:r>
+    </w:p>
+    <w:p>
+      <w:pPr>
+        <w:spacing w:after="120"/>
+      </w:pPr>
+      <w:r>
+        <w:rPr>
+          <w:rFonts w:ascii="Arial" w:cs="Arial" w:eastAsia="Arial" w:hAnsi="Arial"/>
+          <w:sz w:val="21"/>
+          <w:szCs w:val="21"/>
+        </w:rPr>
+        <w:t xml:space="preserve">Si falta información, se pide una sola vez al proponente (5 días hábiles) antes de decidir.</w:t>
       </w:r>
     </w:p>
     <w:tbl>
@@ -427,10 +496,11 @@
         </w:tblBorders>
       </w:tblPr>
       <w:tblGrid>
-        <w:gridCol w:w="500"/>
-        <w:gridCol w:w="1900"/>
-        <w:gridCol w:w="4160"/>
-        <w:gridCol w:w="2800"/>
+        <w:gridCol w:w="450"/>
+        <w:gridCol w:w="1650"/>
+        <w:gridCol w:w="1400"/>
+        <w:gridCol w:w="3360"/>
+        <w:gridCol w:w="2500"/>
       </w:tblGrid>
       <w:tr>
         <w:trPr>
@@ -438,7 +508,7 @@
         </w:trPr>
         <w:tc>
           <w:tcPr>
-            <w:tcW w:type="dxa" w:w="500"/>
+            <w:tcW w:type="dxa" w:w="450"/>
             <w:tcBorders>
               <w:top w:val="single" w:color="BFBFBF" w:sz="4"/>
               <w:left w:val="single" w:color="BFBFBF" w:sz="4"/>
@@ -469,7 +539,7 @@
         </w:tc>
         <w:tc>
           <w:tcPr>
-            <w:tcW w:type="dxa" w:w="1900"/>
+            <w:tcW w:type="dxa" w:w="1650"/>
             <w:tcBorders>
               <w:top w:val="single" w:color="BFBFBF" w:sz="4"/>
               <w:left w:val="single" w:color="BFBFBF" w:sz="4"/>
@@ -500,7 +570,7 @@
         </w:tc>
         <w:tc>
           <w:tcPr>
-            <w:tcW w:type="dxa" w:w="4160"/>
+            <w:tcW w:type="dxa" w:w="1400"/>
             <w:tcBorders>
               <w:top w:val="single" w:color="BFBFBF" w:sz="4"/>
               <w:left w:val="single" w:color="BFBFBF" w:sz="4"/>
@@ -525,13 +595,44 @@
                 <w:sz w:val="17"/>
                 <w:szCs w:val="17"/>
               </w:rPr>
+              <w:t xml:space="preserve">Tipo</w:t>
+            </w:r>
+          </w:p>
+        </w:tc>
+        <w:tc>
+          <w:tcPr>
+            <w:tcW w:type="dxa" w:w="3360"/>
+            <w:tcBorders>
+              <w:top w:val="single" w:color="BFBFBF" w:sz="4"/>
+              <w:left w:val="single" w:color="BFBFBF" w:sz="4"/>
+              <w:bottom w:val="single" w:color="BFBFBF" w:sz="4"/>
+              <w:right w:val="single" w:color="BFBFBF" w:sz="4"/>
+            </w:tcBorders>
+            <w:shd w:fill="1F4E5A" w:color="auto" w:val="clear"/>
+            <w:tcMar>
+              <w:top w:type="dxa" w:w="60"/>
+              <w:left w:type="dxa" w:w="90"/>
+              <w:bottom w:type="dxa" w:w="60"/>
+              <w:right w:type="dxa" w:w="90"/>
+            </w:tcMar>
+          </w:tcPr>
+          <w:p>
+            <w:r>
+              <w:rPr>
+                <w:rFonts w:ascii="Arial" w:cs="Arial" w:eastAsia="Arial" w:hAnsi="Arial"/>
+                <w:b/>
+                <w:bCs/>
+                <w:color w:val="FFFFFF"/>
+                <w:sz w:val="17"/>
+                <w:szCs w:val="17"/>
+              </w:rPr>
               <w:t xml:space="preserve">Se cumple cuando…</w:t>
             </w:r>
           </w:p>
         </w:tc>
         <w:tc>
           <w:tcPr>
-            <w:tcW w:type="dxa" w:w="2800"/>
+            <w:tcW w:type="dxa" w:w="2500"/>
             <w:tcBorders>
               <w:top w:val="single" w:color="BFBFBF" w:sz="4"/>
               <w:left w:val="single" w:color="BFBFBF" w:sz="4"/>
@@ -567,7 +668,7 @@
         </w:trPr>
         <w:tc>
           <w:tcPr>
-            <w:tcW w:type="dxa" w:w="500"/>
+            <w:tcW w:type="dxa" w:w="450"/>
             <w:tcBorders>
               <w:top w:val="single" w:color="BFBFBF" w:sz="4"/>
               <w:left w:val="single" w:color="BFBFBF" w:sz="4"/>
@@ -594,7 +695,7 @@
         </w:tc>
         <w:tc>
           <w:tcPr>
-            <w:tcW w:type="dxa" w:w="1900"/>
+            <w:tcW w:type="dxa" w:w="1650"/>
             <w:tcBorders>
               <w:top w:val="single" w:color="BFBFBF" w:sz="4"/>
               <w:left w:val="single" w:color="BFBFBF" w:sz="4"/>
@@ -621,7 +722,34 @@
         </w:tc>
         <w:tc>
           <w:tcPr>
-            <w:tcW w:type="dxa" w:w="4160"/>
+            <w:tcW w:type="dxa" w:w="1400"/>
+            <w:tcBorders>
+              <w:top w:val="single" w:color="BFBFBF" w:sz="4"/>
+              <w:left w:val="single" w:color="BFBFBF" w:sz="4"/>
+              <w:bottom w:val="single" w:color="BFBFBF" w:sz="4"/>
+              <w:right w:val="single" w:color="BFBFBF" w:sz="4"/>
+            </w:tcBorders>
+            <w:tcMar>
+              <w:top w:type="dxa" w:w="60"/>
+              <w:left w:type="dxa" w:w="90"/>
+              <w:bottom w:type="dxa" w:w="60"/>
+              <w:right w:type="dxa" w:w="90"/>
+            </w:tcMar>
+          </w:tcPr>
+          <w:p>
+            <w:r>
+              <w:rPr>
+                <w:rFonts w:ascii="Arial" w:cs="Arial" w:eastAsia="Arial" w:hAnsi="Arial"/>
+                <w:sz w:val="17"/>
+                <w:szCs w:val="17"/>
+              </w:rPr>
+              <w:t xml:space="preserve">Indispensable</w:t>
+            </w:r>
+          </w:p>
+        </w:tc>
+        <w:tc>
+          <w:tcPr>
+            <w:tcW w:type="dxa" w:w="3360"/>
             <w:tcBorders>
               <w:top w:val="single" w:color="BFBFBF" w:sz="4"/>
               <w:left w:val="single" w:color="BFBFBF" w:sz="4"/>
@@ -648,7 +776,7 @@
         </w:tc>
         <w:tc>
           <w:tcPr>
-            <w:tcW w:type="dxa" w:w="2800"/>
+            <w:tcW w:type="dxa" w:w="2500"/>
             <w:tcBorders>
               <w:top w:val="single" w:color="BFBFBF" w:sz="4"/>
               <w:left w:val="single" w:color="BFBFBF" w:sz="4"/>
@@ -680,7 +808,7 @@
         </w:trPr>
         <w:tc>
           <w:tcPr>
-            <w:tcW w:type="dxa" w:w="500"/>
+            <w:tcW w:type="dxa" w:w="450"/>
             <w:tcBorders>
               <w:top w:val="single" w:color="BFBFBF" w:sz="4"/>
               <w:left w:val="single" w:color="BFBFBF" w:sz="4"/>
@@ -708,7 +836,7 @@
         </w:tc>
         <w:tc>
           <w:tcPr>
-            <w:tcW w:type="dxa" w:w="1900"/>
+            <w:tcW w:type="dxa" w:w="1650"/>
             <w:tcBorders>
               <w:top w:val="single" w:color="BFBFBF" w:sz="4"/>
               <w:left w:val="single" w:color="BFBFBF" w:sz="4"/>
@@ -736,7 +864,7 @@
         </w:tc>
         <w:tc>
           <w:tcPr>
-            <w:tcW w:type="dxa" w:w="4160"/>
+            <w:tcW w:type="dxa" w:w="1400"/>
             <w:tcBorders>
               <w:top w:val="single" w:color="BFBFBF" w:sz="4"/>
               <w:left w:val="single" w:color="BFBFBF" w:sz="4"/>
@@ -758,13 +886,41 @@
                 <w:sz w:val="17"/>
                 <w:szCs w:val="17"/>
               </w:rPr>
+              <w:t xml:space="preserve">Indispensable</w:t>
+            </w:r>
+          </w:p>
+        </w:tc>
+        <w:tc>
+          <w:tcPr>
+            <w:tcW w:type="dxa" w:w="3360"/>
+            <w:tcBorders>
+              <w:top w:val="single" w:color="BFBFBF" w:sz="4"/>
+              <w:left w:val="single" w:color="BFBFBF" w:sz="4"/>
+              <w:bottom w:val="single" w:color="BFBFBF" w:sz="4"/>
+              <w:right w:val="single" w:color="BFBFBF" w:sz="4"/>
+            </w:tcBorders>
+            <w:shd w:fill="F7F9FA" w:color="auto" w:val="clear"/>
+            <w:tcMar>
+              <w:top w:type="dxa" w:w="60"/>
+              <w:left w:type="dxa" w:w="90"/>
+              <w:bottom w:type="dxa" w:w="60"/>
+              <w:right w:type="dxa" w:w="90"/>
+            </w:tcMar>
+          </w:tcPr>
+          <w:p>
+            <w:r>
+              <w:rPr>
+                <w:rFonts w:ascii="Arial" w:cs="Arial" w:eastAsia="Arial" w:hAnsi="Arial"/>
+                <w:sz w:val="17"/>
+                <w:szCs w:val="17"/>
+              </w:rPr>
               <w:t xml:space="preserve">Describe al menos un beneficio ambiental positivo con un indicador, su valor actual y su meta (por ejemplo, hectáreas restauradas, toneladas de residuos recicladas), y dice qué personas o comunidades se benefician.</w:t>
             </w:r>
           </w:p>
         </w:tc>
         <w:tc>
           <w:tcPr>
-            <w:tcW w:type="dxa" w:w="2800"/>
+            <w:tcW w:type="dxa" w:w="2500"/>
             <w:tcBorders>
               <w:top w:val="single" w:color="BFBFBF" w:sz="4"/>
               <w:left w:val="single" w:color="BFBFBF" w:sz="4"/>
@@ -797,7 +953,7 @@
         </w:trPr>
         <w:tc>
           <w:tcPr>
-            <w:tcW w:type="dxa" w:w="500"/>
+            <w:tcW w:type="dxa" w:w="450"/>
             <w:tcBorders>
               <w:top w:val="single" w:color="BFBFBF" w:sz="4"/>
               <w:left w:val="single" w:color="BFBFBF" w:sz="4"/>
@@ -824,7 +980,7 @@
         </w:tc>
         <w:tc>
           <w:tcPr>
-            <w:tcW w:type="dxa" w:w="1900"/>
+            <w:tcW w:type="dxa" w:w="1650"/>
             <w:tcBorders>
               <w:top w:val="single" w:color="BFBFBF" w:sz="4"/>
               <w:left w:val="single" w:color="BFBFBF" w:sz="4"/>
@@ -851,7 +1007,34 @@
         </w:tc>
         <w:tc>
           <w:tcPr>
-            <w:tcW w:type="dxa" w:w="4160"/>
+            <w:tcW w:type="dxa" w:w="1400"/>
+            <w:tcBorders>
+              <w:top w:val="single" w:color="BFBFBF" w:sz="4"/>
+              <w:left w:val="single" w:color="BFBFBF" w:sz="4"/>
+              <w:bottom w:val="single" w:color="BFBFBF" w:sz="4"/>
+              <w:right w:val="single" w:color="BFBFBF" w:sz="4"/>
+            </w:tcBorders>
+            <w:tcMar>
+              <w:top w:type="dxa" w:w="60"/>
+              <w:left w:type="dxa" w:w="90"/>
+              <w:bottom w:type="dxa" w:w="60"/>
+              <w:right w:type="dxa" w:w="90"/>
+            </w:tcMar>
+          </w:tcPr>
+          <w:p>
+            <w:r>
+              <w:rPr>
+                <w:rFonts w:ascii="Arial" w:cs="Arial" w:eastAsia="Arial" w:hAnsi="Arial"/>
+                <w:sz w:val="17"/>
+                <w:szCs w:val="17"/>
+              </w:rPr>
+              <w:t xml:space="preserve">Indispensable</w:t>
+            </w:r>
+          </w:p>
+        </w:tc>
+        <w:tc>
+          <w:tcPr>
+            <w:tcW w:type="dxa" w:w="3360"/>
             <w:tcBorders>
               <w:top w:val="single" w:color="BFBFBF" w:sz="4"/>
               <w:left w:val="single" w:color="BFBFBF" w:sz="4"/>
@@ -878,7 +1061,7 @@
         </w:tc>
         <w:tc>
           <w:tcPr>
-            <w:tcW w:type="dxa" w:w="2800"/>
+            <w:tcW w:type="dxa" w:w="2500"/>
             <w:tcBorders>
               <w:top w:val="single" w:color="BFBFBF" w:sz="4"/>
               <w:left w:val="single" w:color="BFBFBF" w:sz="4"/>
@@ -910,7 +1093,7 @@
         </w:trPr>
         <w:tc>
           <w:tcPr>
-            <w:tcW w:type="dxa" w:w="500"/>
+            <w:tcW w:type="dxa" w:w="450"/>
             <w:tcBorders>
               <w:top w:val="single" w:color="BFBFBF" w:sz="4"/>
               <w:left w:val="single" w:color="BFBFBF" w:sz="4"/>
@@ -938,7 +1121,7 @@
         </w:tc>
         <w:tc>
           <w:tcPr>
-            <w:tcW w:type="dxa" w:w="1900"/>
+            <w:tcW w:type="dxa" w:w="1650"/>
             <w:tcBorders>
               <w:top w:val="single" w:color="BFBFBF" w:sz="4"/>
               <w:left w:val="single" w:color="BFBFBF" w:sz="4"/>
@@ -966,7 +1149,7 @@
         </w:tc>
         <w:tc>
           <w:tcPr>
-            <w:tcW w:type="dxa" w:w="4160"/>
+            <w:tcW w:type="dxa" w:w="1400"/>
             <w:tcBorders>
               <w:top w:val="single" w:color="BFBFBF" w:sz="4"/>
               <w:left w:val="single" w:color="BFBFBF" w:sz="4"/>
@@ -988,13 +1171,41 @@
                 <w:sz w:val="17"/>
                 <w:szCs w:val="17"/>
               </w:rPr>
+              <w:t xml:space="preserve">Corregible</w:t>
+            </w:r>
+          </w:p>
+        </w:tc>
+        <w:tc>
+          <w:tcPr>
+            <w:tcW w:type="dxa" w:w="3360"/>
+            <w:tcBorders>
+              <w:top w:val="single" w:color="BFBFBF" w:sz="4"/>
+              <w:left w:val="single" w:color="BFBFBF" w:sz="4"/>
+              <w:bottom w:val="single" w:color="BFBFBF" w:sz="4"/>
+              <w:right w:val="single" w:color="BFBFBF" w:sz="4"/>
+            </w:tcBorders>
+            <w:shd w:fill="F7F9FA" w:color="auto" w:val="clear"/>
+            <w:tcMar>
+              <w:top w:type="dxa" w:w="60"/>
+              <w:left w:type="dxa" w:w="90"/>
+              <w:bottom w:type="dxa" w:w="60"/>
+              <w:right w:type="dxa" w:w="90"/>
+            </w:tcMar>
+          </w:tcPr>
+          <w:p>
+            <w:r>
+              <w:rPr>
+                <w:rFonts w:ascii="Arial" w:cs="Arial" w:eastAsia="Arial" w:hAnsi="Arial"/>
+                <w:sz w:val="17"/>
+                <w:szCs w:val="17"/>
+              </w:rPr>
               <w:t xml:space="preserve">Precisa su objeto; tiene un apartado técnico-operativo y uno técnico-financiero con análisis costo-beneficio; incluye plan de trabajo, cronograma y un esquema de prioridades y contingencias.</w:t>
             </w:r>
           </w:p>
         </w:tc>
         <w:tc>
           <w:tcPr>
-            <w:tcW w:type="dxa" w:w="2800"/>
+            <w:tcW w:type="dxa" w:w="2500"/>
             <w:tcBorders>
               <w:top w:val="single" w:color="BFBFBF" w:sz="4"/>
               <w:left w:val="single" w:color="BFBFBF" w:sz="4"/>
@@ -1027,7 +1238,7 @@
         </w:trPr>
         <w:tc>
           <w:tcPr>
-            <w:tcW w:type="dxa" w:w="500"/>
+            <w:tcW w:type="dxa" w:w="450"/>
             <w:tcBorders>
               <w:top w:val="single" w:color="BFBFBF" w:sz="4"/>
               <w:left w:val="single" w:color="BFBFBF" w:sz="4"/>
@@ -1054,7 +1265,7 @@
         </w:tc>
         <w:tc>
           <w:tcPr>
-            <w:tcW w:type="dxa" w:w="1900"/>
+            <w:tcW w:type="dxa" w:w="1650"/>
             <w:tcBorders>
               <w:top w:val="single" w:color="BFBFBF" w:sz="4"/>
               <w:left w:val="single" w:color="BFBFBF" w:sz="4"/>
@@ -1081,7 +1292,34 @@
         </w:tc>
         <w:tc>
           <w:tcPr>
-            <w:tcW w:type="dxa" w:w="4160"/>
+            <w:tcW w:type="dxa" w:w="1400"/>
+            <w:tcBorders>
+              <w:top w:val="single" w:color="BFBFBF" w:sz="4"/>
+              <w:left w:val="single" w:color="BFBFBF" w:sz="4"/>
+              <w:bottom w:val="single" w:color="BFBFBF" w:sz="4"/>
+              <w:right w:val="single" w:color="BFBFBF" w:sz="4"/>
+            </w:tcBorders>
+            <w:tcMar>
+              <w:top w:type="dxa" w:w="60"/>
+              <w:left w:type="dxa" w:w="90"/>
+              <w:bottom w:type="dxa" w:w="60"/>
+              <w:right w:type="dxa" w:w="90"/>
+            </w:tcMar>
+          </w:tcPr>
+          <w:p>
+            <w:r>
+              <w:rPr>
+                <w:rFonts w:ascii="Arial" w:cs="Arial" w:eastAsia="Arial" w:hAnsi="Arial"/>
+                <w:sz w:val="17"/>
+                <w:szCs w:val="17"/>
+              </w:rPr>
+              <w:t xml:space="preserve">Indispensable</w:t>
+            </w:r>
+          </w:p>
+        </w:tc>
+        <w:tc>
+          <w:tcPr>
+            <w:tcW w:type="dxa" w:w="3360"/>
             <w:tcBorders>
               <w:top w:val="single" w:color="BFBFBF" w:sz="4"/>
               <w:left w:val="single" w:color="BFBFBF" w:sz="4"/>
@@ -1108,7 +1346,7 @@
         </w:tc>
         <w:tc>
           <w:tcPr>
-            <w:tcW w:type="dxa" w:w="2800"/>
+            <w:tcW w:type="dxa" w:w="2500"/>
             <w:tcBorders>
               <w:top w:val="single" w:color="BFBFBF" w:sz="4"/>
               <w:left w:val="single" w:color="BFBFBF" w:sz="4"/>
@@ -1140,7 +1378,7 @@
         </w:trPr>
         <w:tc>
           <w:tcPr>
-            <w:tcW w:type="dxa" w:w="500"/>
+            <w:tcW w:type="dxa" w:w="450"/>
             <w:tcBorders>
               <w:top w:val="single" w:color="BFBFBF" w:sz="4"/>
               <w:left w:val="single" w:color="BFBFBF" w:sz="4"/>
@@ -1168,7 +1406,7 @@
         </w:tc>
         <w:tc>
           <w:tcPr>
-            <w:tcW w:type="dxa" w:w="1900"/>
+            <w:tcW w:type="dxa" w:w="1650"/>
             <w:tcBorders>
               <w:top w:val="single" w:color="BFBFBF" w:sz="4"/>
               <w:left w:val="single" w:color="BFBFBF" w:sz="4"/>
@@ -1196,7 +1434,7 @@
         </w:tc>
         <w:tc>
           <w:tcPr>
-            <w:tcW w:type="dxa" w:w="4160"/>
+            <w:tcW w:type="dxa" w:w="1400"/>
             <w:tcBorders>
               <w:top w:val="single" w:color="BFBFBF" w:sz="4"/>
               <w:left w:val="single" w:color="BFBFBF" w:sz="4"/>
@@ -1218,13 +1456,41 @@
                 <w:sz w:val="17"/>
                 <w:szCs w:val="17"/>
               </w:rPr>
+              <w:t xml:space="preserve">Indispensable</w:t>
+            </w:r>
+          </w:p>
+        </w:tc>
+        <w:tc>
+          <w:tcPr>
+            <w:tcW w:type="dxa" w:w="3360"/>
+            <w:tcBorders>
+              <w:top w:val="single" w:color="BFBFBF" w:sz="4"/>
+              <w:left w:val="single" w:color="BFBFBF" w:sz="4"/>
+              <w:bottom w:val="single" w:color="BFBFBF" w:sz="4"/>
+              <w:right w:val="single" w:color="BFBFBF" w:sz="4"/>
+            </w:tcBorders>
+            <w:shd w:fill="F7F9FA" w:color="auto" w:val="clear"/>
+            <w:tcMar>
+              <w:top w:type="dxa" w:w="60"/>
+              <w:left w:type="dxa" w:w="90"/>
+              <w:bottom w:type="dxa" w:w="60"/>
+              <w:right w:type="dxa" w:w="90"/>
+            </w:tcMar>
+          </w:tcPr>
+          <w:p>
+            <w:r>
+              <w:rPr>
+                <w:rFonts w:ascii="Arial" w:cs="Arial" w:eastAsia="Arial" w:hAnsi="Arial"/>
+                <w:sz w:val="17"/>
+                <w:szCs w:val="17"/>
+              </w:rPr>
               <w:t xml:space="preserve">Entrega el soporte documental de su situación legal, financiera y fiscal; el monto está dentro del rango; declara que no tiene otro apoyo para lo mismo y que el proyecto no está ya hecho; y establece cómo informará sus avances (al menos cada trimestre).</w:t>
             </w:r>
           </w:p>
         </w:tc>
         <w:tc>
           <w:tcPr>
-            <w:tcW w:type="dxa" w:w="2800"/>
+            <w:tcW w:type="dxa" w:w="2500"/>
             <w:tcBorders>
               <w:top w:val="single" w:color="BFBFBF" w:sz="4"/>
               <w:left w:val="single" w:color="BFBFBF" w:sz="4"/>
@@ -3271,6 +3537,421 @@
         </w:tc>
       </w:tr>
     </w:tbl>
+    <w:p>
+      <w:pPr>
+        <w:pStyle w:val="Heading1"/>
+      </w:pPr>
+      <w:r>
+        <w:rPr>
+          <w:rFonts w:ascii="Arial" w:cs="Arial" w:eastAsia="Arial" w:hAnsi="Arial"/>
+        </w:rPr>
+        <w:t xml:space="preserve">Fortalecimiento de propuestas</w:t>
+      </w:r>
+    </w:p>
+    <w:p>
+      <w:pPr>
+        <w:spacing w:after="120"/>
+      </w:pPr>
+      <w:r>
+        <w:rPr>
+          <w:rFonts w:ascii="Arial" w:cs="Arial" w:eastAsia="Arial" w:hAnsi="Arial"/>
+          <w:sz w:val="21"/>
+          <w:szCs w:val="21"/>
+        </w:rPr>
+        <w:t xml:space="preserve">El Fondo no solo elige proyectos: también puede fortalecer los que tienen potencial pero llegan con huecos técnicos o financieros. Así no se pierde un buen proyecto por algo que se puede corregir.</w:t>
+      </w:r>
+    </w:p>
+    <w:p>
+      <w:pPr>
+        <w:pStyle w:val="Heading2"/>
+      </w:pPr>
+      <w:r>
+        <w:rPr>
+          <w:rFonts w:ascii="Arial" w:cs="Arial" w:eastAsia="Arial" w:hAnsi="Arial"/>
+        </w:rPr>
+        <w:t xml:space="preserve">Cuándo un proyecto es candidato a fortalecimiento</w:t>
+      </w:r>
+    </w:p>
+    <w:p>
+      <w:pPr>
+        <w:spacing w:after="120"/>
+      </w:pPr>
+      <w:r>
+        <w:rPr>
+          <w:rFonts w:ascii="Arial" w:cs="Arial" w:eastAsia="Arial" w:hAnsi="Arial"/>
+          <w:sz w:val="21"/>
+          <w:szCs w:val="21"/>
+        </w:rPr>
+        <w:t xml:space="preserve">Cuando cumple las dos condiciones:</w:t>
+      </w:r>
+    </w:p>
+    <w:p>
+      <w:pPr>
+        <w:pStyle w:val="ListParagraph"/>
+        <w:numPr>
+          <w:ilvl w:val="0"/>
+          <w:numId w:val="3"/>
+        </w:numPr>
+        <w:spacing w:after="80"/>
+      </w:pPr>
+      <w:r>
+        <w:rPr>
+          <w:rFonts w:ascii="Arial" w:cs="Arial" w:eastAsia="Arial" w:hAnsi="Arial"/>
+          <w:b/>
+          <w:bCs/>
+          <w:sz w:val="21"/>
+          <w:szCs w:val="21"/>
+        </w:rPr>
+        <w:t xml:space="preserve">Tiene potencial: </w:t>
+      </w:r>
+      <w:r>
+        <w:rPr>
+          <w:rFonts w:ascii="Arial" w:cs="Arial" w:eastAsia="Arial" w:hAnsi="Arial"/>
+          <w:sz w:val="21"/>
+          <w:szCs w:val="21"/>
+        </w:rPr>
+        <w:t xml:space="preserve">2 o 3 puntos en Impacto y en Atención a población vulnerable.</w:t>
+      </w:r>
+    </w:p>
+    <w:p>
+      <w:pPr>
+        <w:pStyle w:val="ListParagraph"/>
+        <w:numPr>
+          <w:ilvl w:val="0"/>
+          <w:numId w:val="3"/>
+        </w:numPr>
+        <w:spacing w:after="80"/>
+      </w:pPr>
+      <w:r>
+        <w:rPr>
+          <w:rFonts w:ascii="Arial" w:cs="Arial" w:eastAsia="Arial" w:hAnsi="Arial"/>
+          <w:b/>
+          <w:bCs/>
+          <w:sz w:val="21"/>
+          <w:szCs w:val="21"/>
+        </w:rPr>
+        <w:t xml:space="preserve">Le falta algo corregible: </w:t>
+      </w:r>
+      <w:r>
+        <w:rPr>
+          <w:rFonts w:ascii="Arial" w:cs="Arial" w:eastAsia="Arial" w:hAnsi="Arial"/>
+          <w:sz w:val="21"/>
+          <w:szCs w:val="21"/>
+        </w:rPr>
+        <w:t xml:space="preserve">no cumplió el requisito 4 (propuesta completa), o sacó 1 en Factibilidad, Costo-efectividad, Sostenibilidad o Medición de resultados.</w:t>
+      </w:r>
+    </w:p>
+    <w:p>
+      <w:pPr>
+        <w:spacing w:after="120"/>
+      </w:pPr>
+      <w:r>
+        <w:rPr>
+          <w:rFonts w:ascii="Arial" w:cs="Arial" w:eastAsia="Arial" w:hAnsi="Arial"/>
+          <w:i/>
+          <w:iCs/>
+          <w:color w:val="404040"/>
+          <w:sz w:val="19"/>
+          <w:szCs w:val="19"/>
+        </w:rPr>
+        <w:t xml:space="preserve">El Excel lo marca solo y dice qué hay que fortalecer. Un proyecto con propuesta incompleta y poco potencial se marca como tal y se le explica qué mejorar para otra convocatoria.</w:t>
+      </w:r>
+    </w:p>
+    <w:p>
+      <w:pPr>
+        <w:pStyle w:val="Heading2"/>
+      </w:pPr>
+      <w:r>
+        <w:rPr>
+          <w:rFonts w:ascii="Arial" w:cs="Arial" w:eastAsia="Arial" w:hAnsi="Arial"/>
+        </w:rPr>
+        <w:t xml:space="preserve">Qué puede hacer el Fondo</w:t>
+      </w:r>
+    </w:p>
+    <w:tbl>
+      <w:tblPr>
+        <w:tblW w:type="dxa" w:w="9360"/>
+        <w:tblBorders>
+          <w:top w:val="single" w:color="auto" w:sz="4"/>
+          <w:left w:val="single" w:color="auto" w:sz="4"/>
+          <w:bottom w:val="single" w:color="auto" w:sz="4"/>
+          <w:right w:val="single" w:color="auto" w:sz="4"/>
+          <w:insideH w:val="single" w:color="auto" w:sz="4"/>
+          <w:insideV w:val="single" w:color="auto" w:sz="4"/>
+        </w:tblBorders>
+      </w:tblPr>
+      <w:tblGrid>
+        <w:gridCol w:w="2600"/>
+        <w:gridCol w:w="6760"/>
+      </w:tblGrid>
+      <w:tr>
+        <w:trPr>
+          <w:tblHeader/>
+        </w:trPr>
+        <w:tc>
+          <w:tcPr>
+            <w:tcW w:type="dxa" w:w="2600"/>
+            <w:tcBorders>
+              <w:top w:val="single" w:color="BFBFBF" w:sz="4"/>
+              <w:left w:val="single" w:color="BFBFBF" w:sz="4"/>
+              <w:bottom w:val="single" w:color="BFBFBF" w:sz="4"/>
+              <w:right w:val="single" w:color="BFBFBF" w:sz="4"/>
+            </w:tcBorders>
+            <w:shd w:fill="1F4E5A" w:color="auto" w:val="clear"/>
+            <w:tcMar>
+              <w:top w:type="dxa" w:w="60"/>
+              <w:left w:type="dxa" w:w="90"/>
+              <w:bottom w:type="dxa" w:w="60"/>
+              <w:right w:type="dxa" w:w="90"/>
+            </w:tcMar>
+          </w:tcPr>
+          <w:p>
+            <w:r>
+              <w:rPr>
+                <w:rFonts w:ascii="Arial" w:cs="Arial" w:eastAsia="Arial" w:hAnsi="Arial"/>
+                <w:b/>
+                <w:bCs/>
+                <w:color w:val="FFFFFF"/>
+                <w:sz w:val="17"/>
+                <w:szCs w:val="17"/>
+              </w:rPr>
+              <w:t xml:space="preserve">Opción</w:t>
+            </w:r>
+          </w:p>
+        </w:tc>
+        <w:tc>
+          <w:tcPr>
+            <w:tcW w:type="dxa" w:w="6760"/>
+            <w:tcBorders>
+              <w:top w:val="single" w:color="BFBFBF" w:sz="4"/>
+              <w:left w:val="single" w:color="BFBFBF" w:sz="4"/>
+              <w:bottom w:val="single" w:color="BFBFBF" w:sz="4"/>
+              <w:right w:val="single" w:color="BFBFBF" w:sz="4"/>
+            </w:tcBorders>
+            <w:shd w:fill="1F4E5A" w:color="auto" w:val="clear"/>
+            <w:tcMar>
+              <w:top w:type="dxa" w:w="60"/>
+              <w:left w:type="dxa" w:w="90"/>
+              <w:bottom w:type="dxa" w:w="60"/>
+              <w:right w:type="dxa" w:w="90"/>
+            </w:tcMar>
+          </w:tcPr>
+          <w:p>
+            <w:r>
+              <w:rPr>
+                <w:rFonts w:ascii="Arial" w:cs="Arial" w:eastAsia="Arial" w:hAnsi="Arial"/>
+                <w:b/>
+                <w:bCs/>
+                <w:color w:val="FFFFFF"/>
+                <w:sz w:val="17"/>
+                <w:szCs w:val="17"/>
+              </w:rPr>
+              <w:t xml:space="preserve">En qué consiste</w:t>
+            </w:r>
+          </w:p>
+        </w:tc>
+      </w:tr>
+      <w:tr>
+        <w:trPr>
+          <w:cantSplit/>
+        </w:trPr>
+        <w:tc>
+          <w:tcPr>
+            <w:tcW w:type="dxa" w:w="2600"/>
+            <w:tcBorders>
+              <w:top w:val="single" w:color="BFBFBF" w:sz="4"/>
+              <w:left w:val="single" w:color="BFBFBF" w:sz="4"/>
+              <w:bottom w:val="single" w:color="BFBFBF" w:sz="4"/>
+              <w:right w:val="single" w:color="BFBFBF" w:sz="4"/>
+            </w:tcBorders>
+            <w:shd w:fill="EAF1F4" w:color="auto" w:val="clear"/>
+            <w:tcMar>
+              <w:top w:type="dxa" w:w="60"/>
+              <w:left w:type="dxa" w:w="90"/>
+              <w:bottom w:type="dxa" w:w="60"/>
+              <w:right w:type="dxa" w:w="90"/>
+            </w:tcMar>
+          </w:tcPr>
+          <w:p>
+            <w:r>
+              <w:rPr>
+                <w:rFonts w:ascii="Arial" w:cs="Arial" w:eastAsia="Arial" w:hAnsi="Arial"/>
+                <w:b/>
+                <w:bCs/>
+                <w:sz w:val="17"/>
+                <w:szCs w:val="17"/>
+              </w:rPr>
+              <w:t xml:space="preserve">Apoyo no financiero primero</w:t>
+            </w:r>
+          </w:p>
+        </w:tc>
+        <w:tc>
+          <w:tcPr>
+            <w:tcW w:type="dxa" w:w="6760"/>
+            <w:tcBorders>
+              <w:top w:val="single" w:color="BFBFBF" w:sz="4"/>
+              <w:left w:val="single" w:color="BFBFBF" w:sz="4"/>
+              <w:bottom w:val="single" w:color="BFBFBF" w:sz="4"/>
+              <w:right w:val="single" w:color="BFBFBF" w:sz="4"/>
+            </w:tcBorders>
+            <w:tcMar>
+              <w:top w:type="dxa" w:w="60"/>
+              <w:left w:type="dxa" w:w="90"/>
+              <w:bottom w:type="dxa" w:w="60"/>
+              <w:right w:type="dxa" w:w="90"/>
+            </w:tcMar>
+          </w:tcPr>
+          <w:p>
+            <w:r>
+              <w:rPr>
+                <w:rFonts w:ascii="Arial" w:cs="Arial" w:eastAsia="Arial" w:hAnsi="Arial"/>
+                <w:sz w:val="17"/>
+                <w:szCs w:val="17"/>
+              </w:rPr>
+              <w:t xml:space="preserve">El Fondo le da asesoría, asistencia técnica o un estudio (por ejemplo, el plan financiero) y el proyecto se vuelve a presentar en la siguiente convocatoria.</w:t>
+            </w:r>
+          </w:p>
+        </w:tc>
+      </w:tr>
+      <w:tr>
+        <w:trPr>
+          <w:cantSplit/>
+        </w:trPr>
+        <w:tc>
+          <w:tcPr>
+            <w:tcW w:type="dxa" w:w="2600"/>
+            <w:tcBorders>
+              <w:top w:val="single" w:color="BFBFBF" w:sz="4"/>
+              <w:left w:val="single" w:color="BFBFBF" w:sz="4"/>
+              <w:bottom w:val="single" w:color="BFBFBF" w:sz="4"/>
+              <w:right w:val="single" w:color="BFBFBF" w:sz="4"/>
+            </w:tcBorders>
+            <w:shd w:fill="EAF1F4" w:color="auto" w:val="clear"/>
+            <w:tcMar>
+              <w:top w:type="dxa" w:w="60"/>
+              <w:left w:type="dxa" w:w="90"/>
+              <w:bottom w:type="dxa" w:w="60"/>
+              <w:right w:type="dxa" w:w="90"/>
+            </w:tcMar>
+          </w:tcPr>
+          <w:p>
+            <w:r>
+              <w:rPr>
+                <w:rFonts w:ascii="Arial" w:cs="Arial" w:eastAsia="Arial" w:hAnsi="Arial"/>
+                <w:b/>
+                <w:bCs/>
+                <w:sz w:val="17"/>
+                <w:szCs w:val="17"/>
+              </w:rPr>
+              <w:t xml:space="preserve">Financiamiento por etapas</w:t>
+            </w:r>
+          </w:p>
+        </w:tc>
+        <w:tc>
+          <w:tcPr>
+            <w:tcW w:type="dxa" w:w="6760"/>
+            <w:tcBorders>
+              <w:top w:val="single" w:color="BFBFBF" w:sz="4"/>
+              <w:left w:val="single" w:color="BFBFBF" w:sz="4"/>
+              <w:bottom w:val="single" w:color="BFBFBF" w:sz="4"/>
+              <w:right w:val="single" w:color="BFBFBF" w:sz="4"/>
+            </w:tcBorders>
+            <w:shd w:fill="F7F9FA" w:color="auto" w:val="clear"/>
+            <w:tcMar>
+              <w:top w:type="dxa" w:w="60"/>
+              <w:left w:type="dxa" w:w="90"/>
+              <w:bottom w:type="dxa" w:w="60"/>
+              <w:right w:type="dxa" w:w="90"/>
+            </w:tcMar>
+          </w:tcPr>
+          <w:p>
+            <w:r>
+              <w:rPr>
+                <w:rFonts w:ascii="Arial" w:cs="Arial" w:eastAsia="Arial" w:hAnsi="Arial"/>
+                <w:sz w:val="17"/>
+                <w:szCs w:val="17"/>
+              </w:rPr>
+              <w:t xml:space="preserve">La primera etapa se usa para robustecer lo que falta; las siguientes se pagan solo si se logra.</w:t>
+            </w:r>
+          </w:p>
+        </w:tc>
+      </w:tr>
+      <w:tr>
+        <w:trPr>
+          <w:cantSplit/>
+        </w:trPr>
+        <w:tc>
+          <w:tcPr>
+            <w:tcW w:type="dxa" w:w="2600"/>
+            <w:tcBorders>
+              <w:top w:val="single" w:color="BFBFBF" w:sz="4"/>
+              <w:left w:val="single" w:color="BFBFBF" w:sz="4"/>
+              <w:bottom w:val="single" w:color="BFBFBF" w:sz="4"/>
+              <w:right w:val="single" w:color="BFBFBF" w:sz="4"/>
+            </w:tcBorders>
+            <w:shd w:fill="EAF1F4" w:color="auto" w:val="clear"/>
+            <w:tcMar>
+              <w:top w:type="dxa" w:w="60"/>
+              <w:left w:type="dxa" w:w="90"/>
+              <w:bottom w:type="dxa" w:w="60"/>
+              <w:right w:type="dxa" w:w="90"/>
+            </w:tcMar>
+          </w:tcPr>
+          <w:p>
+            <w:r>
+              <w:rPr>
+                <w:rFonts w:ascii="Arial" w:cs="Arial" w:eastAsia="Arial" w:hAnsi="Arial"/>
+                <w:b/>
+                <w:bCs/>
+                <w:sz w:val="17"/>
+                <w:szCs w:val="17"/>
+              </w:rPr>
+              <w:t xml:space="preserve">Aprobación con condiciones</w:t>
+            </w:r>
+          </w:p>
+        </w:tc>
+        <w:tc>
+          <w:tcPr>
+            <w:tcW w:type="dxa" w:w="6760"/>
+            <w:tcBorders>
+              <w:top w:val="single" w:color="BFBFBF" w:sz="4"/>
+              <w:left w:val="single" w:color="BFBFBF" w:sz="4"/>
+              <w:bottom w:val="single" w:color="BFBFBF" w:sz="4"/>
+              <w:right w:val="single" w:color="BFBFBF" w:sz="4"/>
+            </w:tcBorders>
+            <w:tcMar>
+              <w:top w:type="dxa" w:w="60"/>
+              <w:left w:type="dxa" w:w="90"/>
+              <w:bottom w:type="dxa" w:w="60"/>
+              <w:right w:type="dxa" w:w="90"/>
+            </w:tcMar>
+          </w:tcPr>
+          <w:p>
+            <w:r>
+              <w:rPr>
+                <w:rFonts w:ascii="Arial" w:cs="Arial" w:eastAsia="Arial" w:hAnsi="Arial"/>
+                <w:sz w:val="17"/>
+                <w:szCs w:val="17"/>
+              </w:rPr>
+              <w:t xml:space="preserve">Se aprueba con compromisos concretos y plazos, por ejemplo conseguir cofinanciamiento antes del segundo pago.</w:t>
+            </w:r>
+          </w:p>
+        </w:tc>
+      </w:tr>
+    </w:tbl>
+    <w:p>
+      <w:pPr>
+        <w:spacing w:after="120"/>
+      </w:pPr>
+      <w:r>
+        <w:rPr>
+          <w:rFonts w:ascii="Arial" w:cs="Arial" w:eastAsia="Arial" w:hAnsi="Arial"/>
+          <w:sz w:val="21"/>
+          <w:szCs w:val="21"/>
+        </w:rPr>
+        <w:t xml:space="preserve">Estas opciones usan los apoyos no financieros (asesoría, asistencia técnica especializada, estudios técnicos, administrativos o financieros, vinculación con fondeadores) que prevé el documento de criterios de elegibilidad.</w:t>
+      </w:r>
+    </w:p>
     <w:p>
       <w:pPr>
         <w:pStyle w:val="Heading1"/>
@@ -3411,6 +4092,34 @@
           <w:sz w:val="21"/>
           <w:szCs w:val="21"/>
         </w:rPr>
+        <w:t xml:space="preserve">Candidatos a fortalecimiento: </w:t>
+      </w:r>
+      <w:r>
+        <w:rPr>
+          <w:rFonts w:ascii="Arial" w:cs="Arial" w:eastAsia="Arial" w:hAnsi="Arial"/>
+          <w:sz w:val="21"/>
+          <w:szCs w:val="21"/>
+        </w:rPr>
+        <w:t xml:space="preserve">el Comité decide para cada uno qué opción aplica (apoyo no financiero, financiamiento por etapas o aprobación con condiciones) y lo deja por escrito con plazos.</w:t>
+      </w:r>
+    </w:p>
+    <w:p>
+      <w:pPr>
+        <w:pStyle w:val="ListParagraph"/>
+        <w:numPr>
+          <w:ilvl w:val="0"/>
+          <w:numId w:val="3"/>
+        </w:numPr>
+        <w:spacing w:after="80"/>
+      </w:pPr>
+      <w:r>
+        <w:rPr>
+          <w:rFonts w:ascii="Arial" w:cs="Arial" w:eastAsia="Arial" w:hAnsi="Arial"/>
+          <w:b/>
+          <w:bCs/>
+          <w:sz w:val="21"/>
+          <w:szCs w:val="21"/>
+        </w:rPr>
         <w:t xml:space="preserve">Después: </w:t>
       </w:r>
       <w:r>
@@ -4720,6 +5429,1302 @@
     </w:p>
     <w:p>
       <w:pPr>
+        <w:pStyle w:val="Heading2"/>
+      </w:pPr>
+      <w:r>
+        <w:rPr>
+          <w:rFonts w:ascii="Arial" w:cs="Arial" w:eastAsia="Arial" w:hAnsi="Arial"/>
+        </w:rPr>
+        <w:t xml:space="preserve">Ejemplo de un proyecto a fortalecer</w:t>
+      </w:r>
+    </w:p>
+    <w:p>
+      <w:pPr>
+        <w:spacing w:after="120"/>
+      </w:pPr>
+      <w:r>
+        <w:rPr>
+          <w:rFonts w:ascii="Arial" w:cs="Arial" w:eastAsia="Arial" w:hAnsi="Arial"/>
+          <w:sz w:val="21"/>
+          <w:szCs w:val="21"/>
+        </w:rPr>
+        <w:t xml:space="preserve">Parque lineal con captación de lluvia, propuesto por un ayuntamiento (tema XII, infraestructura verde). Trae proyecto ejecutivo, pero el plan financiero es débil: no compara costos ni dice quién lo mantendrá.</w:t>
+      </w:r>
+    </w:p>
+    <w:tbl>
+      <w:tblPr>
+        <w:tblW w:type="dxa" w:w="9360"/>
+        <w:tblBorders>
+          <w:top w:val="single" w:color="auto" w:sz="4"/>
+          <w:left w:val="single" w:color="auto" w:sz="4"/>
+          <w:bottom w:val="single" w:color="auto" w:sz="4"/>
+          <w:right w:val="single" w:color="auto" w:sz="4"/>
+          <w:insideH w:val="single" w:color="auto" w:sz="4"/>
+          <w:insideV w:val="single" w:color="auto" w:sz="4"/>
+        </w:tblBorders>
+      </w:tblPr>
+      <w:tblGrid>
+        <w:gridCol w:w="4560"/>
+        <w:gridCol w:w="1600"/>
+        <w:gridCol w:w="1600"/>
+        <w:gridCol w:w="1600"/>
+      </w:tblGrid>
+      <w:tr>
+        <w:trPr>
+          <w:tblHeader/>
+        </w:trPr>
+        <w:tc>
+          <w:tcPr>
+            <w:tcW w:type="dxa" w:w="4560"/>
+            <w:tcBorders>
+              <w:top w:val="single" w:color="BFBFBF" w:sz="4"/>
+              <w:left w:val="single" w:color="BFBFBF" w:sz="4"/>
+              <w:bottom w:val="single" w:color="BFBFBF" w:sz="4"/>
+              <w:right w:val="single" w:color="BFBFBF" w:sz="4"/>
+            </w:tcBorders>
+            <w:shd w:fill="1F4E5A" w:color="auto" w:val="clear"/>
+            <w:tcMar>
+              <w:top w:type="dxa" w:w="60"/>
+              <w:left w:type="dxa" w:w="90"/>
+              <w:bottom w:type="dxa" w:w="60"/>
+              <w:right w:type="dxa" w:w="90"/>
+            </w:tcMar>
+          </w:tcPr>
+          <w:p>
+            <w:r>
+              <w:rPr>
+                <w:rFonts w:ascii="Arial" w:cs="Arial" w:eastAsia="Arial" w:hAnsi="Arial"/>
+                <w:b/>
+                <w:bCs/>
+                <w:color w:val="FFFFFF"/>
+                <w:sz w:val="17"/>
+                <w:szCs w:val="17"/>
+              </w:rPr>
+              <w:t xml:space="preserve">Criterio</w:t>
+            </w:r>
+          </w:p>
+        </w:tc>
+        <w:tc>
+          <w:tcPr>
+            <w:tcW w:type="dxa" w:w="1600"/>
+            <w:tcBorders>
+              <w:top w:val="single" w:color="BFBFBF" w:sz="4"/>
+              <w:left w:val="single" w:color="BFBFBF" w:sz="4"/>
+              <w:bottom w:val="single" w:color="BFBFBF" w:sz="4"/>
+              <w:right w:val="single" w:color="BFBFBF" w:sz="4"/>
+            </w:tcBorders>
+            <w:shd w:fill="1F4E5A" w:color="auto" w:val="clear"/>
+            <w:tcMar>
+              <w:top w:type="dxa" w:w="60"/>
+              <w:left w:type="dxa" w:w="90"/>
+              <w:bottom w:type="dxa" w:w="60"/>
+              <w:right w:type="dxa" w:w="90"/>
+            </w:tcMar>
+          </w:tcPr>
+          <w:p>
+            <w:r>
+              <w:rPr>
+                <w:rFonts w:ascii="Arial" w:cs="Arial" w:eastAsia="Arial" w:hAnsi="Arial"/>
+                <w:b/>
+                <w:bCs/>
+                <w:color w:val="FFFFFF"/>
+                <w:sz w:val="17"/>
+                <w:szCs w:val="17"/>
+              </w:rPr>
+              <w:t xml:space="preserve">Calificación</w:t>
+            </w:r>
+          </w:p>
+        </w:tc>
+        <w:tc>
+          <w:tcPr>
+            <w:tcW w:type="dxa" w:w="1600"/>
+            <w:tcBorders>
+              <w:top w:val="single" w:color="BFBFBF" w:sz="4"/>
+              <w:left w:val="single" w:color="BFBFBF" w:sz="4"/>
+              <w:bottom w:val="single" w:color="BFBFBF" w:sz="4"/>
+              <w:right w:val="single" w:color="BFBFBF" w:sz="4"/>
+            </w:tcBorders>
+            <w:shd w:fill="1F4E5A" w:color="auto" w:val="clear"/>
+            <w:tcMar>
+              <w:top w:type="dxa" w:w="60"/>
+              <w:left w:type="dxa" w:w="90"/>
+              <w:bottom w:type="dxa" w:w="60"/>
+              <w:right w:type="dxa" w:w="90"/>
+            </w:tcMar>
+          </w:tcPr>
+          <w:p>
+            <w:r>
+              <w:rPr>
+                <w:rFonts w:ascii="Arial" w:cs="Arial" w:eastAsia="Arial" w:hAnsi="Arial"/>
+                <w:b/>
+                <w:bCs/>
+                <w:color w:val="FFFFFF"/>
+                <w:sz w:val="17"/>
+                <w:szCs w:val="17"/>
+              </w:rPr>
+              <w:t xml:space="preserve">Peso</w:t>
+            </w:r>
+          </w:p>
+        </w:tc>
+        <w:tc>
+          <w:tcPr>
+            <w:tcW w:type="dxa" w:w="1600"/>
+            <w:tcBorders>
+              <w:top w:val="single" w:color="BFBFBF" w:sz="4"/>
+              <w:left w:val="single" w:color="BFBFBF" w:sz="4"/>
+              <w:bottom w:val="single" w:color="BFBFBF" w:sz="4"/>
+              <w:right w:val="single" w:color="BFBFBF" w:sz="4"/>
+            </w:tcBorders>
+            <w:shd w:fill="1F4E5A" w:color="auto" w:val="clear"/>
+            <w:tcMar>
+              <w:top w:type="dxa" w:w="60"/>
+              <w:left w:type="dxa" w:w="90"/>
+              <w:bottom w:type="dxa" w:w="60"/>
+              <w:right w:type="dxa" w:w="90"/>
+            </w:tcMar>
+          </w:tcPr>
+          <w:p>
+            <w:r>
+              <w:rPr>
+                <w:rFonts w:ascii="Arial" w:cs="Arial" w:eastAsia="Arial" w:hAnsi="Arial"/>
+                <w:b/>
+                <w:bCs/>
+                <w:color w:val="FFFFFF"/>
+                <w:sz w:val="17"/>
+                <w:szCs w:val="17"/>
+              </w:rPr>
+              <w:t xml:space="preserve">Puntos</w:t>
+            </w:r>
+          </w:p>
+        </w:tc>
+      </w:tr>
+      <w:tr>
+        <w:trPr>
+          <w:cantSplit/>
+        </w:trPr>
+        <w:tc>
+          <w:tcPr>
+            <w:tcW w:type="dxa" w:w="4560"/>
+            <w:tcBorders>
+              <w:top w:val="single" w:color="BFBFBF" w:sz="4"/>
+              <w:left w:val="single" w:color="BFBFBF" w:sz="4"/>
+              <w:bottom w:val="single" w:color="BFBFBF" w:sz="4"/>
+              <w:right w:val="single" w:color="BFBFBF" w:sz="4"/>
+            </w:tcBorders>
+            <w:tcMar>
+              <w:top w:type="dxa" w:w="60"/>
+              <w:left w:type="dxa" w:w="90"/>
+              <w:bottom w:type="dxa" w:w="60"/>
+              <w:right w:type="dxa" w:w="90"/>
+            </w:tcMar>
+          </w:tcPr>
+          <w:p>
+            <w:r>
+              <w:rPr>
+                <w:rFonts w:ascii="Arial" w:cs="Arial" w:eastAsia="Arial" w:hAnsi="Arial"/>
+                <w:b w:val="false"/>
+                <w:bCs w:val="false"/>
+                <w:sz w:val="17"/>
+                <w:szCs w:val="17"/>
+              </w:rPr>
+              <w:t xml:space="preserve">Impacto</w:t>
+            </w:r>
+          </w:p>
+        </w:tc>
+        <w:tc>
+          <w:tcPr>
+            <w:tcW w:type="dxa" w:w="1600"/>
+            <w:tcBorders>
+              <w:top w:val="single" w:color="BFBFBF" w:sz="4"/>
+              <w:left w:val="single" w:color="BFBFBF" w:sz="4"/>
+              <w:bottom w:val="single" w:color="BFBFBF" w:sz="4"/>
+              <w:right w:val="single" w:color="BFBFBF" w:sz="4"/>
+            </w:tcBorders>
+            <w:tcMar>
+              <w:top w:type="dxa" w:w="60"/>
+              <w:left w:type="dxa" w:w="90"/>
+              <w:bottom w:type="dxa" w:w="60"/>
+              <w:right w:type="dxa" w:w="90"/>
+            </w:tcMar>
+          </w:tcPr>
+          <w:p>
+            <w:r>
+              <w:rPr>
+                <w:rFonts w:ascii="Arial" w:cs="Arial" w:eastAsia="Arial" w:hAnsi="Arial"/>
+                <w:b w:val="false"/>
+                <w:bCs w:val="false"/>
+                <w:sz w:val="17"/>
+                <w:szCs w:val="17"/>
+              </w:rPr>
+              <w:t xml:space="preserve">3</w:t>
+            </w:r>
+          </w:p>
+        </w:tc>
+        <w:tc>
+          <w:tcPr>
+            <w:tcW w:type="dxa" w:w="1600"/>
+            <w:tcBorders>
+              <w:top w:val="single" w:color="BFBFBF" w:sz="4"/>
+              <w:left w:val="single" w:color="BFBFBF" w:sz="4"/>
+              <w:bottom w:val="single" w:color="BFBFBF" w:sz="4"/>
+              <w:right w:val="single" w:color="BFBFBF" w:sz="4"/>
+            </w:tcBorders>
+            <w:tcMar>
+              <w:top w:type="dxa" w:w="60"/>
+              <w:left w:type="dxa" w:w="90"/>
+              <w:bottom w:type="dxa" w:w="60"/>
+              <w:right w:type="dxa" w:w="90"/>
+            </w:tcMar>
+          </w:tcPr>
+          <w:p>
+            <w:r>
+              <w:rPr>
+                <w:rFonts w:ascii="Arial" w:cs="Arial" w:eastAsia="Arial" w:hAnsi="Arial"/>
+                <w:b w:val="false"/>
+                <w:bCs w:val="false"/>
+                <w:sz w:val="17"/>
+                <w:szCs w:val="17"/>
+              </w:rPr>
+              <w:t xml:space="preserve">x2</w:t>
+            </w:r>
+          </w:p>
+        </w:tc>
+        <w:tc>
+          <w:tcPr>
+            <w:tcW w:type="dxa" w:w="1600"/>
+            <w:tcBorders>
+              <w:top w:val="single" w:color="BFBFBF" w:sz="4"/>
+              <w:left w:val="single" w:color="BFBFBF" w:sz="4"/>
+              <w:bottom w:val="single" w:color="BFBFBF" w:sz="4"/>
+              <w:right w:val="single" w:color="BFBFBF" w:sz="4"/>
+            </w:tcBorders>
+            <w:tcMar>
+              <w:top w:type="dxa" w:w="60"/>
+              <w:left w:type="dxa" w:w="90"/>
+              <w:bottom w:type="dxa" w:w="60"/>
+              <w:right w:type="dxa" w:w="90"/>
+            </w:tcMar>
+          </w:tcPr>
+          <w:p>
+            <w:r>
+              <w:rPr>
+                <w:rFonts w:ascii="Arial" w:cs="Arial" w:eastAsia="Arial" w:hAnsi="Arial"/>
+                <w:b w:val="false"/>
+                <w:bCs w:val="false"/>
+                <w:sz w:val="17"/>
+                <w:szCs w:val="17"/>
+              </w:rPr>
+              <w:t xml:space="preserve">6</w:t>
+            </w:r>
+          </w:p>
+        </w:tc>
+      </w:tr>
+      <w:tr>
+        <w:trPr>
+          <w:cantSplit/>
+        </w:trPr>
+        <w:tc>
+          <w:tcPr>
+            <w:tcW w:type="dxa" w:w="4560"/>
+            <w:tcBorders>
+              <w:top w:val="single" w:color="BFBFBF" w:sz="4"/>
+              <w:left w:val="single" w:color="BFBFBF" w:sz="4"/>
+              <w:bottom w:val="single" w:color="BFBFBF" w:sz="4"/>
+              <w:right w:val="single" w:color="BFBFBF" w:sz="4"/>
+            </w:tcBorders>
+            <w:shd w:fill="F7F9FA" w:color="auto" w:val="clear"/>
+            <w:tcMar>
+              <w:top w:type="dxa" w:w="60"/>
+              <w:left w:type="dxa" w:w="90"/>
+              <w:bottom w:type="dxa" w:w="60"/>
+              <w:right w:type="dxa" w:w="90"/>
+            </w:tcMar>
+          </w:tcPr>
+          <w:p>
+            <w:r>
+              <w:rPr>
+                <w:rFonts w:ascii="Arial" w:cs="Arial" w:eastAsia="Arial" w:hAnsi="Arial"/>
+                <w:b w:val="false"/>
+                <w:bCs w:val="false"/>
+                <w:sz w:val="17"/>
+                <w:szCs w:val="17"/>
+              </w:rPr>
+              <w:t xml:space="preserve">Atención a población vulnerable</w:t>
+            </w:r>
+          </w:p>
+        </w:tc>
+        <w:tc>
+          <w:tcPr>
+            <w:tcW w:type="dxa" w:w="1600"/>
+            <w:tcBorders>
+              <w:top w:val="single" w:color="BFBFBF" w:sz="4"/>
+              <w:left w:val="single" w:color="BFBFBF" w:sz="4"/>
+              <w:bottom w:val="single" w:color="BFBFBF" w:sz="4"/>
+              <w:right w:val="single" w:color="BFBFBF" w:sz="4"/>
+            </w:tcBorders>
+            <w:shd w:fill="F7F9FA" w:color="auto" w:val="clear"/>
+            <w:tcMar>
+              <w:top w:type="dxa" w:w="60"/>
+              <w:left w:type="dxa" w:w="90"/>
+              <w:bottom w:type="dxa" w:w="60"/>
+              <w:right w:type="dxa" w:w="90"/>
+            </w:tcMar>
+          </w:tcPr>
+          <w:p>
+            <w:r>
+              <w:rPr>
+                <w:rFonts w:ascii="Arial" w:cs="Arial" w:eastAsia="Arial" w:hAnsi="Arial"/>
+                <w:b w:val="false"/>
+                <w:bCs w:val="false"/>
+                <w:sz w:val="17"/>
+                <w:szCs w:val="17"/>
+              </w:rPr>
+              <w:t xml:space="preserve">2</w:t>
+            </w:r>
+          </w:p>
+        </w:tc>
+        <w:tc>
+          <w:tcPr>
+            <w:tcW w:type="dxa" w:w="1600"/>
+            <w:tcBorders>
+              <w:top w:val="single" w:color="BFBFBF" w:sz="4"/>
+              <w:left w:val="single" w:color="BFBFBF" w:sz="4"/>
+              <w:bottom w:val="single" w:color="BFBFBF" w:sz="4"/>
+              <w:right w:val="single" w:color="BFBFBF" w:sz="4"/>
+            </w:tcBorders>
+            <w:shd w:fill="F7F9FA" w:color="auto" w:val="clear"/>
+            <w:tcMar>
+              <w:top w:type="dxa" w:w="60"/>
+              <w:left w:type="dxa" w:w="90"/>
+              <w:bottom w:type="dxa" w:w="60"/>
+              <w:right w:type="dxa" w:w="90"/>
+            </w:tcMar>
+          </w:tcPr>
+          <w:p>
+            <w:r>
+              <w:rPr>
+                <w:rFonts w:ascii="Arial" w:cs="Arial" w:eastAsia="Arial" w:hAnsi="Arial"/>
+                <w:b w:val="false"/>
+                <w:bCs w:val="false"/>
+                <w:sz w:val="17"/>
+                <w:szCs w:val="17"/>
+              </w:rPr>
+              <w:t xml:space="preserve">x2</w:t>
+            </w:r>
+          </w:p>
+        </w:tc>
+        <w:tc>
+          <w:tcPr>
+            <w:tcW w:type="dxa" w:w="1600"/>
+            <w:tcBorders>
+              <w:top w:val="single" w:color="BFBFBF" w:sz="4"/>
+              <w:left w:val="single" w:color="BFBFBF" w:sz="4"/>
+              <w:bottom w:val="single" w:color="BFBFBF" w:sz="4"/>
+              <w:right w:val="single" w:color="BFBFBF" w:sz="4"/>
+            </w:tcBorders>
+            <w:shd w:fill="F7F9FA" w:color="auto" w:val="clear"/>
+            <w:tcMar>
+              <w:top w:type="dxa" w:w="60"/>
+              <w:left w:type="dxa" w:w="90"/>
+              <w:bottom w:type="dxa" w:w="60"/>
+              <w:right w:type="dxa" w:w="90"/>
+            </w:tcMar>
+          </w:tcPr>
+          <w:p>
+            <w:r>
+              <w:rPr>
+                <w:rFonts w:ascii="Arial" w:cs="Arial" w:eastAsia="Arial" w:hAnsi="Arial"/>
+                <w:b w:val="false"/>
+                <w:bCs w:val="false"/>
+                <w:sz w:val="17"/>
+                <w:szCs w:val="17"/>
+              </w:rPr>
+              <w:t xml:space="preserve">4</w:t>
+            </w:r>
+          </w:p>
+        </w:tc>
+      </w:tr>
+      <w:tr>
+        <w:trPr>
+          <w:cantSplit/>
+        </w:trPr>
+        <w:tc>
+          <w:tcPr>
+            <w:tcW w:type="dxa" w:w="4560"/>
+            <w:tcBorders>
+              <w:top w:val="single" w:color="BFBFBF" w:sz="4"/>
+              <w:left w:val="single" w:color="BFBFBF" w:sz="4"/>
+              <w:bottom w:val="single" w:color="BFBFBF" w:sz="4"/>
+              <w:right w:val="single" w:color="BFBFBF" w:sz="4"/>
+            </w:tcBorders>
+            <w:tcMar>
+              <w:top w:type="dxa" w:w="60"/>
+              <w:left w:type="dxa" w:w="90"/>
+              <w:bottom w:type="dxa" w:w="60"/>
+              <w:right w:type="dxa" w:w="90"/>
+            </w:tcMar>
+          </w:tcPr>
+          <w:p>
+            <w:r>
+              <w:rPr>
+                <w:rFonts w:ascii="Arial" w:cs="Arial" w:eastAsia="Arial" w:hAnsi="Arial"/>
+                <w:b w:val="false"/>
+                <w:bCs w:val="false"/>
+                <w:sz w:val="17"/>
+                <w:szCs w:val="17"/>
+              </w:rPr>
+              <w:t xml:space="preserve">Factibilidad</w:t>
+            </w:r>
+          </w:p>
+        </w:tc>
+        <w:tc>
+          <w:tcPr>
+            <w:tcW w:type="dxa" w:w="1600"/>
+            <w:tcBorders>
+              <w:top w:val="single" w:color="BFBFBF" w:sz="4"/>
+              <w:left w:val="single" w:color="BFBFBF" w:sz="4"/>
+              <w:bottom w:val="single" w:color="BFBFBF" w:sz="4"/>
+              <w:right w:val="single" w:color="BFBFBF" w:sz="4"/>
+            </w:tcBorders>
+            <w:tcMar>
+              <w:top w:type="dxa" w:w="60"/>
+              <w:left w:type="dxa" w:w="90"/>
+              <w:bottom w:type="dxa" w:w="60"/>
+              <w:right w:type="dxa" w:w="90"/>
+            </w:tcMar>
+          </w:tcPr>
+          <w:p>
+            <w:r>
+              <w:rPr>
+                <w:rFonts w:ascii="Arial" w:cs="Arial" w:eastAsia="Arial" w:hAnsi="Arial"/>
+                <w:b w:val="false"/>
+                <w:bCs w:val="false"/>
+                <w:sz w:val="17"/>
+                <w:szCs w:val="17"/>
+              </w:rPr>
+              <w:t xml:space="preserve">3</w:t>
+            </w:r>
+          </w:p>
+        </w:tc>
+        <w:tc>
+          <w:tcPr>
+            <w:tcW w:type="dxa" w:w="1600"/>
+            <w:tcBorders>
+              <w:top w:val="single" w:color="BFBFBF" w:sz="4"/>
+              <w:left w:val="single" w:color="BFBFBF" w:sz="4"/>
+              <w:bottom w:val="single" w:color="BFBFBF" w:sz="4"/>
+              <w:right w:val="single" w:color="BFBFBF" w:sz="4"/>
+            </w:tcBorders>
+            <w:tcMar>
+              <w:top w:type="dxa" w:w="60"/>
+              <w:left w:type="dxa" w:w="90"/>
+              <w:bottom w:type="dxa" w:w="60"/>
+              <w:right w:type="dxa" w:w="90"/>
+            </w:tcMar>
+          </w:tcPr>
+          <w:p>
+            <w:r>
+              <w:rPr>
+                <w:rFonts w:ascii="Arial" w:cs="Arial" w:eastAsia="Arial" w:hAnsi="Arial"/>
+                <w:b w:val="false"/>
+                <w:bCs w:val="false"/>
+                <w:sz w:val="17"/>
+                <w:szCs w:val="17"/>
+              </w:rPr>
+              <w:t xml:space="preserve">x1</w:t>
+            </w:r>
+          </w:p>
+        </w:tc>
+        <w:tc>
+          <w:tcPr>
+            <w:tcW w:type="dxa" w:w="1600"/>
+            <w:tcBorders>
+              <w:top w:val="single" w:color="BFBFBF" w:sz="4"/>
+              <w:left w:val="single" w:color="BFBFBF" w:sz="4"/>
+              <w:bottom w:val="single" w:color="BFBFBF" w:sz="4"/>
+              <w:right w:val="single" w:color="BFBFBF" w:sz="4"/>
+            </w:tcBorders>
+            <w:tcMar>
+              <w:top w:type="dxa" w:w="60"/>
+              <w:left w:type="dxa" w:w="90"/>
+              <w:bottom w:type="dxa" w:w="60"/>
+              <w:right w:type="dxa" w:w="90"/>
+            </w:tcMar>
+          </w:tcPr>
+          <w:p>
+            <w:r>
+              <w:rPr>
+                <w:rFonts w:ascii="Arial" w:cs="Arial" w:eastAsia="Arial" w:hAnsi="Arial"/>
+                <w:b w:val="false"/>
+                <w:bCs w:val="false"/>
+                <w:sz w:val="17"/>
+                <w:szCs w:val="17"/>
+              </w:rPr>
+              <w:t xml:space="preserve">3</w:t>
+            </w:r>
+          </w:p>
+        </w:tc>
+      </w:tr>
+      <w:tr>
+        <w:trPr>
+          <w:cantSplit/>
+        </w:trPr>
+        <w:tc>
+          <w:tcPr>
+            <w:tcW w:type="dxa" w:w="4560"/>
+            <w:tcBorders>
+              <w:top w:val="single" w:color="BFBFBF" w:sz="4"/>
+              <w:left w:val="single" w:color="BFBFBF" w:sz="4"/>
+              <w:bottom w:val="single" w:color="BFBFBF" w:sz="4"/>
+              <w:right w:val="single" w:color="BFBFBF" w:sz="4"/>
+            </w:tcBorders>
+            <w:shd w:fill="F7F9FA" w:color="auto" w:val="clear"/>
+            <w:tcMar>
+              <w:top w:type="dxa" w:w="60"/>
+              <w:left w:type="dxa" w:w="90"/>
+              <w:bottom w:type="dxa" w:w="60"/>
+              <w:right w:type="dxa" w:w="90"/>
+            </w:tcMar>
+          </w:tcPr>
+          <w:p>
+            <w:r>
+              <w:rPr>
+                <w:rFonts w:ascii="Arial" w:cs="Arial" w:eastAsia="Arial" w:hAnsi="Arial"/>
+                <w:b w:val="false"/>
+                <w:bCs w:val="false"/>
+                <w:sz w:val="17"/>
+                <w:szCs w:val="17"/>
+              </w:rPr>
+              <w:t xml:space="preserve">Costo-efectividad</w:t>
+            </w:r>
+          </w:p>
+        </w:tc>
+        <w:tc>
+          <w:tcPr>
+            <w:tcW w:type="dxa" w:w="1600"/>
+            <w:tcBorders>
+              <w:top w:val="single" w:color="BFBFBF" w:sz="4"/>
+              <w:left w:val="single" w:color="BFBFBF" w:sz="4"/>
+              <w:bottom w:val="single" w:color="BFBFBF" w:sz="4"/>
+              <w:right w:val="single" w:color="BFBFBF" w:sz="4"/>
+            </w:tcBorders>
+            <w:shd w:fill="F7F9FA" w:color="auto" w:val="clear"/>
+            <w:tcMar>
+              <w:top w:type="dxa" w:w="60"/>
+              <w:left w:type="dxa" w:w="90"/>
+              <w:bottom w:type="dxa" w:w="60"/>
+              <w:right w:type="dxa" w:w="90"/>
+            </w:tcMar>
+          </w:tcPr>
+          <w:p>
+            <w:r>
+              <w:rPr>
+                <w:rFonts w:ascii="Arial" w:cs="Arial" w:eastAsia="Arial" w:hAnsi="Arial"/>
+                <w:b w:val="false"/>
+                <w:bCs w:val="false"/>
+                <w:sz w:val="17"/>
+                <w:szCs w:val="17"/>
+              </w:rPr>
+              <w:t xml:space="preserve">1</w:t>
+            </w:r>
+          </w:p>
+        </w:tc>
+        <w:tc>
+          <w:tcPr>
+            <w:tcW w:type="dxa" w:w="1600"/>
+            <w:tcBorders>
+              <w:top w:val="single" w:color="BFBFBF" w:sz="4"/>
+              <w:left w:val="single" w:color="BFBFBF" w:sz="4"/>
+              <w:bottom w:val="single" w:color="BFBFBF" w:sz="4"/>
+              <w:right w:val="single" w:color="BFBFBF" w:sz="4"/>
+            </w:tcBorders>
+            <w:shd w:fill="F7F9FA" w:color="auto" w:val="clear"/>
+            <w:tcMar>
+              <w:top w:type="dxa" w:w="60"/>
+              <w:left w:type="dxa" w:w="90"/>
+              <w:bottom w:type="dxa" w:w="60"/>
+              <w:right w:type="dxa" w:w="90"/>
+            </w:tcMar>
+          </w:tcPr>
+          <w:p>
+            <w:r>
+              <w:rPr>
+                <w:rFonts w:ascii="Arial" w:cs="Arial" w:eastAsia="Arial" w:hAnsi="Arial"/>
+                <w:b w:val="false"/>
+                <w:bCs w:val="false"/>
+                <w:sz w:val="17"/>
+                <w:szCs w:val="17"/>
+              </w:rPr>
+              <w:t xml:space="preserve">x1</w:t>
+            </w:r>
+          </w:p>
+        </w:tc>
+        <w:tc>
+          <w:tcPr>
+            <w:tcW w:type="dxa" w:w="1600"/>
+            <w:tcBorders>
+              <w:top w:val="single" w:color="BFBFBF" w:sz="4"/>
+              <w:left w:val="single" w:color="BFBFBF" w:sz="4"/>
+              <w:bottom w:val="single" w:color="BFBFBF" w:sz="4"/>
+              <w:right w:val="single" w:color="BFBFBF" w:sz="4"/>
+            </w:tcBorders>
+            <w:shd w:fill="F7F9FA" w:color="auto" w:val="clear"/>
+            <w:tcMar>
+              <w:top w:type="dxa" w:w="60"/>
+              <w:left w:type="dxa" w:w="90"/>
+              <w:bottom w:type="dxa" w:w="60"/>
+              <w:right w:type="dxa" w:w="90"/>
+            </w:tcMar>
+          </w:tcPr>
+          <w:p>
+            <w:r>
+              <w:rPr>
+                <w:rFonts w:ascii="Arial" w:cs="Arial" w:eastAsia="Arial" w:hAnsi="Arial"/>
+                <w:b w:val="false"/>
+                <w:bCs w:val="false"/>
+                <w:sz w:val="17"/>
+                <w:szCs w:val="17"/>
+              </w:rPr>
+              <w:t xml:space="preserve">1</w:t>
+            </w:r>
+          </w:p>
+        </w:tc>
+      </w:tr>
+      <w:tr>
+        <w:trPr>
+          <w:cantSplit/>
+        </w:trPr>
+        <w:tc>
+          <w:tcPr>
+            <w:tcW w:type="dxa" w:w="4560"/>
+            <w:tcBorders>
+              <w:top w:val="single" w:color="BFBFBF" w:sz="4"/>
+              <w:left w:val="single" w:color="BFBFBF" w:sz="4"/>
+              <w:bottom w:val="single" w:color="BFBFBF" w:sz="4"/>
+              <w:right w:val="single" w:color="BFBFBF" w:sz="4"/>
+            </w:tcBorders>
+            <w:tcMar>
+              <w:top w:type="dxa" w:w="60"/>
+              <w:left w:type="dxa" w:w="90"/>
+              <w:bottom w:type="dxa" w:w="60"/>
+              <w:right w:type="dxa" w:w="90"/>
+            </w:tcMar>
+          </w:tcPr>
+          <w:p>
+            <w:r>
+              <w:rPr>
+                <w:rFonts w:ascii="Arial" w:cs="Arial" w:eastAsia="Arial" w:hAnsi="Arial"/>
+                <w:b w:val="false"/>
+                <w:bCs w:val="false"/>
+                <w:sz w:val="17"/>
+                <w:szCs w:val="17"/>
+              </w:rPr>
+              <w:t xml:space="preserve">Sostenibilidad</w:t>
+            </w:r>
+          </w:p>
+        </w:tc>
+        <w:tc>
+          <w:tcPr>
+            <w:tcW w:type="dxa" w:w="1600"/>
+            <w:tcBorders>
+              <w:top w:val="single" w:color="BFBFBF" w:sz="4"/>
+              <w:left w:val="single" w:color="BFBFBF" w:sz="4"/>
+              <w:bottom w:val="single" w:color="BFBFBF" w:sz="4"/>
+              <w:right w:val="single" w:color="BFBFBF" w:sz="4"/>
+            </w:tcBorders>
+            <w:tcMar>
+              <w:top w:type="dxa" w:w="60"/>
+              <w:left w:type="dxa" w:w="90"/>
+              <w:bottom w:type="dxa" w:w="60"/>
+              <w:right w:type="dxa" w:w="90"/>
+            </w:tcMar>
+          </w:tcPr>
+          <w:p>
+            <w:r>
+              <w:rPr>
+                <w:rFonts w:ascii="Arial" w:cs="Arial" w:eastAsia="Arial" w:hAnsi="Arial"/>
+                <w:b w:val="false"/>
+                <w:bCs w:val="false"/>
+                <w:sz w:val="17"/>
+                <w:szCs w:val="17"/>
+              </w:rPr>
+              <w:t xml:space="preserve">1</w:t>
+            </w:r>
+          </w:p>
+        </w:tc>
+        <w:tc>
+          <w:tcPr>
+            <w:tcW w:type="dxa" w:w="1600"/>
+            <w:tcBorders>
+              <w:top w:val="single" w:color="BFBFBF" w:sz="4"/>
+              <w:left w:val="single" w:color="BFBFBF" w:sz="4"/>
+              <w:bottom w:val="single" w:color="BFBFBF" w:sz="4"/>
+              <w:right w:val="single" w:color="BFBFBF" w:sz="4"/>
+            </w:tcBorders>
+            <w:tcMar>
+              <w:top w:type="dxa" w:w="60"/>
+              <w:left w:type="dxa" w:w="90"/>
+              <w:bottom w:type="dxa" w:w="60"/>
+              <w:right w:type="dxa" w:w="90"/>
+            </w:tcMar>
+          </w:tcPr>
+          <w:p>
+            <w:r>
+              <w:rPr>
+                <w:rFonts w:ascii="Arial" w:cs="Arial" w:eastAsia="Arial" w:hAnsi="Arial"/>
+                <w:b w:val="false"/>
+                <w:bCs w:val="false"/>
+                <w:sz w:val="17"/>
+                <w:szCs w:val="17"/>
+              </w:rPr>
+              <w:t xml:space="preserve">x1</w:t>
+            </w:r>
+          </w:p>
+        </w:tc>
+        <w:tc>
+          <w:tcPr>
+            <w:tcW w:type="dxa" w:w="1600"/>
+            <w:tcBorders>
+              <w:top w:val="single" w:color="BFBFBF" w:sz="4"/>
+              <w:left w:val="single" w:color="BFBFBF" w:sz="4"/>
+              <w:bottom w:val="single" w:color="BFBFBF" w:sz="4"/>
+              <w:right w:val="single" w:color="BFBFBF" w:sz="4"/>
+            </w:tcBorders>
+            <w:tcMar>
+              <w:top w:type="dxa" w:w="60"/>
+              <w:left w:type="dxa" w:w="90"/>
+              <w:bottom w:type="dxa" w:w="60"/>
+              <w:right w:type="dxa" w:w="90"/>
+            </w:tcMar>
+          </w:tcPr>
+          <w:p>
+            <w:r>
+              <w:rPr>
+                <w:rFonts w:ascii="Arial" w:cs="Arial" w:eastAsia="Arial" w:hAnsi="Arial"/>
+                <w:b w:val="false"/>
+                <w:bCs w:val="false"/>
+                <w:sz w:val="17"/>
+                <w:szCs w:val="17"/>
+              </w:rPr>
+              <w:t xml:space="preserve">1</w:t>
+            </w:r>
+          </w:p>
+        </w:tc>
+      </w:tr>
+      <w:tr>
+        <w:trPr>
+          <w:cantSplit/>
+        </w:trPr>
+        <w:tc>
+          <w:tcPr>
+            <w:tcW w:type="dxa" w:w="4560"/>
+            <w:tcBorders>
+              <w:top w:val="single" w:color="BFBFBF" w:sz="4"/>
+              <w:left w:val="single" w:color="BFBFBF" w:sz="4"/>
+              <w:bottom w:val="single" w:color="BFBFBF" w:sz="4"/>
+              <w:right w:val="single" w:color="BFBFBF" w:sz="4"/>
+            </w:tcBorders>
+            <w:shd w:fill="F7F9FA" w:color="auto" w:val="clear"/>
+            <w:tcMar>
+              <w:top w:type="dxa" w:w="60"/>
+              <w:left w:type="dxa" w:w="90"/>
+              <w:bottom w:type="dxa" w:w="60"/>
+              <w:right w:type="dxa" w:w="90"/>
+            </w:tcMar>
+          </w:tcPr>
+          <w:p>
+            <w:r>
+              <w:rPr>
+                <w:rFonts w:ascii="Arial" w:cs="Arial" w:eastAsia="Arial" w:hAnsi="Arial"/>
+                <w:b w:val="false"/>
+                <w:bCs w:val="false"/>
+                <w:sz w:val="17"/>
+                <w:szCs w:val="17"/>
+              </w:rPr>
+              <w:t xml:space="preserve">Medición de resultados</w:t>
+            </w:r>
+          </w:p>
+        </w:tc>
+        <w:tc>
+          <w:tcPr>
+            <w:tcW w:type="dxa" w:w="1600"/>
+            <w:tcBorders>
+              <w:top w:val="single" w:color="BFBFBF" w:sz="4"/>
+              <w:left w:val="single" w:color="BFBFBF" w:sz="4"/>
+              <w:bottom w:val="single" w:color="BFBFBF" w:sz="4"/>
+              <w:right w:val="single" w:color="BFBFBF" w:sz="4"/>
+            </w:tcBorders>
+            <w:shd w:fill="F7F9FA" w:color="auto" w:val="clear"/>
+            <w:tcMar>
+              <w:top w:type="dxa" w:w="60"/>
+              <w:left w:type="dxa" w:w="90"/>
+              <w:bottom w:type="dxa" w:w="60"/>
+              <w:right w:type="dxa" w:w="90"/>
+            </w:tcMar>
+          </w:tcPr>
+          <w:p>
+            <w:r>
+              <w:rPr>
+                <w:rFonts w:ascii="Arial" w:cs="Arial" w:eastAsia="Arial" w:hAnsi="Arial"/>
+                <w:b w:val="false"/>
+                <w:bCs w:val="false"/>
+                <w:sz w:val="17"/>
+                <w:szCs w:val="17"/>
+              </w:rPr>
+              <w:t xml:space="preserve">2</w:t>
+            </w:r>
+          </w:p>
+        </w:tc>
+        <w:tc>
+          <w:tcPr>
+            <w:tcW w:type="dxa" w:w="1600"/>
+            <w:tcBorders>
+              <w:top w:val="single" w:color="BFBFBF" w:sz="4"/>
+              <w:left w:val="single" w:color="BFBFBF" w:sz="4"/>
+              <w:bottom w:val="single" w:color="BFBFBF" w:sz="4"/>
+              <w:right w:val="single" w:color="BFBFBF" w:sz="4"/>
+            </w:tcBorders>
+            <w:shd w:fill="F7F9FA" w:color="auto" w:val="clear"/>
+            <w:tcMar>
+              <w:top w:type="dxa" w:w="60"/>
+              <w:left w:type="dxa" w:w="90"/>
+              <w:bottom w:type="dxa" w:w="60"/>
+              <w:right w:type="dxa" w:w="90"/>
+            </w:tcMar>
+          </w:tcPr>
+          <w:p>
+            <w:r>
+              <w:rPr>
+                <w:rFonts w:ascii="Arial" w:cs="Arial" w:eastAsia="Arial" w:hAnsi="Arial"/>
+                <w:b w:val="false"/>
+                <w:bCs w:val="false"/>
+                <w:sz w:val="17"/>
+                <w:szCs w:val="17"/>
+              </w:rPr>
+              <w:t xml:space="preserve">x1</w:t>
+            </w:r>
+          </w:p>
+        </w:tc>
+        <w:tc>
+          <w:tcPr>
+            <w:tcW w:type="dxa" w:w="1600"/>
+            <w:tcBorders>
+              <w:top w:val="single" w:color="BFBFBF" w:sz="4"/>
+              <w:left w:val="single" w:color="BFBFBF" w:sz="4"/>
+              <w:bottom w:val="single" w:color="BFBFBF" w:sz="4"/>
+              <w:right w:val="single" w:color="BFBFBF" w:sz="4"/>
+            </w:tcBorders>
+            <w:shd w:fill="F7F9FA" w:color="auto" w:val="clear"/>
+            <w:tcMar>
+              <w:top w:type="dxa" w:w="60"/>
+              <w:left w:type="dxa" w:w="90"/>
+              <w:bottom w:type="dxa" w:w="60"/>
+              <w:right w:type="dxa" w:w="90"/>
+            </w:tcMar>
+          </w:tcPr>
+          <w:p>
+            <w:r>
+              <w:rPr>
+                <w:rFonts w:ascii="Arial" w:cs="Arial" w:eastAsia="Arial" w:hAnsi="Arial"/>
+                <w:b w:val="false"/>
+                <w:bCs w:val="false"/>
+                <w:sz w:val="17"/>
+                <w:szCs w:val="17"/>
+              </w:rPr>
+              <w:t xml:space="preserve">2</w:t>
+            </w:r>
+          </w:p>
+        </w:tc>
+      </w:tr>
+      <w:tr>
+        <w:trPr>
+          <w:cantSplit/>
+        </w:trPr>
+        <w:tc>
+          <w:tcPr>
+            <w:tcW w:type="dxa" w:w="4560"/>
+            <w:tcBorders>
+              <w:top w:val="single" w:color="BFBFBF" w:sz="4"/>
+              <w:left w:val="single" w:color="BFBFBF" w:sz="4"/>
+              <w:bottom w:val="single" w:color="BFBFBF" w:sz="4"/>
+              <w:right w:val="single" w:color="BFBFBF" w:sz="4"/>
+            </w:tcBorders>
+            <w:tcMar>
+              <w:top w:type="dxa" w:w="60"/>
+              <w:left w:type="dxa" w:w="90"/>
+              <w:bottom w:type="dxa" w:w="60"/>
+              <w:right w:type="dxa" w:w="90"/>
+            </w:tcMar>
+          </w:tcPr>
+          <w:p>
+            <w:r>
+              <w:rPr>
+                <w:rFonts w:ascii="Arial" w:cs="Arial" w:eastAsia="Arial" w:hAnsi="Arial"/>
+                <w:b w:val="false"/>
+                <w:bCs w:val="false"/>
+                <w:sz w:val="17"/>
+                <w:szCs w:val="17"/>
+              </w:rPr>
+              <w:t xml:space="preserve">Participación e inclusión</w:t>
+            </w:r>
+          </w:p>
+        </w:tc>
+        <w:tc>
+          <w:tcPr>
+            <w:tcW w:type="dxa" w:w="1600"/>
+            <w:tcBorders>
+              <w:top w:val="single" w:color="BFBFBF" w:sz="4"/>
+              <w:left w:val="single" w:color="BFBFBF" w:sz="4"/>
+              <w:bottom w:val="single" w:color="BFBFBF" w:sz="4"/>
+              <w:right w:val="single" w:color="BFBFBF" w:sz="4"/>
+            </w:tcBorders>
+            <w:tcMar>
+              <w:top w:type="dxa" w:w="60"/>
+              <w:left w:type="dxa" w:w="90"/>
+              <w:bottom w:type="dxa" w:w="60"/>
+              <w:right w:type="dxa" w:w="90"/>
+            </w:tcMar>
+          </w:tcPr>
+          <w:p>
+            <w:r>
+              <w:rPr>
+                <w:rFonts w:ascii="Arial" w:cs="Arial" w:eastAsia="Arial" w:hAnsi="Arial"/>
+                <w:b w:val="false"/>
+                <w:bCs w:val="false"/>
+                <w:sz w:val="17"/>
+                <w:szCs w:val="17"/>
+              </w:rPr>
+              <w:t xml:space="preserve">2</w:t>
+            </w:r>
+          </w:p>
+        </w:tc>
+        <w:tc>
+          <w:tcPr>
+            <w:tcW w:type="dxa" w:w="1600"/>
+            <w:tcBorders>
+              <w:top w:val="single" w:color="BFBFBF" w:sz="4"/>
+              <w:left w:val="single" w:color="BFBFBF" w:sz="4"/>
+              <w:bottom w:val="single" w:color="BFBFBF" w:sz="4"/>
+              <w:right w:val="single" w:color="BFBFBF" w:sz="4"/>
+            </w:tcBorders>
+            <w:tcMar>
+              <w:top w:type="dxa" w:w="60"/>
+              <w:left w:type="dxa" w:w="90"/>
+              <w:bottom w:type="dxa" w:w="60"/>
+              <w:right w:type="dxa" w:w="90"/>
+            </w:tcMar>
+          </w:tcPr>
+          <w:p>
+            <w:r>
+              <w:rPr>
+                <w:rFonts w:ascii="Arial" w:cs="Arial" w:eastAsia="Arial" w:hAnsi="Arial"/>
+                <w:b w:val="false"/>
+                <w:bCs w:val="false"/>
+                <w:sz w:val="17"/>
+                <w:szCs w:val="17"/>
+              </w:rPr>
+              <w:t xml:space="preserve">x1</w:t>
+            </w:r>
+          </w:p>
+        </w:tc>
+        <w:tc>
+          <w:tcPr>
+            <w:tcW w:type="dxa" w:w="1600"/>
+            <w:tcBorders>
+              <w:top w:val="single" w:color="BFBFBF" w:sz="4"/>
+              <w:left w:val="single" w:color="BFBFBF" w:sz="4"/>
+              <w:bottom w:val="single" w:color="BFBFBF" w:sz="4"/>
+              <w:right w:val="single" w:color="BFBFBF" w:sz="4"/>
+            </w:tcBorders>
+            <w:tcMar>
+              <w:top w:type="dxa" w:w="60"/>
+              <w:left w:type="dxa" w:w="90"/>
+              <w:bottom w:type="dxa" w:w="60"/>
+              <w:right w:type="dxa" w:w="90"/>
+            </w:tcMar>
+          </w:tcPr>
+          <w:p>
+            <w:r>
+              <w:rPr>
+                <w:rFonts w:ascii="Arial" w:cs="Arial" w:eastAsia="Arial" w:hAnsi="Arial"/>
+                <w:b w:val="false"/>
+                <w:bCs w:val="false"/>
+                <w:sz w:val="17"/>
+                <w:szCs w:val="17"/>
+              </w:rPr>
+              <w:t xml:space="preserve">2</w:t>
+            </w:r>
+          </w:p>
+        </w:tc>
+      </w:tr>
+      <w:tr>
+        <w:trPr>
+          <w:cantSplit/>
+        </w:trPr>
+        <w:tc>
+          <w:tcPr>
+            <w:tcW w:type="dxa" w:w="4560"/>
+            <w:tcBorders>
+              <w:top w:val="single" w:color="BFBFBF" w:sz="4"/>
+              <w:left w:val="single" w:color="BFBFBF" w:sz="4"/>
+              <w:bottom w:val="single" w:color="BFBFBF" w:sz="4"/>
+              <w:right w:val="single" w:color="BFBFBF" w:sz="4"/>
+            </w:tcBorders>
+            <w:shd w:fill="F7F9FA" w:color="auto" w:val="clear"/>
+            <w:tcMar>
+              <w:top w:type="dxa" w:w="60"/>
+              <w:left w:type="dxa" w:w="90"/>
+              <w:bottom w:type="dxa" w:w="60"/>
+              <w:right w:type="dxa" w:w="90"/>
+            </w:tcMar>
+          </w:tcPr>
+          <w:p>
+            <w:r>
+              <w:rPr>
+                <w:rFonts w:ascii="Arial" w:cs="Arial" w:eastAsia="Arial" w:hAnsi="Arial"/>
+                <w:b w:val="false"/>
+                <w:bCs w:val="false"/>
+                <w:sz w:val="17"/>
+                <w:szCs w:val="17"/>
+              </w:rPr>
+              <w:t xml:space="preserve">Alianzas</w:t>
+            </w:r>
+          </w:p>
+        </w:tc>
+        <w:tc>
+          <w:tcPr>
+            <w:tcW w:type="dxa" w:w="1600"/>
+            <w:tcBorders>
+              <w:top w:val="single" w:color="BFBFBF" w:sz="4"/>
+              <w:left w:val="single" w:color="BFBFBF" w:sz="4"/>
+              <w:bottom w:val="single" w:color="BFBFBF" w:sz="4"/>
+              <w:right w:val="single" w:color="BFBFBF" w:sz="4"/>
+            </w:tcBorders>
+            <w:shd w:fill="F7F9FA" w:color="auto" w:val="clear"/>
+            <w:tcMar>
+              <w:top w:type="dxa" w:w="60"/>
+              <w:left w:type="dxa" w:w="90"/>
+              <w:bottom w:type="dxa" w:w="60"/>
+              <w:right w:type="dxa" w:w="90"/>
+            </w:tcMar>
+          </w:tcPr>
+          <w:p>
+            <w:r>
+              <w:rPr>
+                <w:rFonts w:ascii="Arial" w:cs="Arial" w:eastAsia="Arial" w:hAnsi="Arial"/>
+                <w:b w:val="false"/>
+                <w:bCs w:val="false"/>
+                <w:sz w:val="17"/>
+                <w:szCs w:val="17"/>
+              </w:rPr>
+              <w:t xml:space="preserve">1</w:t>
+            </w:r>
+          </w:p>
+        </w:tc>
+        <w:tc>
+          <w:tcPr>
+            <w:tcW w:type="dxa" w:w="1600"/>
+            <w:tcBorders>
+              <w:top w:val="single" w:color="BFBFBF" w:sz="4"/>
+              <w:left w:val="single" w:color="BFBFBF" w:sz="4"/>
+              <w:bottom w:val="single" w:color="BFBFBF" w:sz="4"/>
+              <w:right w:val="single" w:color="BFBFBF" w:sz="4"/>
+            </w:tcBorders>
+            <w:shd w:fill="F7F9FA" w:color="auto" w:val="clear"/>
+            <w:tcMar>
+              <w:top w:type="dxa" w:w="60"/>
+              <w:left w:type="dxa" w:w="90"/>
+              <w:bottom w:type="dxa" w:w="60"/>
+              <w:right w:type="dxa" w:w="90"/>
+            </w:tcMar>
+          </w:tcPr>
+          <w:p>
+            <w:r>
+              <w:rPr>
+                <w:rFonts w:ascii="Arial" w:cs="Arial" w:eastAsia="Arial" w:hAnsi="Arial"/>
+                <w:b w:val="false"/>
+                <w:bCs w:val="false"/>
+                <w:sz w:val="17"/>
+                <w:szCs w:val="17"/>
+              </w:rPr>
+              <w:t xml:space="preserve">x1</w:t>
+            </w:r>
+          </w:p>
+        </w:tc>
+        <w:tc>
+          <w:tcPr>
+            <w:tcW w:type="dxa" w:w="1600"/>
+            <w:tcBorders>
+              <w:top w:val="single" w:color="BFBFBF" w:sz="4"/>
+              <w:left w:val="single" w:color="BFBFBF" w:sz="4"/>
+              <w:bottom w:val="single" w:color="BFBFBF" w:sz="4"/>
+              <w:right w:val="single" w:color="BFBFBF" w:sz="4"/>
+            </w:tcBorders>
+            <w:shd w:fill="F7F9FA" w:color="auto" w:val="clear"/>
+            <w:tcMar>
+              <w:top w:type="dxa" w:w="60"/>
+              <w:left w:type="dxa" w:w="90"/>
+              <w:bottom w:type="dxa" w:w="60"/>
+              <w:right w:type="dxa" w:w="90"/>
+            </w:tcMar>
+          </w:tcPr>
+          <w:p>
+            <w:r>
+              <w:rPr>
+                <w:rFonts w:ascii="Arial" w:cs="Arial" w:eastAsia="Arial" w:hAnsi="Arial"/>
+                <w:b w:val="false"/>
+                <w:bCs w:val="false"/>
+                <w:sz w:val="17"/>
+                <w:szCs w:val="17"/>
+              </w:rPr>
+              <w:t xml:space="preserve">1</w:t>
+            </w:r>
+          </w:p>
+        </w:tc>
+      </w:tr>
+      <w:tr>
+        <w:trPr>
+          <w:cantSplit/>
+        </w:trPr>
+        <w:tc>
+          <w:tcPr>
+            <w:tcW w:type="dxa" w:w="4560"/>
+            <w:tcBorders>
+              <w:top w:val="single" w:color="BFBFBF" w:sz="4"/>
+              <w:left w:val="single" w:color="BFBFBF" w:sz="4"/>
+              <w:bottom w:val="single" w:color="BFBFBF" w:sz="4"/>
+              <w:right w:val="single" w:color="BFBFBF" w:sz="4"/>
+            </w:tcBorders>
+            <w:shd w:fill="EAF1F4" w:color="auto" w:val="clear"/>
+            <w:tcMar>
+              <w:top w:type="dxa" w:w="60"/>
+              <w:left w:type="dxa" w:w="90"/>
+              <w:bottom w:type="dxa" w:w="60"/>
+              <w:right w:type="dxa" w:w="90"/>
+            </w:tcMar>
+          </w:tcPr>
+          <w:p>
+            <w:r>
+              <w:rPr>
+                <w:rFonts w:ascii="Arial" w:cs="Arial" w:eastAsia="Arial" w:hAnsi="Arial"/>
+                <w:b/>
+                <w:bCs/>
+                <w:sz w:val="17"/>
+                <w:szCs w:val="17"/>
+              </w:rPr>
+              <w:t xml:space="preserve">Total</w:t>
+            </w:r>
+          </w:p>
+        </w:tc>
+        <w:tc>
+          <w:tcPr>
+            <w:tcW w:type="dxa" w:w="1600"/>
+            <w:tcBorders>
+              <w:top w:val="single" w:color="BFBFBF" w:sz="4"/>
+              <w:left w:val="single" w:color="BFBFBF" w:sz="4"/>
+              <w:bottom w:val="single" w:color="BFBFBF" w:sz="4"/>
+              <w:right w:val="single" w:color="BFBFBF" w:sz="4"/>
+            </w:tcBorders>
+            <w:shd w:fill="EAF1F4" w:color="auto" w:val="clear"/>
+            <w:tcMar>
+              <w:top w:type="dxa" w:w="60"/>
+              <w:left w:type="dxa" w:w="90"/>
+              <w:bottom w:type="dxa" w:w="60"/>
+              <w:right w:type="dxa" w:w="90"/>
+            </w:tcMar>
+          </w:tcPr>
+          <w:p>
+            <w:r>
+              <w:rPr>
+                <w:rFonts w:ascii="Arial" w:cs="Arial" w:eastAsia="Arial" w:hAnsi="Arial"/>
+                <w:b/>
+                <w:bCs/>
+                <w:sz w:val="17"/>
+                <w:szCs w:val="17"/>
+              </w:rPr>
+              <w:t xml:space="preserve"/>
+            </w:r>
+          </w:p>
+        </w:tc>
+        <w:tc>
+          <w:tcPr>
+            <w:tcW w:type="dxa" w:w="1600"/>
+            <w:tcBorders>
+              <w:top w:val="single" w:color="BFBFBF" w:sz="4"/>
+              <w:left w:val="single" w:color="BFBFBF" w:sz="4"/>
+              <w:bottom w:val="single" w:color="BFBFBF" w:sz="4"/>
+              <w:right w:val="single" w:color="BFBFBF" w:sz="4"/>
+            </w:tcBorders>
+            <w:shd w:fill="EAF1F4" w:color="auto" w:val="clear"/>
+            <w:tcMar>
+              <w:top w:type="dxa" w:w="60"/>
+              <w:left w:type="dxa" w:w="90"/>
+              <w:bottom w:type="dxa" w:w="60"/>
+              <w:right w:type="dxa" w:w="90"/>
+            </w:tcMar>
+          </w:tcPr>
+          <w:p>
+            <w:r>
+              <w:rPr>
+                <w:rFonts w:ascii="Arial" w:cs="Arial" w:eastAsia="Arial" w:hAnsi="Arial"/>
+                <w:b/>
+                <w:bCs/>
+                <w:sz w:val="17"/>
+                <w:szCs w:val="17"/>
+              </w:rPr>
+              <w:t xml:space="preserve"/>
+            </w:r>
+          </w:p>
+        </w:tc>
+        <w:tc>
+          <w:tcPr>
+            <w:tcW w:type="dxa" w:w="1600"/>
+            <w:tcBorders>
+              <w:top w:val="single" w:color="BFBFBF" w:sz="4"/>
+              <w:left w:val="single" w:color="BFBFBF" w:sz="4"/>
+              <w:bottom w:val="single" w:color="BFBFBF" w:sz="4"/>
+              <w:right w:val="single" w:color="BFBFBF" w:sz="4"/>
+            </w:tcBorders>
+            <w:shd w:fill="EAF1F4" w:color="auto" w:val="clear"/>
+            <w:tcMar>
+              <w:top w:type="dxa" w:w="60"/>
+              <w:left w:type="dxa" w:w="90"/>
+              <w:bottom w:type="dxa" w:w="60"/>
+              <w:right w:type="dxa" w:w="90"/>
+            </w:tcMar>
+          </w:tcPr>
+          <w:p>
+            <w:r>
+              <w:rPr>
+                <w:rFonts w:ascii="Arial" w:cs="Arial" w:eastAsia="Arial" w:hAnsi="Arial"/>
+                <w:b/>
+                <w:bCs/>
+                <w:sz w:val="17"/>
+                <w:szCs w:val="17"/>
+              </w:rPr>
+              <w:t xml:space="preserve">20 de 30</w:t>
+            </w:r>
+          </w:p>
+        </w:tc>
+      </w:tr>
+    </w:tbl>
+    <w:p>
+      <w:pPr>
+        <w:spacing w:after="120"/>
+      </w:pPr>
+      <w:r>
+        <w:rPr>
+          <w:rFonts w:ascii="Arial" w:cs="Arial" w:eastAsia="Arial" w:hAnsi="Arial"/>
+          <w:i/>
+          <w:iCs/>
+          <w:sz w:val="21"/>
+          <w:szCs w:val="21"/>
+        </w:rPr>
+        <w:t xml:space="preserve">Resultado: 20 puntos, prioridad Media y candidato a fortalecimiento (buen impacto, pero 1 en Costo-efectividad y Sostenibilidad). El Comité podría financiarlo por etapas: la primera, para un estudio financiero y un acuerdo de mantenimiento; la obra, cuando eso esté listo.</w:t>
+      </w:r>
+    </w:p>
+    <w:p>
+      <w:pPr>
         <w:pStyle w:val="Heading1"/>
       </w:pPr>
       <w:r>
@@ -7081,6 +9086,69 @@
                 <w:sz w:val="17"/>
                 <w:szCs w:val="17"/>
               </w:rPr>
+              <w:t xml:space="preserve">Criterios de elegibilidad de proyectos (apoyos no financieros)</w:t>
+            </w:r>
+          </w:p>
+        </w:tc>
+        <w:tc>
+          <w:tcPr>
+            <w:tcW w:type="dxa" w:w="6160"/>
+            <w:tcBorders>
+              <w:top w:val="single" w:color="BFBFBF" w:sz="4"/>
+              <w:left w:val="single" w:color="BFBFBF" w:sz="4"/>
+              <w:bottom w:val="single" w:color="BFBFBF" w:sz="4"/>
+              <w:right w:val="single" w:color="BFBFBF" w:sz="4"/>
+            </w:tcBorders>
+            <w:shd w:fill="F7F9FA" w:color="auto" w:val="clear"/>
+            <w:tcMar>
+              <w:top w:type="dxa" w:w="60"/>
+              <w:left w:type="dxa" w:w="90"/>
+              <w:bottom w:type="dxa" w:w="60"/>
+              <w:right w:type="dxa" w:w="90"/>
+            </w:tcMar>
+          </w:tcPr>
+          <w:p>
+            <w:r>
+              <w:rPr>
+                <w:rFonts w:ascii="Arial" w:cs="Arial" w:eastAsia="Arial" w:hAnsi="Arial"/>
+                <w:sz w:val="17"/>
+                <w:szCs w:val="17"/>
+              </w:rPr>
+              <w:t xml:space="preserve">Base de las opciones de fortalecimiento: asesoría, asistencia técnica, estudios y vinculación.</w:t>
+            </w:r>
+          </w:p>
+        </w:tc>
+      </w:tr>
+      <w:tr>
+        <w:trPr>
+          <w:cantSplit/>
+        </w:trPr>
+        <w:tc>
+          <w:tcPr>
+            <w:tcW w:type="dxa" w:w="3200"/>
+            <w:tcBorders>
+              <w:top w:val="single" w:color="BFBFBF" w:sz="4"/>
+              <w:left w:val="single" w:color="BFBFBF" w:sz="4"/>
+              <w:bottom w:val="single" w:color="BFBFBF" w:sz="4"/>
+              <w:right w:val="single" w:color="BFBFBF" w:sz="4"/>
+            </w:tcBorders>
+            <w:shd w:fill="EAF1F4" w:color="auto" w:val="clear"/>
+            <w:tcMar>
+              <w:top w:type="dxa" w:w="60"/>
+              <w:left w:type="dxa" w:w="90"/>
+              <w:bottom w:type="dxa" w:w="60"/>
+              <w:right w:type="dxa" w:w="90"/>
+            </w:tcMar>
+          </w:tcPr>
+          <w:p>
+            <w:r>
+              <w:rPr>
+                <w:rFonts w:ascii="Arial" w:cs="Arial" w:eastAsia="Arial" w:hAnsi="Arial"/>
+                <w:b/>
+                <w:bCs/>
+                <w:sz w:val="17"/>
+                <w:szCs w:val="17"/>
+              </w:rPr>
               <w:t xml:space="preserve">Sistema de Priorización de SbN (Forest Trends, 2026)</w:t>
             </w:r>
           </w:p>
@@ -7094,7 +9162,6 @@
               <w:bottom w:val="single" w:color="BFBFBF" w:sz="4"/>
               <w:right w:val="single" w:color="BFBFBF" w:sz="4"/>
             </w:tcBorders>
-            <w:shd w:fill="F7F9FA" w:color="auto" w:val="clear"/>
             <w:tcMar>
               <w:top w:type="dxa" w:w="60"/>
               <w:left w:type="dxa" w:w="90"/>

</xml_diff>

<commit_message>
Clarify roles and add who-does-what diagram to selection guide
Co-Authored-By: Claude Opus 5.5 <noreply@anthropic.com>
Claude-Session: https://claude.ai/code/session_01VHwNN6RfVzTYVCS9bRLUAz
</commit_message>
<xml_diff>
--- a/entregables/Guia_seleccion_proyectos_FEAC_BCS.docx
+++ b/entregables/Guia_seleccion_proyectos_FEAC_BCS.docx
@@ -3960,7 +3960,615 @@
         <w:rPr>
           <w:rFonts w:ascii="Arial" w:cs="Arial" w:eastAsia="Arial" w:hAnsi="Arial"/>
         </w:rPr>
-        <w:t xml:space="preserve">Paso 3. Ordenar y decidir</w:t>
+        <w:t xml:space="preserve">Paso 3. Ordenar y decidir: quién hace qué</w:t>
+      </w:r>
+    </w:p>
+    <w:p>
+      <w:pPr>
+        <w:spacing w:after="120"/>
+      </w:pPr>
+      <w:r>
+        <w:rPr>
+          <w:rFonts w:ascii="Arial" w:cs="Arial" w:eastAsia="Arial" w:hAnsi="Arial"/>
+          <w:sz w:val="21"/>
+          <w:szCs w:val="21"/>
+        </w:rPr>
+        <w:t xml:space="preserve">En el proceso participan tres instancias: la Secretaría Técnica opera, el Comité de Evaluación y Seguimiento califica y da seguimiento, y el Comité Técnico decide. Ninguna sustituye a otra.</w:t>
+      </w:r>
+    </w:p>
+    <w:p>
+      <w:pPr>
+        <w:pStyle w:val="Heading2"/>
+      </w:pPr>
+      <w:r>
+        <w:rPr>
+          <w:rFonts w:ascii="Arial" w:cs="Arial" w:eastAsia="Arial" w:hAnsi="Arial"/>
+        </w:rPr>
+        <w:t xml:space="preserve">Las tres instancias y de dónde salen</w:t>
+      </w:r>
+    </w:p>
+    <w:tbl>
+      <w:tblPr>
+        <w:tblW w:type="dxa" w:w="9360"/>
+        <w:tblBorders>
+          <w:top w:val="single" w:color="auto" w:sz="4"/>
+          <w:left w:val="single" w:color="auto" w:sz="4"/>
+          <w:bottom w:val="single" w:color="auto" w:sz="4"/>
+          <w:right w:val="single" w:color="auto" w:sz="4"/>
+          <w:insideH w:val="single" w:color="auto" w:sz="4"/>
+          <w:insideV w:val="single" w:color="auto" w:sz="4"/>
+        </w:tblBorders>
+      </w:tblPr>
+      <w:tblGrid>
+        <w:gridCol w:w="1700"/>
+        <w:gridCol w:w="2500"/>
+        <w:gridCol w:w="2560"/>
+        <w:gridCol w:w="2600"/>
+      </w:tblGrid>
+      <w:tr>
+        <w:trPr>
+          <w:tblHeader/>
+        </w:trPr>
+        <w:tc>
+          <w:tcPr>
+            <w:tcW w:type="dxa" w:w="1700"/>
+            <w:tcBorders>
+              <w:top w:val="single" w:color="BFBFBF" w:sz="4"/>
+              <w:left w:val="single" w:color="BFBFBF" w:sz="4"/>
+              <w:bottom w:val="single" w:color="BFBFBF" w:sz="4"/>
+              <w:right w:val="single" w:color="BFBFBF" w:sz="4"/>
+            </w:tcBorders>
+            <w:shd w:fill="1F4E5A" w:color="auto" w:val="clear"/>
+            <w:tcMar>
+              <w:top w:type="dxa" w:w="60"/>
+              <w:left w:type="dxa" w:w="90"/>
+              <w:bottom w:type="dxa" w:w="60"/>
+              <w:right w:type="dxa" w:w="90"/>
+            </w:tcMar>
+          </w:tcPr>
+          <w:p>
+            <w:r>
+              <w:rPr>
+                <w:rFonts w:ascii="Arial" w:cs="Arial" w:eastAsia="Arial" w:hAnsi="Arial"/>
+                <w:b/>
+                <w:bCs/>
+                <w:color w:val="FFFFFF"/>
+                <w:sz w:val="16"/>
+                <w:szCs w:val="16"/>
+              </w:rPr>
+              <w:t xml:space="preserve">Instancia</w:t>
+            </w:r>
+          </w:p>
+        </w:tc>
+        <w:tc>
+          <w:tcPr>
+            <w:tcW w:type="dxa" w:w="2500"/>
+            <w:tcBorders>
+              <w:top w:val="single" w:color="BFBFBF" w:sz="4"/>
+              <w:left w:val="single" w:color="BFBFBF" w:sz="4"/>
+              <w:bottom w:val="single" w:color="BFBFBF" w:sz="4"/>
+              <w:right w:val="single" w:color="BFBFBF" w:sz="4"/>
+            </w:tcBorders>
+            <w:shd w:fill="1F4E5A" w:color="auto" w:val="clear"/>
+            <w:tcMar>
+              <w:top w:type="dxa" w:w="60"/>
+              <w:left w:type="dxa" w:w="90"/>
+              <w:bottom w:type="dxa" w:w="60"/>
+              <w:right w:type="dxa" w:w="90"/>
+            </w:tcMar>
+          </w:tcPr>
+          <w:p>
+            <w:r>
+              <w:rPr>
+                <w:rFonts w:ascii="Arial" w:cs="Arial" w:eastAsia="Arial" w:hAnsi="Arial"/>
+                <w:b/>
+                <w:bCs/>
+                <w:color w:val="FFFFFF"/>
+                <w:sz w:val="16"/>
+                <w:szCs w:val="16"/>
+              </w:rPr>
+              <w:t xml:space="preserve">De dónde sale</w:t>
+            </w:r>
+          </w:p>
+        </w:tc>
+        <w:tc>
+          <w:tcPr>
+            <w:tcW w:type="dxa" w:w="2560"/>
+            <w:tcBorders>
+              <w:top w:val="single" w:color="BFBFBF" w:sz="4"/>
+              <w:left w:val="single" w:color="BFBFBF" w:sz="4"/>
+              <w:bottom w:val="single" w:color="BFBFBF" w:sz="4"/>
+              <w:right w:val="single" w:color="BFBFBF" w:sz="4"/>
+            </w:tcBorders>
+            <w:shd w:fill="1F4E5A" w:color="auto" w:val="clear"/>
+            <w:tcMar>
+              <w:top w:type="dxa" w:w="60"/>
+              <w:left w:type="dxa" w:w="90"/>
+              <w:bottom w:type="dxa" w:w="60"/>
+              <w:right w:type="dxa" w:w="90"/>
+            </w:tcMar>
+          </w:tcPr>
+          <w:p>
+            <w:r>
+              <w:rPr>
+                <w:rFonts w:ascii="Arial" w:cs="Arial" w:eastAsia="Arial" w:hAnsi="Arial"/>
+                <w:b/>
+                <w:bCs/>
+                <w:color w:val="FFFFFF"/>
+                <w:sz w:val="16"/>
+                <w:szCs w:val="16"/>
+              </w:rPr>
+              <w:t xml:space="preserve">Quién la integra</w:t>
+            </w:r>
+          </w:p>
+        </w:tc>
+        <w:tc>
+          <w:tcPr>
+            <w:tcW w:type="dxa" w:w="2600"/>
+            <w:tcBorders>
+              <w:top w:val="single" w:color="BFBFBF" w:sz="4"/>
+              <w:left w:val="single" w:color="BFBFBF" w:sz="4"/>
+              <w:bottom w:val="single" w:color="BFBFBF" w:sz="4"/>
+              <w:right w:val="single" w:color="BFBFBF" w:sz="4"/>
+            </w:tcBorders>
+            <w:shd w:fill="1F4E5A" w:color="auto" w:val="clear"/>
+            <w:tcMar>
+              <w:top w:type="dxa" w:w="60"/>
+              <w:left w:type="dxa" w:w="90"/>
+              <w:bottom w:type="dxa" w:w="60"/>
+              <w:right w:type="dxa" w:w="90"/>
+            </w:tcMar>
+          </w:tcPr>
+          <w:p>
+            <w:r>
+              <w:rPr>
+                <w:rFonts w:ascii="Arial" w:cs="Arial" w:eastAsia="Arial" w:hAnsi="Arial"/>
+                <w:b/>
+                <w:bCs/>
+                <w:color w:val="FFFFFF"/>
+                <w:sz w:val="16"/>
+                <w:szCs w:val="16"/>
+              </w:rPr>
+              <w:t xml:space="preserve">Qué hace en el proceso</w:t>
+            </w:r>
+          </w:p>
+        </w:tc>
+      </w:tr>
+      <w:tr>
+        <w:trPr>
+          <w:cantSplit/>
+        </w:trPr>
+        <w:tc>
+          <w:tcPr>
+            <w:tcW w:type="dxa" w:w="1700"/>
+            <w:tcBorders>
+              <w:top w:val="single" w:color="BFBFBF" w:sz="4"/>
+              <w:left w:val="single" w:color="BFBFBF" w:sz="4"/>
+              <w:bottom w:val="single" w:color="BFBFBF" w:sz="4"/>
+              <w:right w:val="single" w:color="BFBFBF" w:sz="4"/>
+            </w:tcBorders>
+            <w:shd w:fill="EAF1F4" w:color="auto" w:val="clear"/>
+            <w:tcMar>
+              <w:top w:type="dxa" w:w="60"/>
+              <w:left w:type="dxa" w:w="90"/>
+              <w:bottom w:type="dxa" w:w="60"/>
+              <w:right w:type="dxa" w:w="90"/>
+            </w:tcMar>
+          </w:tcPr>
+          <w:p>
+            <w:r>
+              <w:rPr>
+                <w:rFonts w:ascii="Arial" w:cs="Arial" w:eastAsia="Arial" w:hAnsi="Arial"/>
+                <w:b/>
+                <w:bCs/>
+                <w:sz w:val="16"/>
+                <w:szCs w:val="16"/>
+              </w:rPr>
+              <w:t xml:space="preserve">Comité Técnico</w:t>
+            </w:r>
+          </w:p>
+        </w:tc>
+        <w:tc>
+          <w:tcPr>
+            <w:tcW w:type="dxa" w:w="2500"/>
+            <w:tcBorders>
+              <w:top w:val="single" w:color="BFBFBF" w:sz="4"/>
+              <w:left w:val="single" w:color="BFBFBF" w:sz="4"/>
+              <w:bottom w:val="single" w:color="BFBFBF" w:sz="4"/>
+              <w:right w:val="single" w:color="BFBFBF" w:sz="4"/>
+            </w:tcBorders>
+            <w:tcMar>
+              <w:top w:type="dxa" w:w="60"/>
+              <w:left w:type="dxa" w:w="90"/>
+              <w:bottom w:type="dxa" w:w="60"/>
+              <w:right w:type="dxa" w:w="90"/>
+            </w:tcMar>
+          </w:tcPr>
+          <w:p>
+            <w:r>
+              <w:rPr>
+                <w:rFonts w:ascii="Arial" w:cs="Arial" w:eastAsia="Arial" w:hAnsi="Arial"/>
+                <w:sz w:val="16"/>
+                <w:szCs w:val="16"/>
+              </w:rPr>
+              <w:t xml:space="preserve">Decreto del Fondo, arts. 6, 7 y 9. Es la máxima autoridad del fideicomiso.</w:t>
+            </w:r>
+          </w:p>
+        </w:tc>
+        <w:tc>
+          <w:tcPr>
+            <w:tcW w:type="dxa" w:w="2560"/>
+            <w:tcBorders>
+              <w:top w:val="single" w:color="BFBFBF" w:sz="4"/>
+              <w:left w:val="single" w:color="BFBFBF" w:sz="4"/>
+              <w:bottom w:val="single" w:color="BFBFBF" w:sz="4"/>
+              <w:right w:val="single" w:color="BFBFBF" w:sz="4"/>
+            </w:tcBorders>
+            <w:tcMar>
+              <w:top w:type="dxa" w:w="60"/>
+              <w:left w:type="dxa" w:w="90"/>
+              <w:bottom w:type="dxa" w:w="60"/>
+              <w:right w:type="dxa" w:w="90"/>
+            </w:tcMar>
+          </w:tcPr>
+          <w:p>
+            <w:r>
+              <w:rPr>
+                <w:rFonts w:ascii="Arial" w:cs="Arial" w:eastAsia="Arial" w:hAnsi="Arial"/>
+                <w:sz w:val="16"/>
+                <w:szCs w:val="16"/>
+              </w:rPr>
+              <w:t xml:space="preserve">Titular del Ejecutivo (preside); secretarías de Finanzas y Administración, de Pesca, Acuacultura y Desarrollo Agropecuario, y de Turismo y Economía; vocales académico, de sociedad civil, dos empresariales y uno de derechos humanos e inclusión. Sesiona al menos 4 veces al año (art. 13).</w:t>
+            </w:r>
+          </w:p>
+        </w:tc>
+        <w:tc>
+          <w:tcPr>
+            <w:tcW w:type="dxa" w:w="2600"/>
+            <w:tcBorders>
+              <w:top w:val="single" w:color="BFBFBF" w:sz="4"/>
+              <w:left w:val="single" w:color="BFBFBF" w:sz="4"/>
+              <w:bottom w:val="single" w:color="BFBFBF" w:sz="4"/>
+              <w:right w:val="single" w:color="BFBFBF" w:sz="4"/>
+            </w:tcBorders>
+            <w:tcMar>
+              <w:top w:type="dxa" w:w="60"/>
+              <w:left w:type="dxa" w:w="90"/>
+              <w:bottom w:type="dxa" w:w="60"/>
+              <w:right w:type="dxa" w:w="90"/>
+            </w:tcMar>
+          </w:tcPr>
+          <w:p>
+            <w:r>
+              <w:rPr>
+                <w:rFonts w:ascii="Arial" w:cs="Arial" w:eastAsia="Arial" w:hAnsi="Arial"/>
+                <w:sz w:val="16"/>
+                <w:szCs w:val="16"/>
+              </w:rPr>
+              <w:t xml:space="preserve">Aprueba la convocatoria, los montos y esta guía; decide qué proyectos se financian, con qué monto, en qué condiciones y con qué fortalecimiento (art. 9, fr. III); puede modificar, suspender o revocar apoyos (fr. IV).</w:t>
+            </w:r>
+          </w:p>
+        </w:tc>
+      </w:tr>
+      <w:tr>
+        <w:trPr>
+          <w:cantSplit/>
+        </w:trPr>
+        <w:tc>
+          <w:tcPr>
+            <w:tcW w:type="dxa" w:w="1700"/>
+            <w:tcBorders>
+              <w:top w:val="single" w:color="BFBFBF" w:sz="4"/>
+              <w:left w:val="single" w:color="BFBFBF" w:sz="4"/>
+              <w:bottom w:val="single" w:color="BFBFBF" w:sz="4"/>
+              <w:right w:val="single" w:color="BFBFBF" w:sz="4"/>
+            </w:tcBorders>
+            <w:shd w:fill="EAF1F4" w:color="auto" w:val="clear"/>
+            <w:tcMar>
+              <w:top w:type="dxa" w:w="60"/>
+              <w:left w:type="dxa" w:w="90"/>
+              <w:bottom w:type="dxa" w:w="60"/>
+              <w:right w:type="dxa" w:w="90"/>
+            </w:tcMar>
+          </w:tcPr>
+          <w:p>
+            <w:r>
+              <w:rPr>
+                <w:rFonts w:ascii="Arial" w:cs="Arial" w:eastAsia="Arial" w:hAnsi="Arial"/>
+                <w:b/>
+                <w:bCs/>
+                <w:sz w:val="16"/>
+                <w:szCs w:val="16"/>
+              </w:rPr>
+              <w:t xml:space="preserve">Comité de Evaluación y Seguimiento</w:t>
+            </w:r>
+          </w:p>
+        </w:tc>
+        <w:tc>
+          <w:tcPr>
+            <w:tcW w:type="dxa" w:w="2500"/>
+            <w:tcBorders>
+              <w:top w:val="single" w:color="BFBFBF" w:sz="4"/>
+              <w:left w:val="single" w:color="BFBFBF" w:sz="4"/>
+              <w:bottom w:val="single" w:color="BFBFBF" w:sz="4"/>
+              <w:right w:val="single" w:color="BFBFBF" w:sz="4"/>
+            </w:tcBorders>
+            <w:shd w:fill="F7F9FA" w:color="auto" w:val="clear"/>
+            <w:tcMar>
+              <w:top w:type="dxa" w:w="60"/>
+              <w:left w:type="dxa" w:w="90"/>
+              <w:bottom w:type="dxa" w:w="60"/>
+              <w:right w:type="dxa" w:w="90"/>
+            </w:tcMar>
+          </w:tcPr>
+          <w:p>
+            <w:r>
+              <w:rPr>
+                <w:rFonts w:ascii="Arial" w:cs="Arial" w:eastAsia="Arial" w:hAnsi="Arial"/>
+                <w:sz w:val="16"/>
+                <w:szCs w:val="16"/>
+              </w:rPr>
+              <w:t xml:space="preserve">Lo propone el documento de criterios de elegibilidad. En el Decreto es un subcomité técnico especializado que crea el Comité Técnico para evaluar proyectos (arts. 9, fr. XI, y 14).</w:t>
+            </w:r>
+          </w:p>
+        </w:tc>
+        <w:tc>
+          <w:tcPr>
+            <w:tcW w:type="dxa" w:w="2560"/>
+            <w:tcBorders>
+              <w:top w:val="single" w:color="BFBFBF" w:sz="4"/>
+              <w:left w:val="single" w:color="BFBFBF" w:sz="4"/>
+              <w:bottom w:val="single" w:color="BFBFBF" w:sz="4"/>
+              <w:right w:val="single" w:color="BFBFBF" w:sz="4"/>
+            </w:tcBorders>
+            <w:shd w:fill="F7F9FA" w:color="auto" w:val="clear"/>
+            <w:tcMar>
+              <w:top w:type="dxa" w:w="60"/>
+              <w:left w:type="dxa" w:w="90"/>
+              <w:bottom w:type="dxa" w:w="60"/>
+              <w:right w:type="dxa" w:w="90"/>
+            </w:tcMar>
+          </w:tcPr>
+          <w:p>
+            <w:r>
+              <w:rPr>
+                <w:rFonts w:ascii="Arial" w:cs="Arial" w:eastAsia="Arial" w:hAnsi="Arial"/>
+                <w:sz w:val="16"/>
+                <w:szCs w:val="16"/>
+              </w:rPr>
+              <w:t xml:space="preserve">Lo definen las Reglas de Operación (art. 14). Se sugieren especialistas en los temas del Fondo, internos y externos, sin conflicto de interés.</w:t>
+            </w:r>
+          </w:p>
+        </w:tc>
+        <w:tc>
+          <w:tcPr>
+            <w:tcW w:type="dxa" w:w="2600"/>
+            <w:tcBorders>
+              <w:top w:val="single" w:color="BFBFBF" w:sz="4"/>
+              <w:left w:val="single" w:color="BFBFBF" w:sz="4"/>
+              <w:bottom w:val="single" w:color="BFBFBF" w:sz="4"/>
+              <w:right w:val="single" w:color="BFBFBF" w:sz="4"/>
+            </w:tcBorders>
+            <w:shd w:fill="F7F9FA" w:color="auto" w:val="clear"/>
+            <w:tcMar>
+              <w:top w:type="dxa" w:w="60"/>
+              <w:left w:type="dxa" w:w="90"/>
+              <w:bottom w:type="dxa" w:w="60"/>
+              <w:right w:type="dxa" w:w="90"/>
+            </w:tcMar>
+          </w:tcPr>
+          <w:p>
+            <w:r>
+              <w:rPr>
+                <w:rFonts w:ascii="Arial" w:cs="Arial" w:eastAsia="Arial" w:hAnsi="Arial"/>
+                <w:sz w:val="16"/>
+                <w:szCs w:val="16"/>
+              </w:rPr>
+              <w:t xml:space="preserve">Califica los 8 criterios; propone el orden y qué proyectos fortalecer; durante la ejecución revisa informes e indicadores.</w:t>
+            </w:r>
+          </w:p>
+        </w:tc>
+      </w:tr>
+      <w:tr>
+        <w:trPr>
+          <w:cantSplit/>
+        </w:trPr>
+        <w:tc>
+          <w:tcPr>
+            <w:tcW w:type="dxa" w:w="1700"/>
+            <w:tcBorders>
+              <w:top w:val="single" w:color="BFBFBF" w:sz="4"/>
+              <w:left w:val="single" w:color="BFBFBF" w:sz="4"/>
+              <w:bottom w:val="single" w:color="BFBFBF" w:sz="4"/>
+              <w:right w:val="single" w:color="BFBFBF" w:sz="4"/>
+            </w:tcBorders>
+            <w:shd w:fill="EAF1F4" w:color="auto" w:val="clear"/>
+            <w:tcMar>
+              <w:top w:type="dxa" w:w="60"/>
+              <w:left w:type="dxa" w:w="90"/>
+              <w:bottom w:type="dxa" w:w="60"/>
+              <w:right w:type="dxa" w:w="90"/>
+            </w:tcMar>
+          </w:tcPr>
+          <w:p>
+            <w:r>
+              <w:rPr>
+                <w:rFonts w:ascii="Arial" w:cs="Arial" w:eastAsia="Arial" w:hAnsi="Arial"/>
+                <w:b/>
+                <w:bCs/>
+                <w:sz w:val="16"/>
+                <w:szCs w:val="16"/>
+              </w:rPr>
+              <w:t xml:space="preserve">Secretaría Técnica</w:t>
+            </w:r>
+          </w:p>
+        </w:tc>
+        <w:tc>
+          <w:tcPr>
+            <w:tcW w:type="dxa" w:w="2500"/>
+            <w:tcBorders>
+              <w:top w:val="single" w:color="BFBFBF" w:sz="4"/>
+              <w:left w:val="single" w:color="BFBFBF" w:sz="4"/>
+              <w:bottom w:val="single" w:color="BFBFBF" w:sz="4"/>
+              <w:right w:val="single" w:color="BFBFBF" w:sz="4"/>
+            </w:tcBorders>
+            <w:tcMar>
+              <w:top w:type="dxa" w:w="60"/>
+              <w:left w:type="dxa" w:w="90"/>
+              <w:bottom w:type="dxa" w:w="60"/>
+              <w:right w:type="dxa" w:w="90"/>
+            </w:tcMar>
+          </w:tcPr>
+          <w:p>
+            <w:r>
+              <w:rPr>
+                <w:rFonts w:ascii="Arial" w:cs="Arial" w:eastAsia="Arial" w:hAnsi="Arial"/>
+                <w:sz w:val="16"/>
+                <w:szCs w:val="16"/>
+              </w:rPr>
+              <w:t xml:space="preserve">Decreto del Fondo, arts. 7 y 12. Es la instancia de apoyo técnico-administrativo del Comité Técnico.</w:t>
+            </w:r>
+          </w:p>
+        </w:tc>
+        <w:tc>
+          <w:tcPr>
+            <w:tcW w:type="dxa" w:w="2560"/>
+            <w:tcBorders>
+              <w:top w:val="single" w:color="BFBFBF" w:sz="4"/>
+              <w:left w:val="single" w:color="BFBFBF" w:sz="4"/>
+              <w:bottom w:val="single" w:color="BFBFBF" w:sz="4"/>
+              <w:right w:val="single" w:color="BFBFBF" w:sz="4"/>
+            </w:tcBorders>
+            <w:tcMar>
+              <w:top w:type="dxa" w:w="60"/>
+              <w:left w:type="dxa" w:w="90"/>
+              <w:bottom w:type="dxa" w:w="60"/>
+              <w:right w:type="dxa" w:w="90"/>
+            </w:tcMar>
+          </w:tcPr>
+          <w:p>
+            <w:r>
+              <w:rPr>
+                <w:rFonts w:ascii="Arial" w:cs="Arial" w:eastAsia="Arial" w:hAnsi="Arial"/>
+                <w:sz w:val="16"/>
+                <w:szCs w:val="16"/>
+              </w:rPr>
+              <w:t xml:space="preserve">Una persona propuesta por la Presidencia del Comité Técnico y aprobada por este; participa con voz pero sin voto.</w:t>
+            </w:r>
+          </w:p>
+        </w:tc>
+        <w:tc>
+          <w:tcPr>
+            <w:tcW w:type="dxa" w:w="2600"/>
+            <w:tcBorders>
+              <w:top w:val="single" w:color="BFBFBF" w:sz="4"/>
+              <w:left w:val="single" w:color="BFBFBF" w:sz="4"/>
+              <w:bottom w:val="single" w:color="BFBFBF" w:sz="4"/>
+              <w:right w:val="single" w:color="BFBFBF" w:sz="4"/>
+            </w:tcBorders>
+            <w:tcMar>
+              <w:top w:type="dxa" w:w="60"/>
+              <w:left w:type="dxa" w:w="90"/>
+              <w:bottom w:type="dxa" w:w="60"/>
+              <w:right w:type="dxa" w:w="90"/>
+            </w:tcMar>
+          </w:tcPr>
+          <w:p>
+            <w:r>
+              <w:rPr>
+                <w:rFonts w:ascii="Arial" w:cs="Arial" w:eastAsia="Arial" w:hAnsi="Arial"/>
+                <w:sz w:val="16"/>
+                <w:szCs w:val="16"/>
+              </w:rPr>
+              <w:t xml:space="preserve">Publica la convocatoria y recibe propuestas; revisa los 6 requisitos mínimos; integra expedientes para la sesión (art. 12, fr. V); prepara convenios; coordina la supervisión técnica y financiera (fr. VII) y reporta cada trimestre (art. 16).</w:t>
+            </w:r>
+          </w:p>
+        </w:tc>
+      </w:tr>
+    </w:tbl>
+    <w:p>
+      <w:pPr>
+        <w:pStyle w:val="Heading2"/>
+      </w:pPr>
+      <w:r>
+        <w:rPr>
+          <w:rFonts w:ascii="Arial" w:cs="Arial" w:eastAsia="Arial" w:hAnsi="Arial"/>
+        </w:rPr>
+        <w:t xml:space="preserve">Quién hace qué en cada momento</w:t>
+      </w:r>
+    </w:p>
+    <w:p>
+      <w:pPr>
+        <w:spacing w:after="80" w:before="120"/>
+        <w:jc w:val="center"/>
+      </w:pPr>
+      <w:r>
+        <w:drawing>
+          <wp:inline distT="0" distB="0" distL="0" distR="0">
+            <wp:extent cx="5715000" cy="5238750"/>
+            <wp:effectExtent t="0" r="0" b="0" l="0"/>
+            <wp:docPr id="1" name="carriles" descr="Diagrama de carriles con las tres instancias y los siete momentos del proceso" title="Quién hace qué"/>
+            <wp:cNvGraphicFramePr>
+              <a:graphicFrameLocks xmlns:a="http://schemas.openxmlformats.org/drawingml/2006/main" noChangeAspect="1"/>
+            </wp:cNvGraphicFramePr>
+            <a:graphic xmlns:a="http://schemas.openxmlformats.org/drawingml/2006/main">
+              <a:graphicData uri="http://schemas.openxmlformats.org/drawingml/2006/picture">
+                <pic:pic xmlns:pic="http://schemas.openxmlformats.org/drawingml/2006/picture">
+                  <pic:nvPicPr>
+                    <pic:cNvPr id="0" name="" descr=""/>
+                    <pic:cNvPicPr>
+                      <a:picLocks noChangeAspect="1" noChangeArrowheads="1"/>
+                    </pic:cNvPicPr>
+                  </pic:nvPicPr>
+                  <pic:blipFill>
+                    <a:blip r:embed="rId8" cstate="none"/>
+                    <a:srcRect/>
+                    <a:stretch>
+                      <a:fillRect/>
+                    </a:stretch>
+                  </pic:blipFill>
+                  <pic:spPr bwMode="auto">
+                    <a:xfrm>
+                      <a:off x="0" y="0"/>
+                      <a:ext cx="5715000" cy="5238750"/>
+                    </a:xfrm>
+                    <a:prstGeom prst="rect">
+                      <a:avLst/>
+                    </a:prstGeom>
+                  </pic:spPr>
+                </pic:pic>
+              </a:graphicData>
+            </a:graphic>
+          </wp:inline>
+        </w:drawing>
+      </w:r>
+    </w:p>
+    <w:p>
+      <w:pPr>
+        <w:spacing w:after="120"/>
+        <w:jc w:val="center"/>
+      </w:pPr>
+      <w:r>
+        <w:rPr>
+          <w:rFonts w:ascii="Arial" w:cs="Arial" w:eastAsia="Arial" w:hAnsi="Arial"/>
+          <w:i/>
+          <w:iCs/>
+          <w:color w:val="595959"/>
+          <w:sz w:val="18"/>
+          <w:szCs w:val="18"/>
+        </w:rPr>
+        <w:t xml:space="preserve">Cada fila es un momento del proceso, de arriba abajo; cada columna, una instancia. Los recuadros dicen qué hace cada una en ese momento.</w:t>
+      </w:r>
+    </w:p>
+    <w:p>
+      <w:pPr>
+        <w:pStyle w:val="Heading2"/>
+      </w:pPr>
+      <w:r>
+        <w:rPr>
+          <w:rFonts w:ascii="Arial" w:cs="Arial" w:eastAsia="Arial" w:hAnsi="Arial"/>
+        </w:rPr>
+        <w:t xml:space="preserve">Reglas para ordenar y decidir</w:t>
       </w:r>
     </w:p>
     <w:p>
@@ -3980,7 +4588,7 @@
           <w:sz w:val="21"/>
           <w:szCs w:val="21"/>
         </w:rPr>
-        <w:t xml:space="preserve">Ordenar: </w:t>
+        <w:t xml:space="preserve">Orden: </w:t>
       </w:r>
       <w:r>
         <w:rPr>
@@ -4008,7 +4616,7 @@
           <w:sz w:val="21"/>
           <w:szCs w:val="21"/>
         </w:rPr>
-        <w:t xml:space="preserve">Quién hace qué: </w:t>
+        <w:t xml:space="preserve">Calificación: </w:t>
       </w:r>
       <w:r>
         <w:rPr>
@@ -4016,7 +4624,7 @@
           <w:sz w:val="21"/>
           <w:szCs w:val="21"/>
         </w:rPr>
-        <w:t xml:space="preserve">la Secretaría Técnica revisa los requisitos mínimos; el Comité de Evaluación y Seguimiento califica los criterios; el Comité Técnico decide qué se financia, con qué monto y en qué condiciones.</w:t>
+        <w:t xml:space="preserve">dos evaluadores del Comité de Evaluación califican cada proyecto por separado; si difieren en más de un punto en un criterio, lo discuten y anotan el acuerdo. Quien tenga conflicto de interés con un proyecto no lo evalúa.</w:t>
       </w:r>
     </w:p>
     <w:p>
@@ -4036,7 +4644,7 @@
           <w:sz w:val="21"/>
           <w:szCs w:val="21"/>
         </w:rPr>
-        <w:t xml:space="preserve">Cómo se califica: </w:t>
+        <w:t xml:space="preserve">Decisión: </w:t>
       </w:r>
       <w:r>
         <w:rPr>
@@ -4044,7 +4652,7 @@
           <w:sz w:val="21"/>
           <w:szCs w:val="21"/>
         </w:rPr>
-        <w:t xml:space="preserve">dos evaluadores califican cada proyecto por separado; si difieren en más de un punto en un criterio, lo discuten y anotan el acuerdo. Quien tenga conflicto de interés con un proyecto no lo evalúa.</w:t>
+        <w:t xml:space="preserve">el Comité Técnico usa el orden de puntos, el presupuesto y el equilibrio entre temas y regiones. Si se aparta del orden, lo justifica por escrito. Para cada candidato a fortalecimiento elige la opción (apoyo no financiero, etapas o condiciones) y la deja por escrito con plazos.</w:t>
       </w:r>
     </w:p>
     <w:p>
@@ -4064,7 +4672,7 @@
           <w:sz w:val="21"/>
           <w:szCs w:val="21"/>
         </w:rPr>
-        <w:t xml:space="preserve">Cómo se decide: </w:t>
+        <w:t xml:space="preserve">Pago: </w:t>
       </w:r>
       <w:r>
         <w:rPr>
@@ -4072,7 +4680,7 @@
           <w:sz w:val="21"/>
           <w:szCs w:val="21"/>
         </w:rPr>
-        <w:t xml:space="preserve">el orden de puntos guía la decisión, junto con el presupuesto disponible y el equilibrio entre temas y regiones. Si el Comité se aparta del orden, lo justifica por escrito.</w:t>
+        <w:t xml:space="preserve">la Presidencia del Comité Técnico instruye los pagos aprobados a la institución fiduciaria (art. 11, fr. III); el dinero se entrega por etapas contra resultados.</w:t>
       </w:r>
     </w:p>
     <w:p>
@@ -4092,7 +4700,7 @@
           <w:sz w:val="21"/>
           <w:szCs w:val="21"/>
         </w:rPr>
-        <w:t xml:space="preserve">Candidatos a fortalecimiento: </w:t>
+        <w:t xml:space="preserve">Transparencia: </w:t>
       </w:r>
       <w:r>
         <w:rPr>
@@ -4100,35 +4708,23 @@
           <w:sz w:val="21"/>
           <w:szCs w:val="21"/>
         </w:rPr>
-        <w:t xml:space="preserve">el Comité decide para cada uno qué opción aplica (apoyo no financiero, financiamiento por etapas o aprobación con condiciones) y lo deja por escrito con plazos.</w:t>
+        <w:t xml:space="preserve">los proyectos aprobados, montos y beneficiarios se publican (art. 17).</w:t>
       </w:r>
     </w:p>
     <w:p>
       <w:pPr>
-        <w:pStyle w:val="ListParagraph"/>
-        <w:numPr>
-          <w:ilvl w:val="0"/>
-          <w:numId w:val="3"/>
-        </w:numPr>
-        <w:spacing w:after="80"/>
+        <w:spacing w:after="120"/>
       </w:pPr>
       <w:r>
         <w:rPr>
           <w:rFonts w:ascii="Arial" w:cs="Arial" w:eastAsia="Arial" w:hAnsi="Arial"/>
-          <w:b/>
-          <w:bCs/>
-          <w:sz w:val="21"/>
-          <w:szCs w:val="21"/>
+          <w:i/>
+          <w:iCs/>
+          <w:color w:val="8A4B00"/>
+          <w:sz w:val="19"/>
+          <w:szCs w:val="19"/>
         </w:rPr>
-        <w:t xml:space="preserve">Después: </w:t>
-      </w:r>
-      <w:r>
-        <w:rPr>
-          <w:rFonts w:ascii="Arial" w:cs="Arial" w:eastAsia="Arial" w:hAnsi="Arial"/>
-          <w:sz w:val="21"/>
-          <w:szCs w:val="21"/>
-        </w:rPr>
-        <w:t xml:space="preserve">se firma el convenio, el dinero se entrega por etapas contra resultados y el Comité de Evaluación y Seguimiento revisa los informes técnicos y financieros y los indicadores. Los resultados se publican.</w:t>
+        <w:t xml:space="preserve">Pendiente: las Reglas de Operación del Fondo deben definir quién integra el Comité de Evaluación y Seguimiento y cómo funciona (art. 14 del Decreto).</w:t>
       </w:r>
     </w:p>
     <w:p>

</xml_diff>

<commit_message>
Add scope note and technical quality safeguards to selection guide
Mandatory justification per score, evaluator calibration and per-theme
technical sheets prepared by the evaluation committee.

Co-Authored-By: Claude Opus 5.5 <noreply@anthropic.com>
Claude-Session: https://claude.ai/code/session_01VHwNN6RfVzTYVCS9bRLUAz
</commit_message>
<xml_diff>
--- a/entregables/Guia_seleccion_proyectos_FEAC_BCS.docx
+++ b/entregables/Guia_seleccion_proyectos_FEAC_BCS.docx
@@ -154,6 +154,158 @@
           <w:szCs w:val="21"/>
         </w:rPr>
         <w:t xml:space="preserve">Se ordenan los proyectos por puntos y el Comité Técnico decide según el presupuesto. A los proyectos con potencial que necesitan mejorar, el Fondo puede ayudar a fortalecerlos.</w:t>
+      </w:r>
+    </w:p>
+    <w:p>
+      <w:pPr>
+        <w:pStyle w:val="Heading2"/>
+      </w:pPr>
+      <w:r>
+        <w:rPr>
+          <w:rFonts w:ascii="Arial" w:cs="Arial" w:eastAsia="Arial" w:hAnsi="Arial"/>
+        </w:rPr>
+        <w:t xml:space="preserve">Alcance de esta guía</w:t>
+      </w:r>
+    </w:p>
+    <w:p>
+      <w:pPr>
+        <w:spacing w:after="120"/>
+      </w:pPr>
+      <w:r>
+        <w:rPr>
+          <w:rFonts w:ascii="Arial" w:cs="Arial" w:eastAsia="Arial" w:hAnsi="Arial"/>
+          <w:sz w:val="21"/>
+          <w:szCs w:val="21"/>
+        </w:rPr>
+        <w:t xml:space="preserve">Esta guía es el marco general del Fondo para sus 16 temas. No es un manual técnico de cada tema: detallar qué es un buen proyecto de agua, energía, residuos o biodiversidad haría la guía inmanejable y la volvería obsoleta pronto. Por eso la valoración técnica, sobre todo la del impacto, se apoya en el criterio de evaluadores especialistas en cada tema. Para que ese criterio sea riguroso, consistente y verificable, la guía lo acompaña con cuatro salvaguardas.</w:t>
+      </w:r>
+    </w:p>
+    <w:p>
+      <w:pPr>
+        <w:pStyle w:val="ListParagraph"/>
+        <w:numPr>
+          <w:ilvl w:val="0"/>
+          <w:numId w:val="3"/>
+        </w:numPr>
+        <w:spacing w:after="80"/>
+      </w:pPr>
+      <w:r>
+        <w:rPr>
+          <w:rFonts w:ascii="Arial" w:cs="Arial" w:eastAsia="Arial" w:hAnsi="Arial"/>
+          <w:b/>
+          <w:bCs/>
+          <w:sz w:val="21"/>
+          <w:szCs w:val="21"/>
+        </w:rPr>
+        <w:t xml:space="preserve">Rúbricas comunes: </w:t>
+      </w:r>
+      <w:r>
+        <w:rPr>
+          <w:rFonts w:ascii="Arial" w:cs="Arial" w:eastAsia="Arial" w:hAnsi="Arial"/>
+          <w:sz w:val="21"/>
+          <w:szCs w:val="21"/>
+        </w:rPr>
+        <w:t xml:space="preserve">Todos los evaluadores califican con los mismos criterios y las mismas descripciones de cada nivel (Paso 2).</w:t>
+      </w:r>
+    </w:p>
+    <w:p>
+      <w:pPr>
+        <w:pStyle w:val="ListParagraph"/>
+        <w:numPr>
+          <w:ilvl w:val="0"/>
+          <w:numId w:val="3"/>
+        </w:numPr>
+        <w:spacing w:after="80"/>
+      </w:pPr>
+      <w:r>
+        <w:rPr>
+          <w:rFonts w:ascii="Arial" w:cs="Arial" w:eastAsia="Arial" w:hAnsi="Arial"/>
+          <w:b/>
+          <w:bCs/>
+          <w:sz w:val="21"/>
+          <w:szCs w:val="21"/>
+        </w:rPr>
+        <w:t xml:space="preserve">Justificación obligatoria: </w:t>
+      </w:r>
+      <w:r>
+        <w:rPr>
+          <w:rFonts w:ascii="Arial" w:cs="Arial" w:eastAsia="Arial" w:hAnsi="Arial"/>
+          <w:sz w:val="21"/>
+          <w:szCs w:val="21"/>
+        </w:rPr>
+        <w:t xml:space="preserve">Cada calificación se acompaña de una línea que dice qué evidencia la sostiene. Sin justificación, la calificación no es válida. Esto hace revisable la decisión ante auditorías o inconformidades.</w:t>
+      </w:r>
+    </w:p>
+    <w:p>
+      <w:pPr>
+        <w:pStyle w:val="ListParagraph"/>
+        <w:numPr>
+          <w:ilvl w:val="0"/>
+          <w:numId w:val="3"/>
+        </w:numPr>
+        <w:spacing w:after="80"/>
+      </w:pPr>
+      <w:r>
+        <w:rPr>
+          <w:rFonts w:ascii="Arial" w:cs="Arial" w:eastAsia="Arial" w:hAnsi="Arial"/>
+          <w:b/>
+          <w:bCs/>
+          <w:sz w:val="21"/>
+          <w:szCs w:val="21"/>
+        </w:rPr>
+        <w:t xml:space="preserve">Calibración de evaluadores: </w:t>
+      </w:r>
+      <w:r>
+        <w:rPr>
+          <w:rFonts w:ascii="Arial" w:cs="Arial" w:eastAsia="Arial" w:hAnsi="Arial"/>
+          <w:sz w:val="21"/>
+          <w:szCs w:val="21"/>
+        </w:rPr>
+        <w:t xml:space="preserve">Antes de la primera convocatoria, y cuando entren evaluadores nuevos, el Comité de Evaluación califica en conjunto 2 o 3 proyectos de prueba y acuerda cómo interpretar cada nivel.</w:t>
+      </w:r>
+    </w:p>
+    <w:p>
+      <w:pPr>
+        <w:pStyle w:val="ListParagraph"/>
+        <w:numPr>
+          <w:ilvl w:val="0"/>
+          <w:numId w:val="3"/>
+        </w:numPr>
+        <w:spacing w:after="80"/>
+      </w:pPr>
+      <w:r>
+        <w:rPr>
+          <w:rFonts w:ascii="Arial" w:cs="Arial" w:eastAsia="Arial" w:hAnsi="Arial"/>
+          <w:b/>
+          <w:bCs/>
+          <w:sz w:val="21"/>
+          <w:szCs w:val="21"/>
+        </w:rPr>
+        <w:t xml:space="preserve">Fichas técnicas por tema: </w:t>
+      </w:r>
+      <w:r>
+        <w:rPr>
+          <w:rFonts w:ascii="Arial" w:cs="Arial" w:eastAsia="Arial" w:hAnsi="Arial"/>
+          <w:sz w:val="21"/>
+          <w:szCs w:val="21"/>
+        </w:rPr>
+        <w:t xml:space="preserve">El Comité de Evaluación y Seguimiento elabora, y el Comité Técnico aprueba, una ficha por tema que dice qué es un impacto alto, medio o bajo y con qué se compara. Se empieza por los temas con más demanda y se completan conforme lleguen proyectos.</w:t>
+      </w:r>
+    </w:p>
+    <w:p>
+      <w:pPr>
+        <w:spacing w:after="120"/>
+      </w:pPr>
+      <w:r>
+        <w:rPr>
+          <w:rFonts w:ascii="Arial" w:cs="Arial" w:eastAsia="Arial" w:hAnsi="Arial"/>
+          <w:i/>
+          <w:iCs/>
+          <w:color w:val="404040"/>
+          <w:sz w:val="19"/>
+          <w:szCs w:val="19"/>
+        </w:rPr>
+        <w:t xml:space="preserve">Se explican en la sección «Calidad técnica de la evaluación». Los estudios técnicos por tema, como el Sistema de Priorización de SbN de Forest Trends para agua, sirven de referencia para esas fichas.</w:t>
       </w:r>
     </w:p>
     <w:p>
@@ -1542,6 +1694,29 @@
         <w:t xml:space="preserve">Solo se califican los proyectos que pasaron el Paso 1. Cada criterio recibe 1, 2 o 3 puntos según la descripción de la tabla; si no hay evidencia, se pone 1. Impacto y Atención a población vulnerable valen doble porque el Decreto da prioridad a los resultados y a las poblaciones y territorios vulnerables.</w:t>
       </w:r>
     </w:p>
+    <w:p>
+      <w:pPr>
+        <w:spacing w:after="120"/>
+      </w:pPr>
+      <w:r>
+        <w:rPr>
+          <w:rFonts w:ascii="Arial" w:cs="Arial" w:eastAsia="Arial" w:hAnsi="Arial"/>
+          <w:b/>
+          <w:bCs/>
+          <w:sz w:val="21"/>
+          <w:szCs w:val="21"/>
+        </w:rPr>
+        <w:t xml:space="preserve">Cada calificación se justifica </w:t>
+      </w:r>
+      <w:r>
+        <w:rPr>
+          <w:rFonts w:ascii="Arial" w:cs="Arial" w:eastAsia="Arial" w:hAnsi="Arial"/>
+          <w:sz w:val="21"/>
+          <w:szCs w:val="21"/>
+        </w:rPr>
+        <w:t xml:space="preserve">con una línea que diga qué evidencia la sostiene. Para el Impacto, el evaluador usa la ficha técnica del tema cuando existe; si no, compara la meta del proyecto con su línea base y su diagnóstico.</w:t>
+      </w:r>
+    </w:p>
     <w:tbl>
       <w:tblPr>
         <w:tblW w:type="dxa" w:w="9360"/>
@@ -3960,6 +4135,873 @@
         <w:rPr>
           <w:rFonts w:ascii="Arial" w:cs="Arial" w:eastAsia="Arial" w:hAnsi="Arial"/>
         </w:rPr>
+        <w:t xml:space="preserve">Calidad técnica de la evaluación</w:t>
+      </w:r>
+    </w:p>
+    <w:p>
+      <w:pPr>
+        <w:spacing w:after="120"/>
+      </w:pPr>
+      <w:r>
+        <w:rPr>
+          <w:rFonts w:ascii="Arial" w:cs="Arial" w:eastAsia="Arial" w:hAnsi="Arial"/>
+          <w:sz w:val="21"/>
+          <w:szCs w:val="21"/>
+        </w:rPr>
+        <w:t xml:space="preserve">La valoración técnica descansa en evaluadores especialistas. Estas cuatro salvaguardas hacen que su criterio sea consistente, verificable y comparable entre temas.</w:t>
+      </w:r>
+    </w:p>
+    <w:tbl>
+      <w:tblPr>
+        <w:tblW w:type="dxa" w:w="9360"/>
+        <w:tblBorders>
+          <w:top w:val="single" w:color="auto" w:sz="4"/>
+          <w:left w:val="single" w:color="auto" w:sz="4"/>
+          <w:bottom w:val="single" w:color="auto" w:sz="4"/>
+          <w:right w:val="single" w:color="auto" w:sz="4"/>
+          <w:insideH w:val="single" w:color="auto" w:sz="4"/>
+          <w:insideV w:val="single" w:color="auto" w:sz="4"/>
+        </w:tblBorders>
+      </w:tblPr>
+      <w:tblGrid>
+        <w:gridCol w:w="2400"/>
+        <w:gridCol w:w="6960"/>
+      </w:tblGrid>
+      <w:tr>
+        <w:trPr>
+          <w:tblHeader/>
+        </w:trPr>
+        <w:tc>
+          <w:tcPr>
+            <w:tcW w:type="dxa" w:w="2400"/>
+            <w:tcBorders>
+              <w:top w:val="single" w:color="BFBFBF" w:sz="4"/>
+              <w:left w:val="single" w:color="BFBFBF" w:sz="4"/>
+              <w:bottom w:val="single" w:color="BFBFBF" w:sz="4"/>
+              <w:right w:val="single" w:color="BFBFBF" w:sz="4"/>
+            </w:tcBorders>
+            <w:shd w:fill="1F4E5A" w:color="auto" w:val="clear"/>
+            <w:tcMar>
+              <w:top w:type="dxa" w:w="60"/>
+              <w:left w:type="dxa" w:w="90"/>
+              <w:bottom w:type="dxa" w:w="60"/>
+              <w:right w:type="dxa" w:w="90"/>
+            </w:tcMar>
+          </w:tcPr>
+          <w:p>
+            <w:r>
+              <w:rPr>
+                <w:rFonts w:ascii="Arial" w:cs="Arial" w:eastAsia="Arial" w:hAnsi="Arial"/>
+                <w:b/>
+                <w:bCs/>
+                <w:color w:val="FFFFFF"/>
+                <w:sz w:val="17"/>
+                <w:szCs w:val="17"/>
+              </w:rPr>
+              <w:t xml:space="preserve">Salvaguarda</w:t>
+            </w:r>
+          </w:p>
+        </w:tc>
+        <w:tc>
+          <w:tcPr>
+            <w:tcW w:type="dxa" w:w="6960"/>
+            <w:tcBorders>
+              <w:top w:val="single" w:color="BFBFBF" w:sz="4"/>
+              <w:left w:val="single" w:color="BFBFBF" w:sz="4"/>
+              <w:bottom w:val="single" w:color="BFBFBF" w:sz="4"/>
+              <w:right w:val="single" w:color="BFBFBF" w:sz="4"/>
+            </w:tcBorders>
+            <w:shd w:fill="1F4E5A" w:color="auto" w:val="clear"/>
+            <w:tcMar>
+              <w:top w:type="dxa" w:w="60"/>
+              <w:left w:type="dxa" w:w="90"/>
+              <w:bottom w:type="dxa" w:w="60"/>
+              <w:right w:type="dxa" w:w="90"/>
+            </w:tcMar>
+          </w:tcPr>
+          <w:p>
+            <w:r>
+              <w:rPr>
+                <w:rFonts w:ascii="Arial" w:cs="Arial" w:eastAsia="Arial" w:hAnsi="Arial"/>
+                <w:b/>
+                <w:bCs/>
+                <w:color w:val="FFFFFF"/>
+                <w:sz w:val="17"/>
+                <w:szCs w:val="17"/>
+              </w:rPr>
+              <w:t xml:space="preserve">En qué consiste</w:t>
+            </w:r>
+          </w:p>
+        </w:tc>
+      </w:tr>
+      <w:tr>
+        <w:trPr>
+          <w:cantSplit/>
+        </w:trPr>
+        <w:tc>
+          <w:tcPr>
+            <w:tcW w:type="dxa" w:w="2400"/>
+            <w:tcBorders>
+              <w:top w:val="single" w:color="BFBFBF" w:sz="4"/>
+              <w:left w:val="single" w:color="BFBFBF" w:sz="4"/>
+              <w:bottom w:val="single" w:color="BFBFBF" w:sz="4"/>
+              <w:right w:val="single" w:color="BFBFBF" w:sz="4"/>
+            </w:tcBorders>
+            <w:shd w:fill="EAF1F4" w:color="auto" w:val="clear"/>
+            <w:tcMar>
+              <w:top w:type="dxa" w:w="60"/>
+              <w:left w:type="dxa" w:w="90"/>
+              <w:bottom w:type="dxa" w:w="60"/>
+              <w:right w:type="dxa" w:w="90"/>
+            </w:tcMar>
+          </w:tcPr>
+          <w:p>
+            <w:r>
+              <w:rPr>
+                <w:rFonts w:ascii="Arial" w:cs="Arial" w:eastAsia="Arial" w:hAnsi="Arial"/>
+                <w:b/>
+                <w:bCs/>
+                <w:sz w:val="17"/>
+                <w:szCs w:val="17"/>
+              </w:rPr>
+              <w:t xml:space="preserve">Rúbricas comunes</w:t>
+            </w:r>
+          </w:p>
+        </w:tc>
+        <w:tc>
+          <w:tcPr>
+            <w:tcW w:type="dxa" w:w="6960"/>
+            <w:tcBorders>
+              <w:top w:val="single" w:color="BFBFBF" w:sz="4"/>
+              <w:left w:val="single" w:color="BFBFBF" w:sz="4"/>
+              <w:bottom w:val="single" w:color="BFBFBF" w:sz="4"/>
+              <w:right w:val="single" w:color="BFBFBF" w:sz="4"/>
+            </w:tcBorders>
+            <w:tcMar>
+              <w:top w:type="dxa" w:w="60"/>
+              <w:left w:type="dxa" w:w="90"/>
+              <w:bottom w:type="dxa" w:w="60"/>
+              <w:right w:type="dxa" w:w="90"/>
+            </w:tcMar>
+          </w:tcPr>
+          <w:p>
+            <w:r>
+              <w:rPr>
+                <w:rFonts w:ascii="Arial" w:cs="Arial" w:eastAsia="Arial" w:hAnsi="Arial"/>
+                <w:sz w:val="17"/>
+                <w:szCs w:val="17"/>
+              </w:rPr>
+              <w:t xml:space="preserve">Todos los evaluadores califican con los mismos criterios y las mismas descripciones de cada nivel (Paso 2).</w:t>
+            </w:r>
+          </w:p>
+        </w:tc>
+      </w:tr>
+      <w:tr>
+        <w:trPr>
+          <w:cantSplit/>
+        </w:trPr>
+        <w:tc>
+          <w:tcPr>
+            <w:tcW w:type="dxa" w:w="2400"/>
+            <w:tcBorders>
+              <w:top w:val="single" w:color="BFBFBF" w:sz="4"/>
+              <w:left w:val="single" w:color="BFBFBF" w:sz="4"/>
+              <w:bottom w:val="single" w:color="BFBFBF" w:sz="4"/>
+              <w:right w:val="single" w:color="BFBFBF" w:sz="4"/>
+            </w:tcBorders>
+            <w:shd w:fill="EAF1F4" w:color="auto" w:val="clear"/>
+            <w:tcMar>
+              <w:top w:type="dxa" w:w="60"/>
+              <w:left w:type="dxa" w:w="90"/>
+              <w:bottom w:type="dxa" w:w="60"/>
+              <w:right w:type="dxa" w:w="90"/>
+            </w:tcMar>
+          </w:tcPr>
+          <w:p>
+            <w:r>
+              <w:rPr>
+                <w:rFonts w:ascii="Arial" w:cs="Arial" w:eastAsia="Arial" w:hAnsi="Arial"/>
+                <w:b/>
+                <w:bCs/>
+                <w:sz w:val="17"/>
+                <w:szCs w:val="17"/>
+              </w:rPr>
+              <w:t xml:space="preserve">Justificación obligatoria</w:t>
+            </w:r>
+          </w:p>
+        </w:tc>
+        <w:tc>
+          <w:tcPr>
+            <w:tcW w:type="dxa" w:w="6960"/>
+            <w:tcBorders>
+              <w:top w:val="single" w:color="BFBFBF" w:sz="4"/>
+              <w:left w:val="single" w:color="BFBFBF" w:sz="4"/>
+              <w:bottom w:val="single" w:color="BFBFBF" w:sz="4"/>
+              <w:right w:val="single" w:color="BFBFBF" w:sz="4"/>
+            </w:tcBorders>
+            <w:shd w:fill="F7F9FA" w:color="auto" w:val="clear"/>
+            <w:tcMar>
+              <w:top w:type="dxa" w:w="60"/>
+              <w:left w:type="dxa" w:w="90"/>
+              <w:bottom w:type="dxa" w:w="60"/>
+              <w:right w:type="dxa" w:w="90"/>
+            </w:tcMar>
+          </w:tcPr>
+          <w:p>
+            <w:r>
+              <w:rPr>
+                <w:rFonts w:ascii="Arial" w:cs="Arial" w:eastAsia="Arial" w:hAnsi="Arial"/>
+                <w:sz w:val="17"/>
+                <w:szCs w:val="17"/>
+              </w:rPr>
+              <w:t xml:space="preserve">Cada calificación se acompaña de una línea que dice qué evidencia la sostiene. Sin justificación, la calificación no es válida. Esto hace revisable la decisión ante auditorías o inconformidades.</w:t>
+            </w:r>
+          </w:p>
+        </w:tc>
+      </w:tr>
+      <w:tr>
+        <w:trPr>
+          <w:cantSplit/>
+        </w:trPr>
+        <w:tc>
+          <w:tcPr>
+            <w:tcW w:type="dxa" w:w="2400"/>
+            <w:tcBorders>
+              <w:top w:val="single" w:color="BFBFBF" w:sz="4"/>
+              <w:left w:val="single" w:color="BFBFBF" w:sz="4"/>
+              <w:bottom w:val="single" w:color="BFBFBF" w:sz="4"/>
+              <w:right w:val="single" w:color="BFBFBF" w:sz="4"/>
+            </w:tcBorders>
+            <w:shd w:fill="EAF1F4" w:color="auto" w:val="clear"/>
+            <w:tcMar>
+              <w:top w:type="dxa" w:w="60"/>
+              <w:left w:type="dxa" w:w="90"/>
+              <w:bottom w:type="dxa" w:w="60"/>
+              <w:right w:type="dxa" w:w="90"/>
+            </w:tcMar>
+          </w:tcPr>
+          <w:p>
+            <w:r>
+              <w:rPr>
+                <w:rFonts w:ascii="Arial" w:cs="Arial" w:eastAsia="Arial" w:hAnsi="Arial"/>
+                <w:b/>
+                <w:bCs/>
+                <w:sz w:val="17"/>
+                <w:szCs w:val="17"/>
+              </w:rPr>
+              <w:t xml:space="preserve">Calibración de evaluadores</w:t>
+            </w:r>
+          </w:p>
+        </w:tc>
+        <w:tc>
+          <w:tcPr>
+            <w:tcW w:type="dxa" w:w="6960"/>
+            <w:tcBorders>
+              <w:top w:val="single" w:color="BFBFBF" w:sz="4"/>
+              <w:left w:val="single" w:color="BFBFBF" w:sz="4"/>
+              <w:bottom w:val="single" w:color="BFBFBF" w:sz="4"/>
+              <w:right w:val="single" w:color="BFBFBF" w:sz="4"/>
+            </w:tcBorders>
+            <w:tcMar>
+              <w:top w:type="dxa" w:w="60"/>
+              <w:left w:type="dxa" w:w="90"/>
+              <w:bottom w:type="dxa" w:w="60"/>
+              <w:right w:type="dxa" w:w="90"/>
+            </w:tcMar>
+          </w:tcPr>
+          <w:p>
+            <w:r>
+              <w:rPr>
+                <w:rFonts w:ascii="Arial" w:cs="Arial" w:eastAsia="Arial" w:hAnsi="Arial"/>
+                <w:sz w:val="17"/>
+                <w:szCs w:val="17"/>
+              </w:rPr>
+              <w:t xml:space="preserve">Antes de la primera convocatoria, y cuando entren evaluadores nuevos, el Comité de Evaluación califica en conjunto 2 o 3 proyectos de prueba y acuerda cómo interpretar cada nivel.</w:t>
+            </w:r>
+          </w:p>
+        </w:tc>
+      </w:tr>
+      <w:tr>
+        <w:trPr>
+          <w:cantSplit/>
+        </w:trPr>
+        <w:tc>
+          <w:tcPr>
+            <w:tcW w:type="dxa" w:w="2400"/>
+            <w:tcBorders>
+              <w:top w:val="single" w:color="BFBFBF" w:sz="4"/>
+              <w:left w:val="single" w:color="BFBFBF" w:sz="4"/>
+              <w:bottom w:val="single" w:color="BFBFBF" w:sz="4"/>
+              <w:right w:val="single" w:color="BFBFBF" w:sz="4"/>
+            </w:tcBorders>
+            <w:shd w:fill="EAF1F4" w:color="auto" w:val="clear"/>
+            <w:tcMar>
+              <w:top w:type="dxa" w:w="60"/>
+              <w:left w:type="dxa" w:w="90"/>
+              <w:bottom w:type="dxa" w:w="60"/>
+              <w:right w:type="dxa" w:w="90"/>
+            </w:tcMar>
+          </w:tcPr>
+          <w:p>
+            <w:r>
+              <w:rPr>
+                <w:rFonts w:ascii="Arial" w:cs="Arial" w:eastAsia="Arial" w:hAnsi="Arial"/>
+                <w:b/>
+                <w:bCs/>
+                <w:sz w:val="17"/>
+                <w:szCs w:val="17"/>
+              </w:rPr>
+              <w:t xml:space="preserve">Fichas técnicas por tema</w:t>
+            </w:r>
+          </w:p>
+        </w:tc>
+        <w:tc>
+          <w:tcPr>
+            <w:tcW w:type="dxa" w:w="6960"/>
+            <w:tcBorders>
+              <w:top w:val="single" w:color="BFBFBF" w:sz="4"/>
+              <w:left w:val="single" w:color="BFBFBF" w:sz="4"/>
+              <w:bottom w:val="single" w:color="BFBFBF" w:sz="4"/>
+              <w:right w:val="single" w:color="BFBFBF" w:sz="4"/>
+            </w:tcBorders>
+            <w:shd w:fill="F7F9FA" w:color="auto" w:val="clear"/>
+            <w:tcMar>
+              <w:top w:type="dxa" w:w="60"/>
+              <w:left w:type="dxa" w:w="90"/>
+              <w:bottom w:type="dxa" w:w="60"/>
+              <w:right w:type="dxa" w:w="90"/>
+            </w:tcMar>
+          </w:tcPr>
+          <w:p>
+            <w:r>
+              <w:rPr>
+                <w:rFonts w:ascii="Arial" w:cs="Arial" w:eastAsia="Arial" w:hAnsi="Arial"/>
+                <w:sz w:val="17"/>
+                <w:szCs w:val="17"/>
+              </w:rPr>
+              <w:t xml:space="preserve">El Comité de Evaluación y Seguimiento elabora, y el Comité Técnico aprueba, una ficha por tema que dice qué es un impacto alto, medio o bajo y con qué se compara. Se empieza por los temas con más demanda y se completan conforme lleguen proyectos.</w:t>
+            </w:r>
+          </w:p>
+        </w:tc>
+      </w:tr>
+    </w:tbl>
+    <w:p>
+      <w:pPr>
+        <w:pStyle w:val="Heading2"/>
+      </w:pPr>
+      <w:r>
+        <w:rPr>
+          <w:rFonts w:ascii="Arial" w:cs="Arial" w:eastAsia="Arial" w:hAnsi="Arial"/>
+        </w:rPr>
+        <w:t xml:space="preserve">Formato de ficha técnica por tema</w:t>
+      </w:r>
+    </w:p>
+    <w:p>
+      <w:pPr>
+        <w:spacing w:after="120"/>
+      </w:pPr>
+      <w:r>
+        <w:rPr>
+          <w:rFonts w:ascii="Arial" w:cs="Arial" w:eastAsia="Arial" w:hAnsi="Arial"/>
+          <w:sz w:val="21"/>
+          <w:szCs w:val="21"/>
+        </w:rPr>
+        <w:t xml:space="preserve">Cada ficha sigue el mismo formato, para que todas sean comparables. Las elabora el Comité de Evaluación y Seguimiento con especialistas del tema y las aprueba el Comité Técnico antes de la convocatoria en que se usen.</w:t>
+      </w:r>
+    </w:p>
+    <w:tbl>
+      <w:tblPr>
+        <w:tblW w:type="dxa" w:w="9360"/>
+        <w:tblBorders>
+          <w:top w:val="single" w:color="auto" w:sz="4"/>
+          <w:left w:val="single" w:color="auto" w:sz="4"/>
+          <w:bottom w:val="single" w:color="auto" w:sz="4"/>
+          <w:right w:val="single" w:color="auto" w:sz="4"/>
+          <w:insideH w:val="single" w:color="auto" w:sz="4"/>
+          <w:insideV w:val="single" w:color="auto" w:sz="4"/>
+        </w:tblBorders>
+      </w:tblPr>
+      <w:tblGrid>
+        <w:gridCol w:w="2400"/>
+        <w:gridCol w:w="6960"/>
+      </w:tblGrid>
+      <w:tr>
+        <w:trPr>
+          <w:tblHeader/>
+        </w:trPr>
+        <w:tc>
+          <w:tcPr>
+            <w:tcW w:type="dxa" w:w="2400"/>
+            <w:tcBorders>
+              <w:top w:val="single" w:color="BFBFBF" w:sz="4"/>
+              <w:left w:val="single" w:color="BFBFBF" w:sz="4"/>
+              <w:bottom w:val="single" w:color="BFBFBF" w:sz="4"/>
+              <w:right w:val="single" w:color="BFBFBF" w:sz="4"/>
+            </w:tcBorders>
+            <w:shd w:fill="1F4E5A" w:color="auto" w:val="clear"/>
+            <w:tcMar>
+              <w:top w:type="dxa" w:w="60"/>
+              <w:left w:type="dxa" w:w="90"/>
+              <w:bottom w:type="dxa" w:w="60"/>
+              <w:right w:type="dxa" w:w="90"/>
+            </w:tcMar>
+          </w:tcPr>
+          <w:p>
+            <w:r>
+              <w:rPr>
+                <w:rFonts w:ascii="Arial" w:cs="Arial" w:eastAsia="Arial" w:hAnsi="Arial"/>
+                <w:b/>
+                <w:bCs/>
+                <w:color w:val="FFFFFF"/>
+                <w:sz w:val="17"/>
+                <w:szCs w:val="17"/>
+              </w:rPr>
+              <w:t xml:space="preserve">Campo</w:t>
+            </w:r>
+          </w:p>
+        </w:tc>
+        <w:tc>
+          <w:tcPr>
+            <w:tcW w:type="dxa" w:w="6960"/>
+            <w:tcBorders>
+              <w:top w:val="single" w:color="BFBFBF" w:sz="4"/>
+              <w:left w:val="single" w:color="BFBFBF" w:sz="4"/>
+              <w:bottom w:val="single" w:color="BFBFBF" w:sz="4"/>
+              <w:right w:val="single" w:color="BFBFBF" w:sz="4"/>
+            </w:tcBorders>
+            <w:shd w:fill="1F4E5A" w:color="auto" w:val="clear"/>
+            <w:tcMar>
+              <w:top w:type="dxa" w:w="60"/>
+              <w:left w:type="dxa" w:w="90"/>
+              <w:bottom w:type="dxa" w:w="60"/>
+              <w:right w:type="dxa" w:w="90"/>
+            </w:tcMar>
+          </w:tcPr>
+          <w:p>
+            <w:r>
+              <w:rPr>
+                <w:rFonts w:ascii="Arial" w:cs="Arial" w:eastAsia="Arial" w:hAnsi="Arial"/>
+                <w:b/>
+                <w:bCs/>
+                <w:color w:val="FFFFFF"/>
+                <w:sz w:val="17"/>
+                <w:szCs w:val="17"/>
+              </w:rPr>
+              <w:t xml:space="preserve">Qué contiene</w:t>
+            </w:r>
+          </w:p>
+        </w:tc>
+      </w:tr>
+      <w:tr>
+        <w:trPr>
+          <w:cantSplit/>
+        </w:trPr>
+        <w:tc>
+          <w:tcPr>
+            <w:tcW w:type="dxa" w:w="2400"/>
+            <w:tcBorders>
+              <w:top w:val="single" w:color="BFBFBF" w:sz="4"/>
+              <w:left w:val="single" w:color="BFBFBF" w:sz="4"/>
+              <w:bottom w:val="single" w:color="BFBFBF" w:sz="4"/>
+              <w:right w:val="single" w:color="BFBFBF" w:sz="4"/>
+            </w:tcBorders>
+            <w:shd w:fill="EAF1F4" w:color="auto" w:val="clear"/>
+            <w:tcMar>
+              <w:top w:type="dxa" w:w="60"/>
+              <w:left w:type="dxa" w:w="90"/>
+              <w:bottom w:type="dxa" w:w="60"/>
+              <w:right w:type="dxa" w:w="90"/>
+            </w:tcMar>
+          </w:tcPr>
+          <w:p>
+            <w:r>
+              <w:rPr>
+                <w:rFonts w:ascii="Arial" w:cs="Arial" w:eastAsia="Arial" w:hAnsi="Arial"/>
+                <w:b/>
+                <w:bCs/>
+                <w:sz w:val="17"/>
+                <w:szCs w:val="17"/>
+              </w:rPr>
+              <w:t xml:space="preserve">Tema y fracción</w:t>
+            </w:r>
+          </w:p>
+        </w:tc>
+        <w:tc>
+          <w:tcPr>
+            <w:tcW w:type="dxa" w:w="6960"/>
+            <w:tcBorders>
+              <w:top w:val="single" w:color="BFBFBF" w:sz="4"/>
+              <w:left w:val="single" w:color="BFBFBF" w:sz="4"/>
+              <w:bottom w:val="single" w:color="BFBFBF" w:sz="4"/>
+              <w:right w:val="single" w:color="BFBFBF" w:sz="4"/>
+            </w:tcBorders>
+            <w:tcMar>
+              <w:top w:type="dxa" w:w="60"/>
+              <w:left w:type="dxa" w:w="90"/>
+              <w:bottom w:type="dxa" w:w="60"/>
+              <w:right w:type="dxa" w:w="90"/>
+            </w:tcMar>
+          </w:tcPr>
+          <w:p>
+            <w:r>
+              <w:rPr>
+                <w:rFonts w:ascii="Arial" w:cs="Arial" w:eastAsia="Arial" w:hAnsi="Arial"/>
+                <w:sz w:val="17"/>
+                <w:szCs w:val="17"/>
+              </w:rPr>
+              <w:t xml:space="preserve">Por ejemplo: XII · Infraestructura verde</w:t>
+            </w:r>
+          </w:p>
+        </w:tc>
+      </w:tr>
+      <w:tr>
+        <w:trPr>
+          <w:cantSplit/>
+        </w:trPr>
+        <w:tc>
+          <w:tcPr>
+            <w:tcW w:type="dxa" w:w="2400"/>
+            <w:tcBorders>
+              <w:top w:val="single" w:color="BFBFBF" w:sz="4"/>
+              <w:left w:val="single" w:color="BFBFBF" w:sz="4"/>
+              <w:bottom w:val="single" w:color="BFBFBF" w:sz="4"/>
+              <w:right w:val="single" w:color="BFBFBF" w:sz="4"/>
+            </w:tcBorders>
+            <w:shd w:fill="EAF1F4" w:color="auto" w:val="clear"/>
+            <w:tcMar>
+              <w:top w:type="dxa" w:w="60"/>
+              <w:left w:type="dxa" w:w="90"/>
+              <w:bottom w:type="dxa" w:w="60"/>
+              <w:right w:type="dxa" w:w="90"/>
+            </w:tcMar>
+          </w:tcPr>
+          <w:p>
+            <w:r>
+              <w:rPr>
+                <w:rFonts w:ascii="Arial" w:cs="Arial" w:eastAsia="Arial" w:hAnsi="Arial"/>
+                <w:b/>
+                <w:bCs/>
+                <w:sz w:val="17"/>
+                <w:szCs w:val="17"/>
+              </w:rPr>
+              <w:t xml:space="preserve">Problema en BCS</w:t>
+            </w:r>
+          </w:p>
+        </w:tc>
+        <w:tc>
+          <w:tcPr>
+            <w:tcW w:type="dxa" w:w="6960"/>
+            <w:tcBorders>
+              <w:top w:val="single" w:color="BFBFBF" w:sz="4"/>
+              <w:left w:val="single" w:color="BFBFBF" w:sz="4"/>
+              <w:bottom w:val="single" w:color="BFBFBF" w:sz="4"/>
+              <w:right w:val="single" w:color="BFBFBF" w:sz="4"/>
+            </w:tcBorders>
+            <w:shd w:fill="F7F9FA" w:color="auto" w:val="clear"/>
+            <w:tcMar>
+              <w:top w:type="dxa" w:w="60"/>
+              <w:left w:type="dxa" w:w="90"/>
+              <w:bottom w:type="dxa" w:w="60"/>
+              <w:right w:type="dxa" w:w="90"/>
+            </w:tcMar>
+          </w:tcPr>
+          <w:p>
+            <w:r>
+              <w:rPr>
+                <w:rFonts w:ascii="Arial" w:cs="Arial" w:eastAsia="Arial" w:hAnsi="Arial"/>
+                <w:sz w:val="17"/>
+                <w:szCs w:val="17"/>
+              </w:rPr>
+              <w:t xml:space="preserve">Qué problema atiende el tema en el Estado y su dimensión, con datos oficiales o estudios</w:t>
+            </w:r>
+          </w:p>
+        </w:tc>
+      </w:tr>
+      <w:tr>
+        <w:trPr>
+          <w:cantSplit/>
+        </w:trPr>
+        <w:tc>
+          <w:tcPr>
+            <w:tcW w:type="dxa" w:w="2400"/>
+            <w:tcBorders>
+              <w:top w:val="single" w:color="BFBFBF" w:sz="4"/>
+              <w:left w:val="single" w:color="BFBFBF" w:sz="4"/>
+              <w:bottom w:val="single" w:color="BFBFBF" w:sz="4"/>
+              <w:right w:val="single" w:color="BFBFBF" w:sz="4"/>
+            </w:tcBorders>
+            <w:shd w:fill="EAF1F4" w:color="auto" w:val="clear"/>
+            <w:tcMar>
+              <w:top w:type="dxa" w:w="60"/>
+              <w:left w:type="dxa" w:w="90"/>
+              <w:bottom w:type="dxa" w:w="60"/>
+              <w:right w:type="dxa" w:w="90"/>
+            </w:tcMar>
+          </w:tcPr>
+          <w:p>
+            <w:r>
+              <w:rPr>
+                <w:rFonts w:ascii="Arial" w:cs="Arial" w:eastAsia="Arial" w:hAnsi="Arial"/>
+                <w:b/>
+                <w:bCs/>
+                <w:sz w:val="17"/>
+                <w:szCs w:val="17"/>
+              </w:rPr>
+              <w:t xml:space="preserve">Indicador principal</w:t>
+            </w:r>
+          </w:p>
+        </w:tc>
+        <w:tc>
+          <w:tcPr>
+            <w:tcW w:type="dxa" w:w="6960"/>
+            <w:tcBorders>
+              <w:top w:val="single" w:color="BFBFBF" w:sz="4"/>
+              <w:left w:val="single" w:color="BFBFBF" w:sz="4"/>
+              <w:bottom w:val="single" w:color="BFBFBF" w:sz="4"/>
+              <w:right w:val="single" w:color="BFBFBF" w:sz="4"/>
+            </w:tcBorders>
+            <w:tcMar>
+              <w:top w:type="dxa" w:w="60"/>
+              <w:left w:type="dxa" w:w="90"/>
+              <w:bottom w:type="dxa" w:w="60"/>
+              <w:right w:type="dxa" w:w="90"/>
+            </w:tcMar>
+          </w:tcPr>
+          <w:p>
+            <w:r>
+              <w:rPr>
+                <w:rFonts w:ascii="Arial" w:cs="Arial" w:eastAsia="Arial" w:hAnsi="Arial"/>
+                <w:sz w:val="17"/>
+                <w:szCs w:val="17"/>
+              </w:rPr>
+              <w:t xml:space="preserve">Con qué se mide el impacto (unidad) y cómo se calcula</w:t>
+            </w:r>
+          </w:p>
+        </w:tc>
+      </w:tr>
+      <w:tr>
+        <w:trPr>
+          <w:cantSplit/>
+        </w:trPr>
+        <w:tc>
+          <w:tcPr>
+            <w:tcW w:type="dxa" w:w="2400"/>
+            <w:tcBorders>
+              <w:top w:val="single" w:color="BFBFBF" w:sz="4"/>
+              <w:left w:val="single" w:color="BFBFBF" w:sz="4"/>
+              <w:bottom w:val="single" w:color="BFBFBF" w:sz="4"/>
+              <w:right w:val="single" w:color="BFBFBF" w:sz="4"/>
+            </w:tcBorders>
+            <w:shd w:fill="EAF1F4" w:color="auto" w:val="clear"/>
+            <w:tcMar>
+              <w:top w:type="dxa" w:w="60"/>
+              <w:left w:type="dxa" w:w="90"/>
+              <w:bottom w:type="dxa" w:w="60"/>
+              <w:right w:type="dxa" w:w="90"/>
+            </w:tcMar>
+          </w:tcPr>
+          <w:p>
+            <w:r>
+              <w:rPr>
+                <w:rFonts w:ascii="Arial" w:cs="Arial" w:eastAsia="Arial" w:hAnsi="Arial"/>
+                <w:b/>
+                <w:bCs/>
+                <w:sz w:val="17"/>
+                <w:szCs w:val="17"/>
+              </w:rPr>
+              <w:t xml:space="preserve">Impacto alto, medio y bajo</w:t>
+            </w:r>
+          </w:p>
+        </w:tc>
+        <w:tc>
+          <w:tcPr>
+            <w:tcW w:type="dxa" w:w="6960"/>
+            <w:tcBorders>
+              <w:top w:val="single" w:color="BFBFBF" w:sz="4"/>
+              <w:left w:val="single" w:color="BFBFBF" w:sz="4"/>
+              <w:bottom w:val="single" w:color="BFBFBF" w:sz="4"/>
+              <w:right w:val="single" w:color="BFBFBF" w:sz="4"/>
+            </w:tcBorders>
+            <w:shd w:fill="F7F9FA" w:color="auto" w:val="clear"/>
+            <w:tcMar>
+              <w:top w:type="dxa" w:w="60"/>
+              <w:left w:type="dxa" w:w="90"/>
+              <w:bottom w:type="dxa" w:w="60"/>
+              <w:right w:type="dxa" w:w="90"/>
+            </w:tcMar>
+          </w:tcPr>
+          <w:p>
+            <w:r>
+              <w:rPr>
+                <w:rFonts w:ascii="Arial" w:cs="Arial" w:eastAsia="Arial" w:hAnsi="Arial"/>
+                <w:sz w:val="17"/>
+                <w:szCs w:val="17"/>
+              </w:rPr>
+              <w:t xml:space="preserve">Qué valores del indicador corresponden a 3, 2 y 1 punto, frente al tamaño del problema</w:t>
+            </w:r>
+          </w:p>
+        </w:tc>
+      </w:tr>
+      <w:tr>
+        <w:trPr>
+          <w:cantSplit/>
+        </w:trPr>
+        <w:tc>
+          <w:tcPr>
+            <w:tcW w:type="dxa" w:w="2400"/>
+            <w:tcBorders>
+              <w:top w:val="single" w:color="BFBFBF" w:sz="4"/>
+              <w:left w:val="single" w:color="BFBFBF" w:sz="4"/>
+              <w:bottom w:val="single" w:color="BFBFBF" w:sz="4"/>
+              <w:right w:val="single" w:color="BFBFBF" w:sz="4"/>
+            </w:tcBorders>
+            <w:shd w:fill="EAF1F4" w:color="auto" w:val="clear"/>
+            <w:tcMar>
+              <w:top w:type="dxa" w:w="60"/>
+              <w:left w:type="dxa" w:w="90"/>
+              <w:bottom w:type="dxa" w:w="60"/>
+              <w:right w:type="dxa" w:w="90"/>
+            </w:tcMar>
+          </w:tcPr>
+          <w:p>
+            <w:r>
+              <w:rPr>
+                <w:rFonts w:ascii="Arial" w:cs="Arial" w:eastAsia="Arial" w:hAnsi="Arial"/>
+                <w:b/>
+                <w:bCs/>
+                <w:sz w:val="17"/>
+                <w:szCs w:val="17"/>
+              </w:rPr>
+              <w:t xml:space="preserve">Fuentes de referencia</w:t>
+            </w:r>
+          </w:p>
+        </w:tc>
+        <w:tc>
+          <w:tcPr>
+            <w:tcW w:type="dxa" w:w="6960"/>
+            <w:tcBorders>
+              <w:top w:val="single" w:color="BFBFBF" w:sz="4"/>
+              <w:left w:val="single" w:color="BFBFBF" w:sz="4"/>
+              <w:bottom w:val="single" w:color="BFBFBF" w:sz="4"/>
+              <w:right w:val="single" w:color="BFBFBF" w:sz="4"/>
+            </w:tcBorders>
+            <w:tcMar>
+              <w:top w:type="dxa" w:w="60"/>
+              <w:left w:type="dxa" w:w="90"/>
+              <w:bottom w:type="dxa" w:w="60"/>
+              <w:right w:type="dxa" w:w="90"/>
+            </w:tcMar>
+          </w:tcPr>
+          <w:p>
+            <w:r>
+              <w:rPr>
+                <w:rFonts w:ascii="Arial" w:cs="Arial" w:eastAsia="Arial" w:hAnsi="Arial"/>
+                <w:sz w:val="17"/>
+                <w:szCs w:val="17"/>
+              </w:rPr>
+              <w:t xml:space="preserve">Estudios, diagnósticos o sistemas que respaldan los valores (por ejemplo, el Sistema de Priorización de SbN de Forest Trends para agua)</w:t>
+            </w:r>
+          </w:p>
+        </w:tc>
+      </w:tr>
+      <w:tr>
+        <w:trPr>
+          <w:cantSplit/>
+        </w:trPr>
+        <w:tc>
+          <w:tcPr>
+            <w:tcW w:type="dxa" w:w="2400"/>
+            <w:tcBorders>
+              <w:top w:val="single" w:color="BFBFBF" w:sz="4"/>
+              <w:left w:val="single" w:color="BFBFBF" w:sz="4"/>
+              <w:bottom w:val="single" w:color="BFBFBF" w:sz="4"/>
+              <w:right w:val="single" w:color="BFBFBF" w:sz="4"/>
+            </w:tcBorders>
+            <w:shd w:fill="EAF1F4" w:color="auto" w:val="clear"/>
+            <w:tcMar>
+              <w:top w:type="dxa" w:w="60"/>
+              <w:left w:type="dxa" w:w="90"/>
+              <w:bottom w:type="dxa" w:w="60"/>
+              <w:right w:type="dxa" w:w="90"/>
+            </w:tcMar>
+          </w:tcPr>
+          <w:p>
+            <w:r>
+              <w:rPr>
+                <w:rFonts w:ascii="Arial" w:cs="Arial" w:eastAsia="Arial" w:hAnsi="Arial"/>
+                <w:b/>
+                <w:bCs/>
+                <w:sz w:val="17"/>
+                <w:szCs w:val="17"/>
+              </w:rPr>
+              <w:t xml:space="preserve">Responsable y fecha</w:t>
+            </w:r>
+          </w:p>
+        </w:tc>
+        <w:tc>
+          <w:tcPr>
+            <w:tcW w:type="dxa" w:w="6960"/>
+            <w:tcBorders>
+              <w:top w:val="single" w:color="BFBFBF" w:sz="4"/>
+              <w:left w:val="single" w:color="BFBFBF" w:sz="4"/>
+              <w:bottom w:val="single" w:color="BFBFBF" w:sz="4"/>
+              <w:right w:val="single" w:color="BFBFBF" w:sz="4"/>
+            </w:tcBorders>
+            <w:shd w:fill="F7F9FA" w:color="auto" w:val="clear"/>
+            <w:tcMar>
+              <w:top w:type="dxa" w:w="60"/>
+              <w:left w:type="dxa" w:w="90"/>
+              <w:bottom w:type="dxa" w:w="60"/>
+              <w:right w:type="dxa" w:w="90"/>
+            </w:tcMar>
+          </w:tcPr>
+          <w:p>
+            <w:r>
+              <w:rPr>
+                <w:rFonts w:ascii="Arial" w:cs="Arial" w:eastAsia="Arial" w:hAnsi="Arial"/>
+                <w:sz w:val="17"/>
+                <w:szCs w:val="17"/>
+              </w:rPr>
+              <w:t xml:space="preserve">Quién la elaboró, cuándo la aprobó el Comité Técnico y cuándo se revisa</w:t>
+            </w:r>
+          </w:p>
+        </w:tc>
+      </w:tr>
+    </w:tbl>
+    <w:p>
+      <w:pPr>
+        <w:spacing w:after="120"/>
+      </w:pPr>
+      <w:r>
+        <w:rPr>
+          <w:rFonts w:ascii="Arial" w:cs="Arial" w:eastAsia="Arial" w:hAnsi="Arial"/>
+          <w:sz w:val="21"/>
+          <w:szCs w:val="21"/>
+        </w:rPr>
+        <w:t xml:space="preserve">Mientras un tema no tenga ficha, el evaluador califica el Impacto comparando la meta del proyecto con su línea base y con el diagnóstico del problema que presenta el proponente, y lo deja escrito en la justificación.</w:t>
+      </w:r>
+    </w:p>
+    <w:p>
+      <w:pPr>
+        <w:spacing w:after="120"/>
+      </w:pPr>
+      <w:r>
+        <w:rPr>
+          <w:rFonts w:ascii="Arial" w:cs="Arial" w:eastAsia="Arial" w:hAnsi="Arial"/>
+          <w:sz w:val="21"/>
+          <w:szCs w:val="21"/>
+        </w:rPr>
+        <w:t xml:space="preserve">Además, el Comité Técnico puede fijar prioridades en cada convocatoria, por ejemplo reservar una parte del presupuesto para agua dada la escasez hídrica del Estado, sin cambiar los criterios de calificación.</w:t>
+      </w:r>
+    </w:p>
+    <w:p>
+      <w:pPr>
+        <w:pStyle w:val="Heading1"/>
+      </w:pPr>
+      <w:r>
+        <w:rPr>
+          <w:rFonts w:ascii="Arial" w:cs="Arial" w:eastAsia="Arial" w:hAnsi="Arial"/>
+        </w:rPr>
         <w:t xml:space="preserve">Paso 3. Ordenar y decidir: quién hace qué</w:t>
       </w:r>
     </w:p>
@@ -4245,7 +5287,7 @@
                 <w:sz w:val="16"/>
                 <w:szCs w:val="16"/>
               </w:rPr>
-              <w:t xml:space="preserve">Aprueba la convocatoria, los montos y esta guía; decide qué proyectos se financian, con qué monto, en qué condiciones y con qué fortalecimiento (art. 9, fr. III); puede modificar, suspender o revocar apoyos (fr. IV).</w:t>
+              <w:t xml:space="preserve">Aprueba la convocatoria, los montos, las prioridades, esta guía y las fichas técnicas; decide qué proyectos se financian, con qué monto, en qué condiciones y con qué fortalecimiento (art. 9, fr. III); puede modificar, suspender o revocar apoyos (fr. IV).</w:t>
             </w:r>
           </w:p>
         </w:tc>
@@ -4364,7 +5406,7 @@
                 <w:sz w:val="16"/>
                 <w:szCs w:val="16"/>
               </w:rPr>
-              <w:t xml:space="preserve">Califica los 8 criterios; propone el orden y qué proyectos fortalecer; durante la ejecución revisa informes e indicadores.</w:t>
+              <w:t xml:space="preserve">Elabora las fichas técnicas y calibra a los evaluadores; califica y justifica los 8 criterios; propone el orden y qué proyectos fortalecer; durante la ejecución revisa informes e indicadores.</w:t>
             </w:r>
           </w:p>
         </w:tc>
@@ -4624,7 +5666,7 @@
           <w:sz w:val="21"/>
           <w:szCs w:val="21"/>
         </w:rPr>
-        <w:t xml:space="preserve">dos evaluadores del Comité de Evaluación califican cada proyecto por separado; si difieren en más de un punto en un criterio, lo discuten y anotan el acuerdo. Quien tenga conflicto de interés con un proyecto no lo evalúa.</w:t>
+        <w:t xml:space="preserve">dos evaluadores del Comité de Evaluación califican y justifican cada proyecto por separado; si difieren en más de un punto en un criterio, lo discuten y anotan el acuerdo. Quien tenga conflicto de interés con un proyecto no lo evalúa.</w:t>
       </w:r>
     </w:p>
     <w:p>
@@ -9772,7 +10814,7 @@
                 <w:sz w:val="17"/>
                 <w:szCs w:val="17"/>
               </w:rPr>
-              <w:t xml:space="preserve">Separar requisitos (Sí/No) de criterios calificados de 1 a 3 con descripción de cada nivel; categorías de prioridad.</w:t>
+              <w:t xml:space="preserve">Separar requisitos (Sí/No) de criterios calificados de 1 a 3 con descripción de cada nivel; categorías de prioridad; calibración de evaluadores. Es la referencia técnica para la ficha de agua y soluciones basadas en la naturaleza.</w:t>
             </w:r>
           </w:p>
         </w:tc>

</xml_diff>

<commit_message>
Ground guide only in the fund decree and use promovente
Remove references to source documents, name the evaluation body as the
decree's Subcomité Técnico Especializado, and replace annex B with the
decree articles each part of the guide applies.

Co-Authored-By: Claude Opus 5.5 <noreply@anthropic.com>
Claude-Session: https://claude.ai/code/session_01VHwNN6RfVzTYVCS9bRLUAz
</commit_message>
<xml_diff>
--- a/entregables/Guia_seleccion_proyectos_FEAC_BCS.docx
+++ b/entregables/Guia_seleccion_proyectos_FEAC_BCS.docx
@@ -261,7 +261,7 @@
           <w:sz w:val="21"/>
           <w:szCs w:val="21"/>
         </w:rPr>
-        <w:t xml:space="preserve">Antes de la primera convocatoria, y cuando entren evaluadores nuevos, el Comité de Evaluación califica en conjunto 2 o 3 proyectos de prueba y acuerda cómo interpretar cada nivel.</w:t>
+        <w:t xml:space="preserve">Antes de la primera convocatoria, y cuando entren evaluadores nuevos, el Subcomité Técnico Especializado califica en conjunto 2 o 3 proyectos de prueba y acuerda cómo interpretar cada nivel.</w:t>
       </w:r>
     </w:p>
     <w:p>
@@ -289,7 +289,7 @@
           <w:sz w:val="21"/>
           <w:szCs w:val="21"/>
         </w:rPr>
-        <w:t xml:space="preserve">El Comité de Evaluación y Seguimiento elabora, y el Comité Técnico aprueba, una ficha por tema que dice qué es un impacto alto, medio o bajo y con qué se compara. Se empieza por los temas con más demanda y se completan conforme lleguen proyectos.</w:t>
+        <w:t xml:space="preserve">El Subcomité Técnico Especializado elabora, y el Comité Técnico aprueba, una ficha por tema que dice qué es un impacto alto, medio o bajo y con qué se compara. Se empieza por los temas con más demanda y se completan conforme lleguen proyectos.</w:t>
       </w:r>
     </w:p>
     <w:p>
@@ -305,7 +305,7 @@
           <w:sz w:val="19"/>
           <w:szCs w:val="19"/>
         </w:rPr>
-        <w:t xml:space="preserve">Se explican en la sección «Calidad técnica de la evaluación». Los estudios técnicos por tema, como el Sistema de Priorización de SbN de Forest Trends para agua, sirven de referencia para esas fichas.</w:t>
+        <w:t xml:space="preserve">Se explican en la sección «Calidad técnica de la evaluación». Los estudios técnicos y diagnósticos disponibles para cada tema sirven de referencia para esas fichas.</w:t>
       </w:r>
     </w:p>
     <w:p>
@@ -353,7 +353,7 @@
           <w:sz w:val="21"/>
           <w:szCs w:val="21"/>
         </w:rPr>
-        <w:t xml:space="preserve">Las tres listas siguientes vienen del documento «Criterios de elegibilidad de proyectos». Son independientes entre sí: cualquier solicitante puede presentar cualquier tipo de proyecto, siempre que el apoyo sea coherente con su objeto y sus facultades (por ejemplo, un préstamo no suele ser adecuado para una organización sin fines de lucro).</w:t>
+        <w:t xml:space="preserve">Las tres listas siguientes son independientes entre sí: cualquier solicitante puede presentar cualquier tipo de proyecto, siempre que el apoyo sea coherente con su objeto y sus facultades (por ejemplo, un préstamo no suele ser adecuado para una organización sin fines de lucro).</w:t>
       </w:r>
     </w:p>
     <w:p>
@@ -632,7 +632,7 @@
           <w:sz w:val="21"/>
           <w:szCs w:val="21"/>
         </w:rPr>
-        <w:t xml:space="preserve">Si falta información, se pide una sola vez al proponente (5 días hábiles) antes de decidir.</w:t>
+        <w:t xml:space="preserve">Si falta información, se pide una sola vez al promovente (5 días hábiles) antes de decidir.</w:t>
       </w:r>
     </w:p>
     <w:tbl>
@@ -1580,7 +1580,7 @@
                 <w:sz w:val="17"/>
                 <w:szCs w:val="17"/>
               </w:rPr>
-              <w:t xml:space="preserve">Proponente en regla</w:t>
+              <w:t xml:space="preserve">Promovente en regla</w:t>
             </w:r>
           </w:p>
         </w:tc>
@@ -2330,7 +2330,7 @@
                 <w:sz w:val="16"/>
                 <w:szCs w:val="16"/>
               </w:rPr>
-              <w:t xml:space="preserve">Viabilidad técnica, administrativa y legal: madurez del proyecto, experiencia del proponente y manejo de riesgos y obstáculos.</w:t>
+              <w:t xml:space="preserve">Viabilidad técnica, administrativa y legal: madurez del proyecto, experiencia del promovente y manejo de riesgos y obstáculos.</w:t>
             </w:r>
           </w:p>
         </w:tc>
@@ -2384,7 +2384,7 @@
                 <w:sz w:val="16"/>
                 <w:szCs w:val="16"/>
               </w:rPr>
-              <w:t xml:space="preserve">Proyecto ejecutivo o muy avanzado; el proponente ya hizo proyectos parecidos; los riesgos y obstáculos están identificados y tienen solución.</w:t>
+              <w:t xml:space="preserve">Proyecto ejecutivo o muy avanzado; el promovente ya hizo proyectos parecidos; los riesgos y obstáculos están identificados y tienen solución.</w:t>
             </w:r>
           </w:p>
         </w:tc>
@@ -4124,7 +4124,7 @@
           <w:sz w:val="21"/>
           <w:szCs w:val="21"/>
         </w:rPr>
-        <w:t xml:space="preserve">Estas opciones usan los apoyos no financieros (asesoría, asistencia técnica especializada, estudios técnicos, administrativos o financieros, vinculación con fondeadores) que prevé el documento de criterios de elegibilidad.</w:t>
+        <w:t xml:space="preserve">Estas opciones usan los apoyos no financieros (asesoría, asistencia técnica especializada, estudios técnicos, administrativos o financieros, vinculación con fondeadores), conforme al objeto del Fondo de apoyar técnica y financieramente las acciones climáticas.</w:t>
       </w:r>
     </w:p>
     <w:p>
@@ -4416,7 +4416,7 @@
                 <w:sz w:val="17"/>
                 <w:szCs w:val="17"/>
               </w:rPr>
-              <w:t xml:space="preserve">Antes de la primera convocatoria, y cuando entren evaluadores nuevos, el Comité de Evaluación califica en conjunto 2 o 3 proyectos de prueba y acuerda cómo interpretar cada nivel.</w:t>
+              <w:t xml:space="preserve">Antes de la primera convocatoria, y cuando entren evaluadores nuevos, el Subcomité Técnico Especializado califica en conjunto 2 o 3 proyectos de prueba y acuerda cómo interpretar cada nivel.</w:t>
             </w:r>
           </w:p>
         </w:tc>
@@ -4479,7 +4479,7 @@
                 <w:sz w:val="17"/>
                 <w:szCs w:val="17"/>
               </w:rPr>
-              <w:t xml:space="preserve">El Comité de Evaluación y Seguimiento elabora, y el Comité Técnico aprueba, una ficha por tema que dice qué es un impacto alto, medio o bajo y con qué se compara. Se empieza por los temas con más demanda y se completan conforme lleguen proyectos.</w:t>
+              <w:t xml:space="preserve">El Subcomité Técnico Especializado elabora, y el Comité Técnico aprueba, una ficha por tema que dice qué es un impacto alto, medio o bajo y con qué se compara. Se empieza por los temas con más demanda y se completan conforme lleguen proyectos.</w:t>
             </w:r>
           </w:p>
         </w:tc>
@@ -4506,7 +4506,7 @@
           <w:sz w:val="21"/>
           <w:szCs w:val="21"/>
         </w:rPr>
-        <w:t xml:space="preserve">Cada ficha sigue el mismo formato, para que todas sean comparables. Las elabora el Comité de Evaluación y Seguimiento con especialistas del tema y las aprueba el Comité Técnico antes de la convocatoria en que se usen.</w:t>
+        <w:t xml:space="preserve">Cada ficha sigue el mismo formato, para que todas sean comparables. Las elabora el Subcomité Técnico Especializado con especialistas del tema y las aprueba el Comité Técnico antes de la convocatoria en que se usen.</w:t>
       </w:r>
     </w:p>
     <w:tbl>
@@ -4899,7 +4899,7 @@
                 <w:sz w:val="17"/>
                 <w:szCs w:val="17"/>
               </w:rPr>
-              <w:t xml:space="preserve">Estudios, diagnósticos o sistemas que respaldan los valores (por ejemplo, el Sistema de Priorización de SbN de Forest Trends para agua)</w:t>
+              <w:t xml:space="preserve">Estudios, diagnósticos o sistemas que respaldan los valores (por ejemplo, diagnósticos estatales, programas de manejo o estudios especializados)</w:t>
             </w:r>
           </w:p>
         </w:tc>
@@ -4978,7 +4978,7 @@
           <w:sz w:val="21"/>
           <w:szCs w:val="21"/>
         </w:rPr>
-        <w:t xml:space="preserve">Mientras un tema no tenga ficha, el evaluador califica el Impacto comparando la meta del proyecto con su línea base y con el diagnóstico del problema que presenta el proponente, y lo deja escrito en la justificación.</w:t>
+        <w:t xml:space="preserve">Mientras un tema no tenga ficha, el evaluador califica el Impacto comparando la meta del proyecto con su línea base y con el diagnóstico del problema que presenta el promovente, y lo deja escrito en la justificación.</w:t>
       </w:r>
     </w:p>
     <w:p>
@@ -5015,7 +5015,7 @@
           <w:sz w:val="21"/>
           <w:szCs w:val="21"/>
         </w:rPr>
-        <w:t xml:space="preserve">En el proceso participan tres instancias: la Secretaría Técnica opera, el Comité de Evaluación y Seguimiento califica y da seguimiento, y el Comité Técnico decide. Ninguna sustituye a otra.</w:t>
+        <w:t xml:space="preserve">En el proceso participan tres instancias: la Secretaría Técnica opera, el Subcomité Técnico Especializado califica y da seguimiento, y el Comité Técnico decide. Ninguna sustituye a otra.</w:t>
       </w:r>
     </w:p>
     <w:p>
@@ -5322,7 +5322,7 @@
                 <w:sz w:val="16"/>
                 <w:szCs w:val="16"/>
               </w:rPr>
-              <w:t xml:space="preserve">Comité de Evaluación y Seguimiento</w:t>
+              <w:t xml:space="preserve">Subcomité Técnico Especializado (evaluación y seguimiento)</w:t>
             </w:r>
           </w:p>
         </w:tc>
@@ -5350,7 +5350,7 @@
                 <w:sz w:val="16"/>
                 <w:szCs w:val="16"/>
               </w:rPr>
-              <w:t xml:space="preserve">Lo propone el documento de criterios de elegibilidad. En el Decreto es un subcomité técnico especializado que crea el Comité Técnico para evaluar proyectos (arts. 9, fr. XI, y 14).</w:t>
+              <w:t xml:space="preserve">Decreto del Fondo, arts. 9, fr. XI, y 14. El Comité Técnico lo crea como órgano auxiliar de apoyo y evaluación de proyectos.</w:t>
             </w:r>
           </w:p>
         </w:tc>
@@ -5666,7 +5666,7 @@
           <w:sz w:val="21"/>
           <w:szCs w:val="21"/>
         </w:rPr>
-        <w:t xml:space="preserve">dos evaluadores del Comité de Evaluación califican y justifican cada proyecto por separado; si difieren en más de un punto en un criterio, lo discuten y anotan el acuerdo. Quien tenga conflicto de interés con un proyecto no lo evalúa.</w:t>
+        <w:t xml:space="preserve">dos evaluadores del Subcomité Técnico Especializado califican y justifican cada proyecto por separado; si difieren en más de un punto en un criterio, lo discuten y anotan el acuerdo. Quien tenga conflicto de interés con un proyecto no lo evalúa.</w:t>
       </w:r>
     </w:p>
     <w:p>
@@ -5766,7 +5766,7 @@
           <w:sz w:val="19"/>
           <w:szCs w:val="19"/>
         </w:rPr>
-        <w:t xml:space="preserve">Pendiente: las Reglas de Operación del Fondo deben definir quién integra el Comité de Evaluación y Seguimiento y cómo funciona (art. 14 del Decreto).</w:t>
+        <w:t xml:space="preserve">Pendiente: las Reglas de Operación del Fondo deben definir quién integra el Subcomité Técnico Especializado y cómo funciona (art. 14 del Decreto).</w:t>
       </w:r>
     </w:p>
     <w:p>
@@ -10421,7 +10421,20 @@
         <w:rPr>
           <w:rFonts w:ascii="Arial" w:cs="Arial" w:eastAsia="Arial" w:hAnsi="Arial"/>
         </w:rPr>
-        <w:t xml:space="preserve">Anexo B. En qué se basa esta guía</w:t>
+        <w:t xml:space="preserve">Anexo B. Fundamento en el Decreto</w:t>
+      </w:r>
+    </w:p>
+    <w:p>
+      <w:pPr>
+        <w:spacing w:after="120"/>
+      </w:pPr>
+      <w:r>
+        <w:rPr>
+          <w:rFonts w:ascii="Arial" w:cs="Arial" w:eastAsia="Arial" w:hAnsi="Arial"/>
+          <w:sz w:val="21"/>
+          <w:szCs w:val="21"/>
+        </w:rPr>
+        <w:t xml:space="preserve">Esta guía desarrolla los criterios de priorización, elegibilidad e impacto que el artículo 4 del Decreto pide establecer en las Reglas de Operación del Fondo.</w:t>
       </w:r>
     </w:p>
     <w:tbl>
@@ -10437,8 +10450,9 @@
         </w:tblBorders>
       </w:tblPr>
       <w:tblGrid>
-        <w:gridCol w:w="3200"/>
-        <w:gridCol w:w="6160"/>
+        <w:gridCol w:w="1900"/>
+        <w:gridCol w:w="3560"/>
+        <w:gridCol w:w="3900"/>
       </w:tblGrid>
       <w:tr>
         <w:trPr>
@@ -10446,7 +10460,7 @@
         </w:trPr>
         <w:tc>
           <w:tcPr>
-            <w:tcW w:type="dxa" w:w="3200"/>
+            <w:tcW w:type="dxa" w:w="1900"/>
             <w:tcBorders>
               <w:top w:val="single" w:color="BFBFBF" w:sz="4"/>
               <w:left w:val="single" w:color="BFBFBF" w:sz="4"/>
@@ -10471,13 +10485,13 @@
                 <w:sz w:val="17"/>
                 <w:szCs w:val="17"/>
               </w:rPr>
-              <w:t xml:space="preserve">Fuente</w:t>
-            </w:r>
-          </w:p>
-        </w:tc>
-        <w:tc>
-          <w:tcPr>
-            <w:tcW w:type="dxa" w:w="6160"/>
+              <w:t xml:space="preserve">Artículo</w:t>
+            </w:r>
+          </w:p>
+        </w:tc>
+        <w:tc>
+          <w:tcPr>
+            <w:tcW w:type="dxa" w:w="3560"/>
             <w:tcBorders>
               <w:top w:val="single" w:color="BFBFBF" w:sz="4"/>
               <w:left w:val="single" w:color="BFBFBF" w:sz="4"/>
@@ -10502,7 +10516,38 @@
                 <w:sz w:val="17"/>
                 <w:szCs w:val="17"/>
               </w:rPr>
-              <w:t xml:space="preserve">Qué se tomó</w:t>
+              <w:t xml:space="preserve">Qué establece</w:t>
+            </w:r>
+          </w:p>
+        </w:tc>
+        <w:tc>
+          <w:tcPr>
+            <w:tcW w:type="dxa" w:w="3900"/>
+            <w:tcBorders>
+              <w:top w:val="single" w:color="BFBFBF" w:sz="4"/>
+              <w:left w:val="single" w:color="BFBFBF" w:sz="4"/>
+              <w:bottom w:val="single" w:color="BFBFBF" w:sz="4"/>
+              <w:right w:val="single" w:color="BFBFBF" w:sz="4"/>
+            </w:tcBorders>
+            <w:shd w:fill="1F4E5A" w:color="auto" w:val="clear"/>
+            <w:tcMar>
+              <w:top w:type="dxa" w:w="60"/>
+              <w:left w:type="dxa" w:w="90"/>
+              <w:bottom w:type="dxa" w:w="60"/>
+              <w:right w:type="dxa" w:w="90"/>
+            </w:tcMar>
+          </w:tcPr>
+          <w:p>
+            <w:r>
+              <w:rPr>
+                <w:rFonts w:ascii="Arial" w:cs="Arial" w:eastAsia="Arial" w:hAnsi="Arial"/>
+                <w:b/>
+                <w:bCs/>
+                <w:color w:val="FFFFFF"/>
+                <w:sz w:val="17"/>
+                <w:szCs w:val="17"/>
+              </w:rPr>
+              <w:t xml:space="preserve">Dónde se aplica en esta guía</w:t>
             </w:r>
           </w:p>
         </w:tc>
@@ -10513,7 +10558,7 @@
         </w:trPr>
         <w:tc>
           <w:tcPr>
-            <w:tcW w:type="dxa" w:w="3200"/>
+            <w:tcW w:type="dxa" w:w="1900"/>
             <w:tcBorders>
               <w:top w:val="single" w:color="BFBFBF" w:sz="4"/>
               <w:left w:val="single" w:color="BFBFBF" w:sz="4"/>
@@ -10537,34 +10582,61 @@
                 <w:sz w:val="17"/>
                 <w:szCs w:val="17"/>
               </w:rPr>
-              <w:t xml:space="preserve">Criterios de elegibilidad de proyectos (documento base)</w:t>
-            </w:r>
-          </w:p>
-        </w:tc>
-        <w:tc>
-          <w:tcPr>
-            <w:tcW w:type="dxa" w:w="6160"/>
-            <w:tcBorders>
-              <w:top w:val="single" w:color="BFBFBF" w:sz="4"/>
-              <w:left w:val="single" w:color="BFBFBF" w:sz="4"/>
-              <w:bottom w:val="single" w:color="BFBFBF" w:sz="4"/>
-              <w:right w:val="single" w:color="BFBFBF" w:sz="4"/>
-            </w:tcBorders>
-            <w:tcMar>
-              <w:top w:type="dxa" w:w="60"/>
-              <w:left w:type="dxa" w:w="90"/>
-              <w:bottom w:type="dxa" w:w="60"/>
-              <w:right w:type="dxa" w:w="90"/>
-            </w:tcMar>
-          </w:tcPr>
-          <w:p>
-            <w:r>
-              <w:rPr>
-                <w:rFonts w:ascii="Arial" w:cs="Arial" w:eastAsia="Arial" w:hAnsi="Arial"/>
-                <w:sz w:val="17"/>
-                <w:szCs w:val="17"/>
-              </w:rPr>
-              <w:t xml:space="preserve">Tipos de apoyo, sujetos de apoyo y tipos de proyecto; requisitos generales de viabilidad técnica, financiera, administrativa y legal (criterios Factibilidad y Costo-efectividad); requisitos específicos a–h (área de influencia, objeto, apartado técnico y financiero con costo-beneficio, plan de trabajo y cronograma, prioridades y contingencias, informes y soporte documental), que forman los requisitos 3, 4 y 6; y el Comité de Evaluación y Seguimiento.</w:t>
+              <w:t xml:space="preserve">Art. 3</w:t>
+            </w:r>
+          </w:p>
+        </w:tc>
+        <w:tc>
+          <w:tcPr>
+            <w:tcW w:type="dxa" w:w="3560"/>
+            <w:tcBorders>
+              <w:top w:val="single" w:color="BFBFBF" w:sz="4"/>
+              <w:left w:val="single" w:color="BFBFBF" w:sz="4"/>
+              <w:bottom w:val="single" w:color="BFBFBF" w:sz="4"/>
+              <w:right w:val="single" w:color="BFBFBF" w:sz="4"/>
+            </w:tcBorders>
+            <w:tcMar>
+              <w:top w:type="dxa" w:w="60"/>
+              <w:left w:type="dxa" w:w="90"/>
+              <w:bottom w:type="dxa" w:w="60"/>
+              <w:right w:type="dxa" w:w="90"/>
+            </w:tcMar>
+          </w:tcPr>
+          <w:p>
+            <w:r>
+              <w:rPr>
+                <w:rFonts w:ascii="Arial" w:cs="Arial" w:eastAsia="Arial" w:hAnsi="Arial"/>
+                <w:sz w:val="17"/>
+                <w:szCs w:val="17"/>
+              </w:rPr>
+              <w:t xml:space="preserve">Objeto del Fondo, con especial atención a poblaciones y territorios vulnerables</w:t>
+            </w:r>
+          </w:p>
+        </w:tc>
+        <w:tc>
+          <w:tcPr>
+            <w:tcW w:type="dxa" w:w="3900"/>
+            <w:tcBorders>
+              <w:top w:val="single" w:color="BFBFBF" w:sz="4"/>
+              <w:left w:val="single" w:color="BFBFBF" w:sz="4"/>
+              <w:bottom w:val="single" w:color="BFBFBF" w:sz="4"/>
+              <w:right w:val="single" w:color="BFBFBF" w:sz="4"/>
+            </w:tcBorders>
+            <w:tcMar>
+              <w:top w:type="dxa" w:w="60"/>
+              <w:left w:type="dxa" w:w="90"/>
+              <w:bottom w:type="dxa" w:w="60"/>
+              <w:right w:type="dxa" w:w="90"/>
+            </w:tcMar>
+          </w:tcPr>
+          <w:p>
+            <w:r>
+              <w:rPr>
+                <w:rFonts w:ascii="Arial" w:cs="Arial" w:eastAsia="Arial" w:hAnsi="Arial"/>
+                <w:sz w:val="17"/>
+                <w:szCs w:val="17"/>
+              </w:rPr>
+              <w:t xml:space="preserve">Criterios Impacto y Atención a población vulnerable (peso doble)</w:t>
             </w:r>
           </w:p>
         </w:tc>
@@ -10575,7 +10647,7 @@
         </w:trPr>
         <w:tc>
           <w:tcPr>
-            <w:tcW w:type="dxa" w:w="3200"/>
+            <w:tcW w:type="dxa" w:w="1900"/>
             <w:tcBorders>
               <w:top w:val="single" w:color="BFBFBF" w:sz="4"/>
               <w:left w:val="single" w:color="BFBFBF" w:sz="4"/>
@@ -10599,13 +10671,13 @@
                 <w:sz w:val="17"/>
                 <w:szCs w:val="17"/>
               </w:rPr>
-              <w:t xml:space="preserve">Decreto del Fondo (versión 1)</w:t>
-            </w:r>
-          </w:p>
-        </w:tc>
-        <w:tc>
-          <w:tcPr>
-            <w:tcW w:type="dxa" w:w="6160"/>
+              <w:t xml:space="preserve">Art. 4</w:t>
+            </w:r>
+          </w:p>
+        </w:tc>
+        <w:tc>
+          <w:tcPr>
+            <w:tcW w:type="dxa" w:w="3560"/>
             <w:tcBorders>
               <w:top w:val="single" w:color="BFBFBF" w:sz="4"/>
               <w:left w:val="single" w:color="BFBFBF" w:sz="4"/>
@@ -10627,7 +10699,35 @@
                 <w:sz w:val="17"/>
                 <w:szCs w:val="17"/>
               </w:rPr>
-              <w:t xml:space="preserve">Los 16 temas (art. 4); la prioridad a poblaciones y territorios vulnerables (art. 3); la evaluación técnica, financiera y ambiental (art. 14); los informes trimestrales y la publicación de resultados (arts. 16 y 17).</w:t>
+              <w:t xml:space="preserve">Los 16 fines del Fondo; criterios de priorización, elegibilidad e impacto</w:t>
+            </w:r>
+          </w:p>
+        </w:tc>
+        <w:tc>
+          <w:tcPr>
+            <w:tcW w:type="dxa" w:w="3900"/>
+            <w:tcBorders>
+              <w:top w:val="single" w:color="BFBFBF" w:sz="4"/>
+              <w:left w:val="single" w:color="BFBFBF" w:sz="4"/>
+              <w:bottom w:val="single" w:color="BFBFBF" w:sz="4"/>
+              <w:right w:val="single" w:color="BFBFBF" w:sz="4"/>
+            </w:tcBorders>
+            <w:shd w:fill="F7F9FA" w:color="auto" w:val="clear"/>
+            <w:tcMar>
+              <w:top w:type="dxa" w:w="60"/>
+              <w:left w:type="dxa" w:w="90"/>
+              <w:bottom w:type="dxa" w:w="60"/>
+              <w:right w:type="dxa" w:w="90"/>
+            </w:tcMar>
+          </w:tcPr>
+          <w:p>
+            <w:r>
+              <w:rPr>
+                <w:rFonts w:ascii="Arial" w:cs="Arial" w:eastAsia="Arial" w:hAnsi="Arial"/>
+                <w:sz w:val="17"/>
+                <w:szCs w:val="17"/>
+              </w:rPr>
+              <w:t xml:space="preserve">Temas (Anexo A), requisito 1 y la guía completa</w:t>
             </w:r>
           </w:p>
         </w:tc>
@@ -10638,7 +10738,7 @@
         </w:trPr>
         <w:tc>
           <w:tcPr>
-            <w:tcW w:type="dxa" w:w="3200"/>
+            <w:tcW w:type="dxa" w:w="1900"/>
             <w:tcBorders>
               <w:top w:val="single" w:color="BFBFBF" w:sz="4"/>
               <w:left w:val="single" w:color="BFBFBF" w:sz="4"/>
@@ -10662,34 +10762,61 @@
                 <w:sz w:val="17"/>
                 <w:szCs w:val="17"/>
               </w:rPr>
-              <w:t xml:space="preserve">Proceso de evaluación de proyectos SbN (abril de 2026)</w:t>
-            </w:r>
-          </w:p>
-        </w:tc>
-        <w:tc>
-          <w:tcPr>
-            <w:tcW w:type="dxa" w:w="6160"/>
-            <w:tcBorders>
-              <w:top w:val="single" w:color="BFBFBF" w:sz="4"/>
-              <w:left w:val="single" w:color="BFBFBF" w:sz="4"/>
-              <w:bottom w:val="single" w:color="BFBFBF" w:sz="4"/>
-              <w:right w:val="single" w:color="BFBFBF" w:sz="4"/>
-            </w:tcBorders>
-            <w:tcMar>
-              <w:top w:type="dxa" w:w="60"/>
-              <w:left w:type="dxa" w:w="90"/>
-              <w:bottom w:type="dxa" w:w="60"/>
-              <w:right w:type="dxa" w:w="90"/>
-            </w:tcMar>
-          </w:tcPr>
-          <w:p>
-            <w:r>
-              <w:rPr>
-                <w:rFonts w:ascii="Arial" w:cs="Arial" w:eastAsia="Arial" w:hAnsi="Arial"/>
-                <w:sz w:val="17"/>
-                <w:szCs w:val="17"/>
-              </w:rPr>
-              <w:t xml:space="preserve">Beneficio ambiental y social como requisito; madurez del proyecto; barreras de implementación; conflicto de interés; decisión final del Comité.</w:t>
+              <w:t xml:space="preserve">Art. 5</w:t>
+            </w:r>
+          </w:p>
+        </w:tc>
+        <w:tc>
+          <w:tcPr>
+            <w:tcW w:type="dxa" w:w="3560"/>
+            <w:tcBorders>
+              <w:top w:val="single" w:color="BFBFBF" w:sz="4"/>
+              <w:left w:val="single" w:color="BFBFBF" w:sz="4"/>
+              <w:bottom w:val="single" w:color="BFBFBF" w:sz="4"/>
+              <w:right w:val="single" w:color="BFBFBF" w:sz="4"/>
+            </w:tcBorders>
+            <w:tcMar>
+              <w:top w:type="dxa" w:w="60"/>
+              <w:left w:type="dxa" w:w="90"/>
+              <w:bottom w:type="dxa" w:w="60"/>
+              <w:right w:type="dxa" w:w="90"/>
+            </w:tcMar>
+          </w:tcPr>
+          <w:p>
+            <w:r>
+              <w:rPr>
+                <w:rFonts w:ascii="Arial" w:cs="Arial" w:eastAsia="Arial" w:hAnsi="Arial"/>
+                <w:sz w:val="17"/>
+                <w:szCs w:val="17"/>
+              </w:rPr>
+              <w:t xml:space="preserve">Recursos de distintas fuentes, con trazabilidad por origen</w:t>
+            </w:r>
+          </w:p>
+        </w:tc>
+        <w:tc>
+          <w:tcPr>
+            <w:tcW w:type="dxa" w:w="3900"/>
+            <w:tcBorders>
+              <w:top w:val="single" w:color="BFBFBF" w:sz="4"/>
+              <w:left w:val="single" w:color="BFBFBF" w:sz="4"/>
+              <w:bottom w:val="single" w:color="BFBFBF" w:sz="4"/>
+              <w:right w:val="single" w:color="BFBFBF" w:sz="4"/>
+            </w:tcBorders>
+            <w:tcMar>
+              <w:top w:type="dxa" w:w="60"/>
+              <w:left w:type="dxa" w:w="90"/>
+              <w:bottom w:type="dxa" w:w="60"/>
+              <w:right w:type="dxa" w:w="90"/>
+            </w:tcMar>
+          </w:tcPr>
+          <w:p>
+            <w:r>
+              <w:rPr>
+                <w:rFonts w:ascii="Arial" w:cs="Arial" w:eastAsia="Arial" w:hAnsi="Arial"/>
+                <w:sz w:val="17"/>
+                <w:szCs w:val="17"/>
+              </w:rPr>
+              <w:t xml:space="preserve">Requisito 6 (sin doble apoyo) y criterio Sostenibilidad</w:t>
             </w:r>
           </w:p>
         </w:tc>
@@ -10700,7 +10827,7 @@
         </w:trPr>
         <w:tc>
           <w:tcPr>
-            <w:tcW w:type="dxa" w:w="3200"/>
+            <w:tcW w:type="dxa" w:w="1900"/>
             <w:tcBorders>
               <w:top w:val="single" w:color="BFBFBF" w:sz="4"/>
               <w:left w:val="single" w:color="BFBFBF" w:sz="4"/>
@@ -10724,13 +10851,13 @@
                 <w:sz w:val="17"/>
                 <w:szCs w:val="17"/>
               </w:rPr>
-              <w:t xml:space="preserve">Criterios de elegibilidad de proyectos (apoyos no financieros)</w:t>
-            </w:r>
-          </w:p>
-        </w:tc>
-        <w:tc>
-          <w:tcPr>
-            <w:tcW w:type="dxa" w:w="6160"/>
+              <w:t xml:space="preserve">Arts. 6, 7, 9 y 13</w:t>
+            </w:r>
+          </w:p>
+        </w:tc>
+        <w:tc>
+          <w:tcPr>
+            <w:tcW w:type="dxa" w:w="3560"/>
             <w:tcBorders>
               <w:top w:val="single" w:color="BFBFBF" w:sz="4"/>
               <w:left w:val="single" w:color="BFBFBF" w:sz="4"/>
@@ -10752,7 +10879,35 @@
                 <w:sz w:val="17"/>
                 <w:szCs w:val="17"/>
               </w:rPr>
-              <w:t xml:space="preserve">Base de las opciones de fortalecimiento: asesoría, asistencia técnica, estudios y vinculación.</w:t>
+              <w:t xml:space="preserve">Comité Técnico: integración, facultades y sesiones</w:t>
+            </w:r>
+          </w:p>
+        </w:tc>
+        <w:tc>
+          <w:tcPr>
+            <w:tcW w:type="dxa" w:w="3900"/>
+            <w:tcBorders>
+              <w:top w:val="single" w:color="BFBFBF" w:sz="4"/>
+              <w:left w:val="single" w:color="BFBFBF" w:sz="4"/>
+              <w:bottom w:val="single" w:color="BFBFBF" w:sz="4"/>
+              <w:right w:val="single" w:color="BFBFBF" w:sz="4"/>
+            </w:tcBorders>
+            <w:shd w:fill="F7F9FA" w:color="auto" w:val="clear"/>
+            <w:tcMar>
+              <w:top w:type="dxa" w:w="60"/>
+              <w:left w:type="dxa" w:w="90"/>
+              <w:bottom w:type="dxa" w:w="60"/>
+              <w:right w:type="dxa" w:w="90"/>
+            </w:tcMar>
+          </w:tcPr>
+          <w:p>
+            <w:r>
+              <w:rPr>
+                <w:rFonts w:ascii="Arial" w:cs="Arial" w:eastAsia="Arial" w:hAnsi="Arial"/>
+                <w:sz w:val="17"/>
+                <w:szCs w:val="17"/>
+              </w:rPr>
+              <w:t xml:space="preserve">Aprobación de convocatoria, decisión y fortalecimiento (Paso 3)</w:t>
             </w:r>
           </w:p>
         </w:tc>
@@ -10763,7 +10918,7 @@
         </w:trPr>
         <w:tc>
           <w:tcPr>
-            <w:tcW w:type="dxa" w:w="3200"/>
+            <w:tcW w:type="dxa" w:w="1900"/>
             <w:tcBorders>
               <w:top w:val="single" w:color="BFBFBF" w:sz="4"/>
               <w:left w:val="single" w:color="BFBFBF" w:sz="4"/>
@@ -10787,34 +10942,512 @@
                 <w:sz w:val="17"/>
                 <w:szCs w:val="17"/>
               </w:rPr>
-              <w:t xml:space="preserve">Sistema de Priorización de SbN (Forest Trends, 2026)</w:t>
-            </w:r>
-          </w:p>
-        </w:tc>
-        <w:tc>
-          <w:tcPr>
-            <w:tcW w:type="dxa" w:w="6160"/>
-            <w:tcBorders>
-              <w:top w:val="single" w:color="BFBFBF" w:sz="4"/>
-              <w:left w:val="single" w:color="BFBFBF" w:sz="4"/>
-              <w:bottom w:val="single" w:color="BFBFBF" w:sz="4"/>
-              <w:right w:val="single" w:color="BFBFBF" w:sz="4"/>
-            </w:tcBorders>
-            <w:tcMar>
-              <w:top w:type="dxa" w:w="60"/>
-              <w:left w:type="dxa" w:w="90"/>
-              <w:bottom w:type="dxa" w:w="60"/>
-              <w:right w:type="dxa" w:w="90"/>
-            </w:tcMar>
-          </w:tcPr>
-          <w:p>
-            <w:r>
-              <w:rPr>
-                <w:rFonts w:ascii="Arial" w:cs="Arial" w:eastAsia="Arial" w:hAnsi="Arial"/>
-                <w:sz w:val="17"/>
-                <w:szCs w:val="17"/>
-              </w:rPr>
-              <w:t xml:space="preserve">Separar requisitos (Sí/No) de criterios calificados de 1 a 3 con descripción de cada nivel; categorías de prioridad; calibración de evaluadores. Es la referencia técnica para la ficha de agua y soluciones basadas en la naturaleza.</w:t>
+              <w:t xml:space="preserve">Art. 8</w:t>
+            </w:r>
+          </w:p>
+        </w:tc>
+        <w:tc>
+          <w:tcPr>
+            <w:tcW w:type="dxa" w:w="3560"/>
+            <w:tcBorders>
+              <w:top w:val="single" w:color="BFBFBF" w:sz="4"/>
+              <w:left w:val="single" w:color="BFBFBF" w:sz="4"/>
+              <w:bottom w:val="single" w:color="BFBFBF" w:sz="4"/>
+              <w:right w:val="single" w:color="BFBFBF" w:sz="4"/>
+            </w:tcBorders>
+            <w:tcMar>
+              <w:top w:type="dxa" w:w="60"/>
+              <w:left w:type="dxa" w:w="90"/>
+              <w:bottom w:type="dxa" w:w="60"/>
+              <w:right w:type="dxa" w:w="90"/>
+            </w:tcMar>
+          </w:tcPr>
+          <w:p>
+            <w:r>
+              <w:rPr>
+                <w:rFonts w:ascii="Arial" w:cs="Arial" w:eastAsia="Arial" w:hAnsi="Arial"/>
+                <w:sz w:val="17"/>
+                <w:szCs w:val="17"/>
+              </w:rPr>
+              <w:t xml:space="preserve">Participación pública e inclusión (Acuerdo de Escazú)</w:t>
+            </w:r>
+          </w:p>
+        </w:tc>
+        <w:tc>
+          <w:tcPr>
+            <w:tcW w:type="dxa" w:w="3900"/>
+            <w:tcBorders>
+              <w:top w:val="single" w:color="BFBFBF" w:sz="4"/>
+              <w:left w:val="single" w:color="BFBFBF" w:sz="4"/>
+              <w:bottom w:val="single" w:color="BFBFBF" w:sz="4"/>
+              <w:right w:val="single" w:color="BFBFBF" w:sz="4"/>
+            </w:tcBorders>
+            <w:tcMar>
+              <w:top w:type="dxa" w:w="60"/>
+              <w:left w:type="dxa" w:w="90"/>
+              <w:bottom w:type="dxa" w:w="60"/>
+              <w:right w:type="dxa" w:w="90"/>
+            </w:tcMar>
+          </w:tcPr>
+          <w:p>
+            <w:r>
+              <w:rPr>
+                <w:rFonts w:ascii="Arial" w:cs="Arial" w:eastAsia="Arial" w:hAnsi="Arial"/>
+                <w:sz w:val="17"/>
+                <w:szCs w:val="17"/>
+              </w:rPr>
+              <w:t xml:space="preserve">Criterio Participación e inclusión</w:t>
+            </w:r>
+          </w:p>
+        </w:tc>
+      </w:tr>
+      <w:tr>
+        <w:trPr>
+          <w:cantSplit/>
+        </w:trPr>
+        <w:tc>
+          <w:tcPr>
+            <w:tcW w:type="dxa" w:w="1900"/>
+            <w:tcBorders>
+              <w:top w:val="single" w:color="BFBFBF" w:sz="4"/>
+              <w:left w:val="single" w:color="BFBFBF" w:sz="4"/>
+              <w:bottom w:val="single" w:color="BFBFBF" w:sz="4"/>
+              <w:right w:val="single" w:color="BFBFBF" w:sz="4"/>
+            </w:tcBorders>
+            <w:shd w:fill="EAF1F4" w:color="auto" w:val="clear"/>
+            <w:tcMar>
+              <w:top w:type="dxa" w:w="60"/>
+              <w:left w:type="dxa" w:w="90"/>
+              <w:bottom w:type="dxa" w:w="60"/>
+              <w:right w:type="dxa" w:w="90"/>
+            </w:tcMar>
+          </w:tcPr>
+          <w:p>
+            <w:r>
+              <w:rPr>
+                <w:rFonts w:ascii="Arial" w:cs="Arial" w:eastAsia="Arial" w:hAnsi="Arial"/>
+                <w:b/>
+                <w:bCs/>
+                <w:sz w:val="17"/>
+                <w:szCs w:val="17"/>
+              </w:rPr>
+              <w:t xml:space="preserve">Arts. 9, fr. XI, y 14</w:t>
+            </w:r>
+          </w:p>
+        </w:tc>
+        <w:tc>
+          <w:tcPr>
+            <w:tcW w:type="dxa" w:w="3560"/>
+            <w:tcBorders>
+              <w:top w:val="single" w:color="BFBFBF" w:sz="4"/>
+              <w:left w:val="single" w:color="BFBFBF" w:sz="4"/>
+              <w:bottom w:val="single" w:color="BFBFBF" w:sz="4"/>
+              <w:right w:val="single" w:color="BFBFBF" w:sz="4"/>
+            </w:tcBorders>
+            <w:shd w:fill="F7F9FA" w:color="auto" w:val="clear"/>
+            <w:tcMar>
+              <w:top w:type="dxa" w:w="60"/>
+              <w:left w:type="dxa" w:w="90"/>
+              <w:bottom w:type="dxa" w:w="60"/>
+              <w:right w:type="dxa" w:w="90"/>
+            </w:tcMar>
+          </w:tcPr>
+          <w:p>
+            <w:r>
+              <w:rPr>
+                <w:rFonts w:ascii="Arial" w:cs="Arial" w:eastAsia="Arial" w:hAnsi="Arial"/>
+                <w:sz w:val="17"/>
+                <w:szCs w:val="17"/>
+              </w:rPr>
+              <w:t xml:space="preserve">Subcomités técnicos especializados; evaluación técnica, financiera y de viabilidad ambiental</w:t>
+            </w:r>
+          </w:p>
+        </w:tc>
+        <w:tc>
+          <w:tcPr>
+            <w:tcW w:type="dxa" w:w="3900"/>
+            <w:tcBorders>
+              <w:top w:val="single" w:color="BFBFBF" w:sz="4"/>
+              <w:left w:val="single" w:color="BFBFBF" w:sz="4"/>
+              <w:bottom w:val="single" w:color="BFBFBF" w:sz="4"/>
+              <w:right w:val="single" w:color="BFBFBF" w:sz="4"/>
+            </w:tcBorders>
+            <w:shd w:fill="F7F9FA" w:color="auto" w:val="clear"/>
+            <w:tcMar>
+              <w:top w:type="dxa" w:w="60"/>
+              <w:left w:type="dxa" w:w="90"/>
+              <w:bottom w:type="dxa" w:w="60"/>
+              <w:right w:type="dxa" w:w="90"/>
+            </w:tcMar>
+          </w:tcPr>
+          <w:p>
+            <w:r>
+              <w:rPr>
+                <w:rFonts w:ascii="Arial" w:cs="Arial" w:eastAsia="Arial" w:hAnsi="Arial"/>
+                <w:sz w:val="17"/>
+                <w:szCs w:val="17"/>
+              </w:rPr>
+              <w:t xml:space="preserve">Subcomité Técnico Especializado; Paso 2; requisito 5</w:t>
+            </w:r>
+          </w:p>
+        </w:tc>
+      </w:tr>
+      <w:tr>
+        <w:trPr>
+          <w:cantSplit/>
+        </w:trPr>
+        <w:tc>
+          <w:tcPr>
+            <w:tcW w:type="dxa" w:w="1900"/>
+            <w:tcBorders>
+              <w:top w:val="single" w:color="BFBFBF" w:sz="4"/>
+              <w:left w:val="single" w:color="BFBFBF" w:sz="4"/>
+              <w:bottom w:val="single" w:color="BFBFBF" w:sz="4"/>
+              <w:right w:val="single" w:color="BFBFBF" w:sz="4"/>
+            </w:tcBorders>
+            <w:shd w:fill="EAF1F4" w:color="auto" w:val="clear"/>
+            <w:tcMar>
+              <w:top w:type="dxa" w:w="60"/>
+              <w:left w:type="dxa" w:w="90"/>
+              <w:bottom w:type="dxa" w:w="60"/>
+              <w:right w:type="dxa" w:w="90"/>
+            </w:tcMar>
+          </w:tcPr>
+          <w:p>
+            <w:r>
+              <w:rPr>
+                <w:rFonts w:ascii="Arial" w:cs="Arial" w:eastAsia="Arial" w:hAnsi="Arial"/>
+                <w:b/>
+                <w:bCs/>
+                <w:sz w:val="17"/>
+                <w:szCs w:val="17"/>
+              </w:rPr>
+              <w:t xml:space="preserve">Arts. 7 y 12</w:t>
+            </w:r>
+          </w:p>
+        </w:tc>
+        <w:tc>
+          <w:tcPr>
+            <w:tcW w:type="dxa" w:w="3560"/>
+            <w:tcBorders>
+              <w:top w:val="single" w:color="BFBFBF" w:sz="4"/>
+              <w:left w:val="single" w:color="BFBFBF" w:sz="4"/>
+              <w:bottom w:val="single" w:color="BFBFBF" w:sz="4"/>
+              <w:right w:val="single" w:color="BFBFBF" w:sz="4"/>
+            </w:tcBorders>
+            <w:tcMar>
+              <w:top w:type="dxa" w:w="60"/>
+              <w:left w:type="dxa" w:w="90"/>
+              <w:bottom w:type="dxa" w:w="60"/>
+              <w:right w:type="dxa" w:w="90"/>
+            </w:tcMar>
+          </w:tcPr>
+          <w:p>
+            <w:r>
+              <w:rPr>
+                <w:rFonts w:ascii="Arial" w:cs="Arial" w:eastAsia="Arial" w:hAnsi="Arial"/>
+                <w:sz w:val="17"/>
+                <w:szCs w:val="17"/>
+              </w:rPr>
+              <w:t xml:space="preserve">Secretaría Técnica: expedientes, supervisión técnica y financiera</w:t>
+            </w:r>
+          </w:p>
+        </w:tc>
+        <w:tc>
+          <w:tcPr>
+            <w:tcW w:type="dxa" w:w="3900"/>
+            <w:tcBorders>
+              <w:top w:val="single" w:color="BFBFBF" w:sz="4"/>
+              <w:left w:val="single" w:color="BFBFBF" w:sz="4"/>
+              <w:bottom w:val="single" w:color="BFBFBF" w:sz="4"/>
+              <w:right w:val="single" w:color="BFBFBF" w:sz="4"/>
+            </w:tcBorders>
+            <w:tcMar>
+              <w:top w:type="dxa" w:w="60"/>
+              <w:left w:type="dxa" w:w="90"/>
+              <w:bottom w:type="dxa" w:w="60"/>
+              <w:right w:type="dxa" w:w="90"/>
+            </w:tcMar>
+          </w:tcPr>
+          <w:p>
+            <w:r>
+              <w:rPr>
+                <w:rFonts w:ascii="Arial" w:cs="Arial" w:eastAsia="Arial" w:hAnsi="Arial"/>
+                <w:sz w:val="17"/>
+                <w:szCs w:val="17"/>
+              </w:rPr>
+              <w:t xml:space="preserve">Paso 1, integración de expedientes y seguimiento</w:t>
+            </w:r>
+          </w:p>
+        </w:tc>
+      </w:tr>
+      <w:tr>
+        <w:trPr>
+          <w:cantSplit/>
+        </w:trPr>
+        <w:tc>
+          <w:tcPr>
+            <w:tcW w:type="dxa" w:w="1900"/>
+            <w:tcBorders>
+              <w:top w:val="single" w:color="BFBFBF" w:sz="4"/>
+              <w:left w:val="single" w:color="BFBFBF" w:sz="4"/>
+              <w:bottom w:val="single" w:color="BFBFBF" w:sz="4"/>
+              <w:right w:val="single" w:color="BFBFBF" w:sz="4"/>
+            </w:tcBorders>
+            <w:shd w:fill="EAF1F4" w:color="auto" w:val="clear"/>
+            <w:tcMar>
+              <w:top w:type="dxa" w:w="60"/>
+              <w:left w:type="dxa" w:w="90"/>
+              <w:bottom w:type="dxa" w:w="60"/>
+              <w:right w:type="dxa" w:w="90"/>
+            </w:tcMar>
+          </w:tcPr>
+          <w:p>
+            <w:r>
+              <w:rPr>
+                <w:rFonts w:ascii="Arial" w:cs="Arial" w:eastAsia="Arial" w:hAnsi="Arial"/>
+                <w:b/>
+                <w:bCs/>
+                <w:sz w:val="17"/>
+                <w:szCs w:val="17"/>
+              </w:rPr>
+              <w:t xml:space="preserve">Art. 11, fr. III</w:t>
+            </w:r>
+          </w:p>
+        </w:tc>
+        <w:tc>
+          <w:tcPr>
+            <w:tcW w:type="dxa" w:w="3560"/>
+            <w:tcBorders>
+              <w:top w:val="single" w:color="BFBFBF" w:sz="4"/>
+              <w:left w:val="single" w:color="BFBFBF" w:sz="4"/>
+              <w:bottom w:val="single" w:color="BFBFBF" w:sz="4"/>
+              <w:right w:val="single" w:color="BFBFBF" w:sz="4"/>
+            </w:tcBorders>
+            <w:shd w:fill="F7F9FA" w:color="auto" w:val="clear"/>
+            <w:tcMar>
+              <w:top w:type="dxa" w:w="60"/>
+              <w:left w:type="dxa" w:w="90"/>
+              <w:bottom w:type="dxa" w:w="60"/>
+              <w:right w:type="dxa" w:w="90"/>
+            </w:tcMar>
+          </w:tcPr>
+          <w:p>
+            <w:r>
+              <w:rPr>
+                <w:rFonts w:ascii="Arial" w:cs="Arial" w:eastAsia="Arial" w:hAnsi="Arial"/>
+                <w:sz w:val="17"/>
+                <w:szCs w:val="17"/>
+              </w:rPr>
+              <w:t xml:space="preserve">Instrucciones de pago a la fiduciaria</w:t>
+            </w:r>
+          </w:p>
+        </w:tc>
+        <w:tc>
+          <w:tcPr>
+            <w:tcW w:type="dxa" w:w="3900"/>
+            <w:tcBorders>
+              <w:top w:val="single" w:color="BFBFBF" w:sz="4"/>
+              <w:left w:val="single" w:color="BFBFBF" w:sz="4"/>
+              <w:bottom w:val="single" w:color="BFBFBF" w:sz="4"/>
+              <w:right w:val="single" w:color="BFBFBF" w:sz="4"/>
+            </w:tcBorders>
+            <w:shd w:fill="F7F9FA" w:color="auto" w:val="clear"/>
+            <w:tcMar>
+              <w:top w:type="dxa" w:w="60"/>
+              <w:left w:type="dxa" w:w="90"/>
+              <w:bottom w:type="dxa" w:w="60"/>
+              <w:right w:type="dxa" w:w="90"/>
+            </w:tcMar>
+          </w:tcPr>
+          <w:p>
+            <w:r>
+              <w:rPr>
+                <w:rFonts w:ascii="Arial" w:cs="Arial" w:eastAsia="Arial" w:hAnsi="Arial"/>
+                <w:sz w:val="17"/>
+                <w:szCs w:val="17"/>
+              </w:rPr>
+              <w:t xml:space="preserve">Convenio y pago (Paso 3)</w:t>
+            </w:r>
+          </w:p>
+        </w:tc>
+      </w:tr>
+      <w:tr>
+        <w:trPr>
+          <w:cantSplit/>
+        </w:trPr>
+        <w:tc>
+          <w:tcPr>
+            <w:tcW w:type="dxa" w:w="1900"/>
+            <w:tcBorders>
+              <w:top w:val="single" w:color="BFBFBF" w:sz="4"/>
+              <w:left w:val="single" w:color="BFBFBF" w:sz="4"/>
+              <w:bottom w:val="single" w:color="BFBFBF" w:sz="4"/>
+              <w:right w:val="single" w:color="BFBFBF" w:sz="4"/>
+            </w:tcBorders>
+            <w:shd w:fill="EAF1F4" w:color="auto" w:val="clear"/>
+            <w:tcMar>
+              <w:top w:type="dxa" w:w="60"/>
+              <w:left w:type="dxa" w:w="90"/>
+              <w:bottom w:type="dxa" w:w="60"/>
+              <w:right w:type="dxa" w:w="90"/>
+            </w:tcMar>
+          </w:tcPr>
+          <w:p>
+            <w:r>
+              <w:rPr>
+                <w:rFonts w:ascii="Arial" w:cs="Arial" w:eastAsia="Arial" w:hAnsi="Arial"/>
+                <w:b/>
+                <w:bCs/>
+                <w:sz w:val="17"/>
+                <w:szCs w:val="17"/>
+              </w:rPr>
+              <w:t xml:space="preserve">Arts. 16 y 17</w:t>
+            </w:r>
+          </w:p>
+        </w:tc>
+        <w:tc>
+          <w:tcPr>
+            <w:tcW w:type="dxa" w:w="3560"/>
+            <w:tcBorders>
+              <w:top w:val="single" w:color="BFBFBF" w:sz="4"/>
+              <w:left w:val="single" w:color="BFBFBF" w:sz="4"/>
+              <w:bottom w:val="single" w:color="BFBFBF" w:sz="4"/>
+              <w:right w:val="single" w:color="BFBFBF" w:sz="4"/>
+            </w:tcBorders>
+            <w:tcMar>
+              <w:top w:type="dxa" w:w="60"/>
+              <w:left w:type="dxa" w:w="90"/>
+              <w:bottom w:type="dxa" w:w="60"/>
+              <w:right w:type="dxa" w:w="90"/>
+            </w:tcMar>
+          </w:tcPr>
+          <w:p>
+            <w:r>
+              <w:rPr>
+                <w:rFonts w:ascii="Arial" w:cs="Arial" w:eastAsia="Arial" w:hAnsi="Arial"/>
+                <w:sz w:val="17"/>
+                <w:szCs w:val="17"/>
+              </w:rPr>
+              <w:t xml:space="preserve">Reportes trimestrales y máxima publicidad</w:t>
+            </w:r>
+          </w:p>
+        </w:tc>
+        <w:tc>
+          <w:tcPr>
+            <w:tcW w:type="dxa" w:w="3900"/>
+            <w:tcBorders>
+              <w:top w:val="single" w:color="BFBFBF" w:sz="4"/>
+              <w:left w:val="single" w:color="BFBFBF" w:sz="4"/>
+              <w:bottom w:val="single" w:color="BFBFBF" w:sz="4"/>
+              <w:right w:val="single" w:color="BFBFBF" w:sz="4"/>
+            </w:tcBorders>
+            <w:tcMar>
+              <w:top w:type="dxa" w:w="60"/>
+              <w:left w:type="dxa" w:w="90"/>
+              <w:bottom w:type="dxa" w:w="60"/>
+              <w:right w:type="dxa" w:w="90"/>
+            </w:tcMar>
+          </w:tcPr>
+          <w:p>
+            <w:r>
+              <w:rPr>
+                <w:rFonts w:ascii="Arial" w:cs="Arial" w:eastAsia="Arial" w:hAnsi="Arial"/>
+                <w:sz w:val="17"/>
+                <w:szCs w:val="17"/>
+              </w:rPr>
+              <w:t xml:space="preserve">Requisito 6 (informes) y publicación de resultados</w:t>
+            </w:r>
+          </w:p>
+        </w:tc>
+      </w:tr>
+      <w:tr>
+        <w:trPr>
+          <w:cantSplit/>
+        </w:trPr>
+        <w:tc>
+          <w:tcPr>
+            <w:tcW w:type="dxa" w:w="1900"/>
+            <w:tcBorders>
+              <w:top w:val="single" w:color="BFBFBF" w:sz="4"/>
+              <w:left w:val="single" w:color="BFBFBF" w:sz="4"/>
+              <w:bottom w:val="single" w:color="BFBFBF" w:sz="4"/>
+              <w:right w:val="single" w:color="BFBFBF" w:sz="4"/>
+            </w:tcBorders>
+            <w:shd w:fill="EAF1F4" w:color="auto" w:val="clear"/>
+            <w:tcMar>
+              <w:top w:type="dxa" w:w="60"/>
+              <w:left w:type="dxa" w:w="90"/>
+              <w:bottom w:type="dxa" w:w="60"/>
+              <w:right w:type="dxa" w:w="90"/>
+            </w:tcMar>
+          </w:tcPr>
+          <w:p>
+            <w:r>
+              <w:rPr>
+                <w:rFonts w:ascii="Arial" w:cs="Arial" w:eastAsia="Arial" w:hAnsi="Arial"/>
+                <w:b/>
+                <w:bCs/>
+                <w:sz w:val="17"/>
+                <w:szCs w:val="17"/>
+              </w:rPr>
+              <w:t xml:space="preserve">Considerandos</w:t>
+            </w:r>
+          </w:p>
+        </w:tc>
+        <w:tc>
+          <w:tcPr>
+            <w:tcW w:type="dxa" w:w="3560"/>
+            <w:tcBorders>
+              <w:top w:val="single" w:color="BFBFBF" w:sz="4"/>
+              <w:left w:val="single" w:color="BFBFBF" w:sz="4"/>
+              <w:bottom w:val="single" w:color="BFBFBF" w:sz="4"/>
+              <w:right w:val="single" w:color="BFBFBF" w:sz="4"/>
+            </w:tcBorders>
+            <w:shd w:fill="F7F9FA" w:color="auto" w:val="clear"/>
+            <w:tcMar>
+              <w:top w:type="dxa" w:w="60"/>
+              <w:left w:type="dxa" w:w="90"/>
+              <w:bottom w:type="dxa" w:w="60"/>
+              <w:right w:type="dxa" w:w="90"/>
+            </w:tcMar>
+          </w:tcPr>
+          <w:p>
+            <w:r>
+              <w:rPr>
+                <w:rFonts w:ascii="Arial" w:cs="Arial" w:eastAsia="Arial" w:hAnsi="Arial"/>
+                <w:sz w:val="17"/>
+                <w:szCs w:val="17"/>
+              </w:rPr>
+              <w:t xml:space="preserve">Prioridad a pueblos indígenas, mujeres, niñas, niños y personas con discapacidad</w:t>
+            </w:r>
+          </w:p>
+        </w:tc>
+        <w:tc>
+          <w:tcPr>
+            <w:tcW w:type="dxa" w:w="3900"/>
+            <w:tcBorders>
+              <w:top w:val="single" w:color="BFBFBF" w:sz="4"/>
+              <w:left w:val="single" w:color="BFBFBF" w:sz="4"/>
+              <w:bottom w:val="single" w:color="BFBFBF" w:sz="4"/>
+              <w:right w:val="single" w:color="BFBFBF" w:sz="4"/>
+            </w:tcBorders>
+            <w:shd w:fill="F7F9FA" w:color="auto" w:val="clear"/>
+            <w:tcMar>
+              <w:top w:type="dxa" w:w="60"/>
+              <w:left w:type="dxa" w:w="90"/>
+              <w:bottom w:type="dxa" w:w="60"/>
+              <w:right w:type="dxa" w:w="90"/>
+            </w:tcMar>
+          </w:tcPr>
+          <w:p>
+            <w:r>
+              <w:rPr>
+                <w:rFonts w:ascii="Arial" w:cs="Arial" w:eastAsia="Arial" w:hAnsi="Arial"/>
+                <w:sz w:val="17"/>
+                <w:szCs w:val="17"/>
+              </w:rPr>
+              <w:t xml:space="preserve">Criterio Participación e inclusión</w:t>
             </w:r>
           </w:p>
         </w:tc>

</xml_diff>